<commit_message>
docs: complete thesis submission details
</commit_message>
<xml_diff>
--- a/tesis/entrega/plan-tesis-proyecto-final-integrador.docx
+++ b/tesis/entrega/plan-tesis-proyecto-final-integrador.docx
@@ -108,7 +108,7 @@
           <w:color w:val="000000"/>
           <w:sz w:val="22"/>
         </w:rPr>
-        <w:t>[Completar apellido y nombre]</w:t>
+        <w:t>Gaspar Dip</w:t>
       </w:r>
     </w:p>
     <w:p>
@@ -130,7 +130,7 @@
           <w:color w:val="000000"/>
           <w:sz w:val="22"/>
         </w:rPr>
-        <w:t>[Completar]</w:t>
+        <w:t>49012185</w:t>
       </w:r>
     </w:p>
     <w:p>
@@ -196,7 +196,7 @@
           <w:color w:val="000000"/>
           <w:sz w:val="22"/>
         </w:rPr>
-        <w:t>[Completar apellido y nombre]</w:t>
+        <w:t>Dr. Jorge Salvador Ierache</w:t>
       </w:r>
     </w:p>
     <w:p>
@@ -218,7 +218,7 @@
           <w:color w:val="000000"/>
           <w:sz w:val="22"/>
         </w:rPr>
-        <w:t>[Completar si corresponde]</w:t>
+        <w:t>No corresponde</w:t>
       </w:r>
     </w:p>
     <w:p>
@@ -240,7 +240,7 @@
           <w:color w:val="000000"/>
           <w:sz w:val="22"/>
         </w:rPr>
-        <w:t>[Completar]</w:t>
+        <w:t>21/05/2026</w:t>
       </w:r>
     </w:p>
     <w:p>
@@ -764,7 +764,7 @@
                 <w:color w:val="000000"/>
                 <w:sz w:val="16"/>
               </w:rPr>
-              <w:t>[Completar apellido y nombre]</w:t>
+              <w:t>Gaspar Dip</w:t>
             </w:r>
           </w:p>
         </w:tc>
@@ -786,7 +786,7 @@
                 <w:color w:val="000000"/>
                 <w:sz w:val="16"/>
               </w:rPr>
-              <w:t>[Completar]</w:t>
+              <w:t>49012185</w:t>
             </w:r>
           </w:p>
         </w:tc>
@@ -808,7 +808,7 @@
                 <w:color w:val="000000"/>
                 <w:sz w:val="16"/>
               </w:rPr>
-              <w:t>[Completar]</w:t>
+              <w:t>gaspar@fasteditor.com</w:t>
             </w:r>
           </w:p>
         </w:tc>
@@ -830,7 +830,7 @@
                 <w:color w:val="000000"/>
                 <w:sz w:val="16"/>
               </w:rPr>
-              <w:t>[Completar]</w:t>
+              <w:t>Ingeniería en Informática</w:t>
             </w:r>
           </w:p>
         </w:tc>
@@ -876,7 +876,7 @@
                 <w:color w:val="000000"/>
                 <w:sz w:val="16"/>
               </w:rPr>
-              <w:t>[Completar apellido y nombre]</w:t>
+              <w:t>Dr. Jorge Salvador Ierache</w:t>
             </w:r>
           </w:p>
         </w:tc>
@@ -920,7 +920,7 @@
                 <w:color w:val="000000"/>
                 <w:sz w:val="16"/>
               </w:rPr>
-              <w:t>[Completar]</w:t>
+              <w:t>jierache@fi.uba.ar</w:t>
             </w:r>
           </w:p>
         </w:tc>
@@ -942,7 +942,7 @@
                 <w:color w:val="000000"/>
                 <w:sz w:val="16"/>
               </w:rPr>
-              <w:t>[Completar institución/cargo]</w:t>
+              <w:t>Director de tesis</w:t>
             </w:r>
           </w:p>
         </w:tc>
@@ -988,7 +988,7 @@
                 <w:color w:val="000000"/>
                 <w:sz w:val="16"/>
               </w:rPr>
-              <w:t>[Completar apellido y nombre]</w:t>
+              <w:t>No corresponde</w:t>
             </w:r>
           </w:p>
         </w:tc>
@@ -1032,7 +1032,7 @@
                 <w:color w:val="000000"/>
                 <w:sz w:val="16"/>
               </w:rPr>
-              <w:t>[Completar]</w:t>
+              <w:t>No corresponde</w:t>
             </w:r>
           </w:p>
         </w:tc>
@@ -1054,7 +1054,7 @@
                 <w:color w:val="000000"/>
                 <w:sz w:val="16"/>
               </w:rPr>
-              <w:t>[Completar]</w:t>
+              <w:t>No corresponde</w:t>
             </w:r>
           </w:p>
         </w:tc>
@@ -1100,7 +1100,7 @@
                 <w:color w:val="000000"/>
                 <w:sz w:val="16"/>
               </w:rPr>
-              <w:t>[Completar apellido y nombre]</w:t>
+              <w:t>No corresponde</w:t>
             </w:r>
           </w:p>
         </w:tc>
@@ -1144,7 +1144,7 @@
                 <w:color w:val="000000"/>
                 <w:sz w:val="16"/>
               </w:rPr>
-              <w:t>[Completar]</w:t>
+              <w:t>No corresponde</w:t>
             </w:r>
           </w:p>
         </w:tc>
@@ -1166,7 +1166,7 @@
                 <w:color w:val="000000"/>
                 <w:sz w:val="16"/>
               </w:rPr>
-              <w:t>[Completar organización/cargo]</w:t>
+              <w:t>No corresponde</w:t>
             </w:r>
           </w:p>
         </w:tc>
@@ -1195,7 +1195,7 @@
           <w:color w:val="000000"/>
           <w:sz w:val="22"/>
         </w:rPr>
-        <w:t xml:space="preserve"> La tabla identifica al alumno, director, codirector y asesor profesional si correspondiera. Los datos personales y académicos se dejan como placeholders para ser completados en la versión formal.</w:t>
+        <w:t xml:space="preserve"> La tabla identifica al alumno, director, codirector y asesor profesional si correspondiera. En esta versión se consigna que no se declara codirector ni asesor profesional.</w:t>
       </w:r>
     </w:p>
     <w:p>
@@ -18837,7 +18837,7 @@
         <w:color w:val="000000"/>
         <w:sz w:val="18"/>
       </w:rPr>
-      <w:t>[Apellido/s]</w:t>
+      <w:t>Dip</w:t>
     </w:r>
     <w:r>
       <w:rPr>

</xml_diff>

<commit_message>
docs: update thesis contact and evaluation
</commit_message>
<xml_diff>
--- a/tesis/entrega/plan-tesis-proyecto-final-integrador.docx
+++ b/tesis/entrega/plan-tesis-proyecto-final-integrador.docx
@@ -274,6 +274,21 @@
     </w:p>
     <w:p>
       <w:pPr>
+        <w:spacing w:line="360" w:lineRule="auto" w:before="0" w:after="0"/>
+      </w:pPr>
+      <w:r>
+        <w:rPr>
+          <w:rFonts w:ascii="Times New Roman" w:hAnsi="Times New Roman" w:eastAsia="Times New Roman"/>
+          <w:b w:val="0"/>
+          <w:i w:val="0"/>
+          <w:color w:val="000000"/>
+          <w:sz w:val="22"/>
+        </w:rPr>
+        <w:t>Documento preliminar para presentar el tema, alcance, solución propuesta, validación y planificación del trabajo final integrador.</w:t>
+      </w:r>
+    </w:p>
+    <w:p>
+      <w:pPr>
         <w:pStyle w:val="Heading2"/>
         <w:spacing w:line="360" w:lineRule="auto" w:before="0" w:after="0"/>
       </w:pPr>
@@ -332,6 +347,21 @@
           <w:sz w:val="28"/>
         </w:rPr>
         <w:t>1. Títulos</w:t>
+      </w:r>
+    </w:p>
+    <w:p>
+      <w:pPr>
+        <w:spacing w:line="360" w:lineRule="auto" w:before="0" w:after="0"/>
+      </w:pPr>
+      <w:r>
+        <w:rPr>
+          <w:rFonts w:ascii="Times New Roman" w:hAnsi="Times New Roman" w:eastAsia="Times New Roman"/>
+          <w:b w:val="0"/>
+          <w:i w:val="0"/>
+          <w:color w:val="000000"/>
+          <w:sz w:val="22"/>
+        </w:rPr>
+        <w:t>La sección presenta el título principal y una formulación alternativa de trabajo para orientar el alcance académico y técnico de la tesis.</w:t>
       </w:r>
     </w:p>
     <w:p>
@@ -808,7 +838,7 @@
                 <w:color w:val="000000"/>
                 <w:sz w:val="16"/>
               </w:rPr>
-              <w:t>gaspar@fasteditor.com</w:t>
+              <w:t>dip.gaspar@gmaill.com</w:t>
             </w:r>
           </w:p>
         </w:tc>
@@ -4246,6 +4276,21 @@
           <w:sz w:val="24"/>
         </w:rPr>
         <w:t>10.3. Alcance</w:t>
+      </w:r>
+    </w:p>
+    <w:p>
+      <w:pPr>
+        <w:spacing w:line="360" w:lineRule="auto" w:before="0" w:after="0"/>
+      </w:pPr>
+      <w:r>
+        <w:rPr>
+          <w:rFonts w:ascii="Times New Roman" w:hAnsi="Times New Roman" w:eastAsia="Times New Roman"/>
+          <w:b w:val="0"/>
+          <w:i w:val="0"/>
+          <w:color w:val="000000"/>
+          <w:sz w:val="22"/>
+        </w:rPr>
+        <w:t>El alcance delimita qué partes del runtime serán abordadas en la tesis y qué extensiones quedarán fuera para mantener el trabajo acotado y verificable.</w:t>
       </w:r>
     </w:p>
     <w:p>
@@ -8268,6 +8313,21 @@
           <w:sz w:val="24"/>
         </w:rPr>
         <w:t>10.8. Tecnologías previstas</w:t>
+      </w:r>
+    </w:p>
+    <w:p>
+      <w:pPr>
+        <w:spacing w:line="360" w:lineRule="auto" w:before="0" w:after="0"/>
+      </w:pPr>
+      <w:r>
+        <w:rPr>
+          <w:rFonts w:ascii="Times New Roman" w:hAnsi="Times New Roman" w:eastAsia="Times New Roman"/>
+          <w:b w:val="0"/>
+          <w:i w:val="0"/>
+          <w:color w:val="000000"/>
+          <w:sz w:val="22"/>
+        </w:rPr>
+        <w:t>Las tecnologías previstas se agrupan según su rol en la implementación del prototipo y en la validación de los escenarios definidos.</w:t>
       </w:r>
     </w:p>
     <w:p>
@@ -15306,6 +15366,21 @@
     </w:p>
     <w:p>
       <w:pPr>
+        <w:spacing w:line="360" w:lineRule="auto" w:before="0" w:after="0"/>
+      </w:pPr>
+      <w:r>
+        <w:rPr>
+          <w:rFonts w:ascii="Times New Roman" w:hAnsi="Times New Roman" w:eastAsia="Times New Roman"/>
+          <w:b w:val="0"/>
+          <w:i w:val="0"/>
+          <w:color w:val="000000"/>
+          <w:sz w:val="22"/>
+        </w:rPr>
+        <w:t>Esta sección identifica los insumos y dependencias necesarios para ejecutar la validación sin depender de datos masivos ni de infraestructura productiva.</w:t>
+      </w:r>
+    </w:p>
+    <w:p>
+      <w:pPr>
         <w:pStyle w:val="Heading4"/>
         <w:spacing w:line="360" w:lineRule="auto" w:before="0" w:after="0"/>
       </w:pPr>
@@ -17261,6 +17336,21 @@
           <w:sz w:val="28"/>
         </w:rPr>
         <w:t>14. Anexos</w:t>
+      </w:r>
+    </w:p>
+    <w:p>
+      <w:pPr>
+        <w:spacing w:line="360" w:lineRule="auto" w:before="0" w:after="0"/>
+      </w:pPr>
+      <w:r>
+        <w:rPr>
+          <w:rFonts w:ascii="Times New Roman" w:hAnsi="Times New Roman" w:eastAsia="Times New Roman"/>
+          <w:b w:val="0"/>
+          <w:i w:val="0"/>
+          <w:color w:val="000000"/>
+          <w:sz w:val="22"/>
+        </w:rPr>
+        <w:t>Los anexos reúnen material de apoyo para lectura, trazabilidad y futura exportación del documento.</w:t>
       </w:r>
     </w:p>
     <w:p>

</xml_diff>

<commit_message>
docs: remove internal thesis annexes
</commit_message>
<xml_diff>
--- a/tesis/entrega/plan-tesis-proyecto-final-integrador.docx
+++ b/tesis/entrega/plan-tesis-proyecto-final-integrador.docx
@@ -23231,327 +23231,7 @@
           <w:color w:val="1F4E79"/>
           <w:sz w:val="24"/>
         </w:rPr>
-        <w:t>Anexo C. Organización propuesta del repositorio de tesis</w:t>
-      </w:r>
-    </w:p>
-    <w:p>
-      <w:pPr>
-        <w:keepNext w:val="0"/>
-        <w:spacing w:line="324" w:lineRule="auto" w:before="0" w:after="100"/>
-      </w:pPr>
-      <w:r>
-        <w:rPr>
-          <w:rFonts w:ascii="Times New Roman" w:hAnsi="Times New Roman" w:eastAsia="Times New Roman"/>
-          <w:b w:val="0"/>
-          <w:i w:val="0"/>
-          <w:color w:val="191919"/>
-          <w:sz w:val="22"/>
-        </w:rPr>
-        <w:t>Se propone mantener la documentación de tesis dentro del fork de Symphony, en una carpeta separada, para facilitar trazabilidad entre investigación, diseño, implementación y validación.</w:t>
-      </w:r>
-    </w:p>
-    <w:p>
-      <w:pPr>
-        <w:keepNext w:val="0"/>
-        <w:spacing w:line="240" w:lineRule="auto" w:before="60" w:after="120"/>
-      </w:pPr>
-      <w:r>
-        <w:rPr>
-          <w:rFonts w:ascii="Courier New" w:hAnsi="Courier New" w:eastAsia="Courier New"/>
-          <w:color w:val="191919"/>
-          <w:sz w:val="17"/>
-        </w:rPr>
-        <w:t>tesis/</w:t>
-        <w:br/>
-        <w:t xml:space="preserve">  README.md</w:t>
-        <w:br/>
-        <w:t xml:space="preserve">  propuesta/</w:t>
-        <w:br/>
-        <w:t xml:space="preserve">    plan.md</w:t>
-        <w:br/>
-        <w:t xml:space="preserve">    resumen.md</w:t>
-        <w:br/>
-        <w:t xml:space="preserve">  estado-del-arte/</w:t>
-        <w:br/>
-        <w:t xml:space="preserve">    taxonomia.md</w:t>
-        <w:br/>
-        <w:t xml:space="preserve">    matriz-comparativa.md</w:t>
-        <w:br/>
-        <w:t xml:space="preserve">    referencias.md</w:t>
-        <w:br/>
-        <w:t xml:space="preserve">  problema/</w:t>
-        <w:br/>
-        <w:t xml:space="preserve">    vacancias.md</w:t>
-        <w:br/>
-        <w:t xml:space="preserve">    requisitos.md</w:t>
-        <w:br/>
-        <w:t xml:space="preserve">    matriz-trazabilidad.md</w:t>
-        <w:br/>
-        <w:t xml:space="preserve">  solucion/</w:t>
-        <w:br/>
-        <w:t xml:space="preserve">    arquitectura.md</w:t>
-        <w:br/>
-        <w:t xml:space="preserve">    tecnologias.md</w:t>
-        <w:br/>
-        <w:t xml:space="preserve">  validacion/</w:t>
-        <w:br/>
-        <w:t xml:space="preserve">    pruebas-basales.md</w:t>
-        <w:br/>
-        <w:t xml:space="preserve">    casos-reales.md</w:t>
-        <w:br/>
-        <w:t xml:space="preserve">    metricas.md</w:t>
-        <w:br/>
-        <w:t xml:space="preserve">    resultados.md</w:t>
-        <w:br/>
-        <w:t xml:space="preserve">  gestion/</w:t>
-        <w:br/>
-        <w:t xml:space="preserve">    cronograma.md</w:t>
-        <w:br/>
-        <w:t xml:space="preserve">    riesgos.md</w:t>
-        <w:br/>
-        <w:t xml:space="preserve">    reuniones.md</w:t>
-        <w:br/>
-        <w:t xml:space="preserve">  anexos/</w:t>
-        <w:br/>
-        <w:t xml:space="preserve">    glosario.md</w:t>
-        <w:br/>
-        <w:t xml:space="preserve">    exportacion.md</w:t>
-      </w:r>
-    </w:p>
-    <w:p>
-      <w:pPr>
-        <w:keepNext w:val="0"/>
-        <w:spacing w:line="324" w:lineRule="auto" w:before="0" w:after="100"/>
-      </w:pPr>
-      <w:r>
-        <w:rPr>
-          <w:rFonts w:ascii="Times New Roman" w:hAnsi="Times New Roman" w:eastAsia="Times New Roman"/>
-          <w:b w:val="0"/>
-          <w:i w:val="0"/>
-          <w:color w:val="191919"/>
-          <w:sz w:val="22"/>
-        </w:rPr>
-        <w:t>Esta organización permite versionar cambios, vincular documentación con código, revisar avances desde GitHub y exportar el contenido a PDF o DOCX con herramientas como Pandoc, Quarto u otros conversores de Markdown.</w:t>
-      </w:r>
-    </w:p>
-    <w:p>
-      <w:pPr>
-        <w:pStyle w:val="Heading3"/>
-        <w:keepNext/>
-        <w:spacing w:line="276" w:lineRule="auto" w:before="120" w:after="60"/>
-      </w:pPr>
-      <w:r>
-        <w:rPr>
-          <w:rFonts w:ascii="Times New Roman" w:hAnsi="Times New Roman" w:eastAsia="Times New Roman"/>
-          <w:b/>
-          <w:i w:val="0"/>
-          <w:color w:val="1F4E79"/>
-          <w:sz w:val="24"/>
-        </w:rPr>
-        <w:t>Anexo D. Formato sugerido para exportación</w:t>
-      </w:r>
-    </w:p>
-    <w:p>
-      <w:pPr>
-        <w:keepNext w:val="0"/>
-        <w:spacing w:line="324" w:lineRule="auto" w:before="0" w:after="100"/>
-      </w:pPr>
-      <w:r>
-        <w:rPr>
-          <w:rFonts w:ascii="Times New Roman" w:hAnsi="Times New Roman" w:eastAsia="Times New Roman"/>
-          <w:b w:val="0"/>
-          <w:i w:val="0"/>
-          <w:color w:val="191919"/>
-          <w:sz w:val="22"/>
-        </w:rPr>
-        <w:t>Para adaptar el documento a la guía de Blackboard se recomienda:</w:t>
-      </w:r>
-    </w:p>
-    <w:p>
-      <w:pPr>
-        <w:pStyle w:val="ListBullet"/>
-        <w:keepNext w:val="0"/>
-        <w:spacing w:line="312" w:lineRule="auto" w:before="0" w:after="60"/>
-      </w:pPr>
-      <w:r>
-        <w:rPr>
-          <w:rFonts w:ascii="Times New Roman" w:hAnsi="Times New Roman" w:eastAsia="Times New Roman"/>
-          <w:b w:val="0"/>
-          <w:i w:val="0"/>
-          <w:color w:val="191919"/>
-          <w:sz w:val="21"/>
-        </w:rPr>
-        <w:t>hoja A4;</w:t>
-      </w:r>
-    </w:p>
-    <w:p>
-      <w:pPr>
-        <w:pStyle w:val="ListBullet"/>
-        <w:keepNext w:val="0"/>
-        <w:spacing w:line="312" w:lineRule="auto" w:before="0" w:after="60"/>
-      </w:pPr>
-      <w:r>
-        <w:rPr>
-          <w:rFonts w:ascii="Times New Roman" w:hAnsi="Times New Roman" w:eastAsia="Times New Roman"/>
-          <w:b w:val="0"/>
-          <w:i w:val="0"/>
-          <w:color w:val="191919"/>
-          <w:sz w:val="21"/>
-        </w:rPr>
-        <w:t>fuente Times New Roman 11 para cuerpo de texto;</w:t>
-      </w:r>
-    </w:p>
-    <w:p>
-      <w:pPr>
-        <w:pStyle w:val="ListBullet"/>
-        <w:keepNext w:val="0"/>
-        <w:spacing w:line="312" w:lineRule="auto" w:before="0" w:after="60"/>
-      </w:pPr>
-      <w:r>
-        <w:rPr>
-          <w:rFonts w:ascii="Times New Roman" w:hAnsi="Times New Roman" w:eastAsia="Times New Roman"/>
-          <w:b w:val="0"/>
-          <w:i w:val="0"/>
-          <w:color w:val="191919"/>
-          <w:sz w:val="21"/>
-        </w:rPr>
-        <w:t>fuente 14 para títulos intermedios;</w:t>
-      </w:r>
-    </w:p>
-    <w:p>
-      <w:pPr>
-        <w:pStyle w:val="ListBullet"/>
-        <w:keepNext w:val="0"/>
-        <w:spacing w:line="312" w:lineRule="auto" w:before="0" w:after="60"/>
-      </w:pPr>
-      <w:r>
-        <w:rPr>
-          <w:rFonts w:ascii="Times New Roman" w:hAnsi="Times New Roman" w:eastAsia="Times New Roman"/>
-          <w:b w:val="0"/>
-          <w:i w:val="0"/>
-          <w:color w:val="191919"/>
-          <w:sz w:val="21"/>
-        </w:rPr>
-        <w:t>fuente 16 para títulos principales;</w:t>
-      </w:r>
-    </w:p>
-    <w:p>
-      <w:pPr>
-        <w:pStyle w:val="ListBullet"/>
-        <w:keepNext w:val="0"/>
-        <w:spacing w:line="312" w:lineRule="auto" w:before="0" w:after="60"/>
-      </w:pPr>
-      <w:r>
-        <w:rPr>
-          <w:rFonts w:ascii="Times New Roman" w:hAnsi="Times New Roman" w:eastAsia="Times New Roman"/>
-          <w:b w:val="0"/>
-          <w:i w:val="0"/>
-          <w:color w:val="191919"/>
-          <w:sz w:val="21"/>
-        </w:rPr>
-        <w:t>interlineado 1,5;</w:t>
-      </w:r>
-    </w:p>
-    <w:p>
-      <w:pPr>
-        <w:pStyle w:val="ListBullet"/>
-        <w:keepNext w:val="0"/>
-        <w:spacing w:line="312" w:lineRule="auto" w:before="0" w:after="60"/>
-      </w:pPr>
-      <w:r>
-        <w:rPr>
-          <w:rFonts w:ascii="Times New Roman" w:hAnsi="Times New Roman" w:eastAsia="Times New Roman"/>
-          <w:b w:val="0"/>
-          <w:i w:val="0"/>
-          <w:color w:val="191919"/>
-          <w:sz w:val="21"/>
-        </w:rPr>
-        <w:t>encabezado con el nombre del trabajo;</w:t>
-      </w:r>
-    </w:p>
-    <w:p>
-      <w:pPr>
-        <w:pStyle w:val="ListBullet"/>
-        <w:keepNext w:val="0"/>
-        <w:spacing w:line="312" w:lineRule="auto" w:before="0" w:after="60"/>
-      </w:pPr>
-      <w:r>
-        <w:rPr>
-          <w:rFonts w:ascii="Times New Roman" w:hAnsi="Times New Roman" w:eastAsia="Times New Roman"/>
-          <w:b w:val="0"/>
-          <w:i w:val="0"/>
-          <w:color w:val="191919"/>
-          <w:sz w:val="21"/>
-        </w:rPr>
-        <w:t>pie de página con apellidos de integrantes y número de página;</w:t>
-      </w:r>
-    </w:p>
-    <w:p>
-      <w:pPr>
-        <w:pStyle w:val="ListBullet"/>
-        <w:keepNext w:val="0"/>
-        <w:spacing w:line="312" w:lineRule="auto" w:before="0" w:after="60"/>
-      </w:pPr>
-      <w:r>
-        <w:rPr>
-          <w:rFonts w:ascii="Times New Roman" w:hAnsi="Times New Roman" w:eastAsia="Times New Roman"/>
-          <w:b w:val="0"/>
-          <w:i w:val="0"/>
-          <w:color w:val="191919"/>
-          <w:sz w:val="21"/>
-        </w:rPr>
-        <w:t>tablas numeradas con título y breve descripción;</w:t>
-      </w:r>
-    </w:p>
-    <w:p>
-      <w:pPr>
-        <w:pStyle w:val="ListBullet"/>
-        <w:keepNext w:val="0"/>
-        <w:spacing w:line="312" w:lineRule="auto" w:before="0" w:after="60"/>
-      </w:pPr>
-      <w:r>
-        <w:rPr>
-          <w:rFonts w:ascii="Times New Roman" w:hAnsi="Times New Roman" w:eastAsia="Times New Roman"/>
-          <w:b w:val="0"/>
-          <w:i w:val="0"/>
-          <w:color w:val="191919"/>
-          <w:sz w:val="21"/>
-        </w:rPr>
-        <w:t>carátula y acta según modelos de la cátedra;</w:t>
-      </w:r>
-    </w:p>
-    <w:p>
-      <w:pPr>
-        <w:pStyle w:val="ListBullet"/>
-        <w:keepNext w:val="0"/>
-        <w:spacing w:line="312" w:lineRule="auto" w:before="0" w:after="60"/>
-      </w:pPr>
-      <w:r>
-        <w:rPr>
-          <w:rFonts w:ascii="Times New Roman" w:hAnsi="Times New Roman" w:eastAsia="Times New Roman"/>
-          <w:b w:val="0"/>
-          <w:i w:val="0"/>
-          <w:color w:val="191919"/>
-          <w:sz w:val="21"/>
-        </w:rPr>
-        <w:t>conversión a DOCX/PDF para entrega formal.</w:t>
-      </w:r>
-    </w:p>
-    <w:p>
-      <w:pPr>
-        <w:pStyle w:val="Heading3"/>
-        <w:keepNext/>
-        <w:spacing w:line="276" w:lineRule="auto" w:before="120" w:after="60"/>
-      </w:pPr>
-      <w:r>
-        <w:rPr>
-          <w:rFonts w:ascii="Times New Roman" w:hAnsi="Times New Roman" w:eastAsia="Times New Roman"/>
-          <w:b/>
-          <w:i w:val="0"/>
-          <w:color w:val="1F4E79"/>
-          <w:sz w:val="24"/>
-        </w:rPr>
-        <w:t>Anexo E. Cierre preliminar</w:t>
+        <w:t>Anexo C. Cierre preliminar</w:t>
       </w:r>
     </w:p>
     <w:p>

</xml_diff>

<commit_message>
docs: remove thesis delivery meta wording
</commit_message>
<xml_diff>
--- a/tesis/entrega/plan-tesis-proyecto-final-integrador.docx
+++ b/tesis/entrega/plan-tesis-proyecto-final-integrador.docx
@@ -631,7 +631,7 @@
           <w:color w:val="555555"/>
           <w:sz w:val="19"/>
         </w:rPr>
-        <w:t>Documento preparado para la entrega de Blackboard del Plan de Tesis - Proyecto Final Integrador.</w:t>
+        <w:t>Documento de presentación del Plan de Tesis - Proyecto Final Integrador.</w:t>
       </w:r>
     </w:p>
     <w:p>
@@ -666,7 +666,7 @@
           <w:color w:val="191919"/>
           <w:sz w:val="22"/>
         </w:rPr>
-        <w:t>Documento preliminar para presentar el tema, alcance, solución propuesta, validación y planificación del trabajo final integrador.</w:t>
+        <w:t>Propuesta de trabajo para presentar el tema, alcance, solución, validación y planificación del trabajo final integrador.</w:t>
       </w:r>
     </w:p>
     <w:p>
@@ -1840,7 +1840,7 @@
           <w:color w:val="191919"/>
           <w:sz w:val="22"/>
         </w:rPr>
-        <w:t>La tabla identifica al alumno, director, codirector y asesor profesional si correspondiera. En esta versión se consigna que no se declara codirector ni asesor profesional.</w:t>
+        <w:t>La tabla identifica al alumno, director, codirector y asesor profesional si correspondiera. No se declara codirector ni asesor profesional.</w:t>
       </w:r>
     </w:p>
     <w:p>
@@ -3013,7 +3013,7 @@
           <w:color w:val="191919"/>
           <w:sz w:val="22"/>
         </w:rPr>
-        <w:t xml:space="preserve"> publicado por OpenAI propone tratar el conocimiento del repositorio como fuente de verdad estructurada, versionada y verificable. El artículo describe cómo un repositorio puede organizar documentación, planes, especificaciones, reglas de calidad y validaciones para que los agentes operen con mayor legibilidad y menor dependencia de instrucciones extensas o desactualizadas (Lopopolo, 2026).</w:t>
+        <w:t xml:space="preserve"> publicado por OpenAI propone tratar el conocimiento del repositorio como una base estructurada, versionada y verificable. El artículo describe cómo un repositorio puede organizar documentación, planes, especificaciones, reglas de calidad y validaciones para que los agentes operen con mayor legibilidad y menor dependencia de instrucciones extensas o desactualizadas (Lopopolo, 2026).</w:t>
       </w:r>
     </w:p>
     <w:p>
@@ -18636,7 +18636,7 @@
                 <w:color w:val="191919"/>
                 <w:sz w:val="15"/>
               </w:rPr>
-              <w:t>Gráficos poco legibles en exportación</w:t>
+              <w:t>Gráficos poco legibles en documentos finales</w:t>
             </w:r>
           </w:p>
         </w:tc>
@@ -19212,7 +19212,7 @@
           <w:color w:val="191919"/>
           <w:sz w:val="21"/>
         </w:rPr>
-        <w:t>documentación técnica en Markdown;</w:t>
+        <w:t>documentación técnica versionada;</w:t>
       </w:r>
     </w:p>
     <w:p>
@@ -19498,7 +19498,7 @@
           <w:color w:val="191919"/>
           <w:sz w:val="22"/>
         </w:rPr>
-        <w:t>La documentación se organizará en Markdown dentro del repositorio, separando propuesta, estado del arte, problema, solución, validación, gestión y anexos. Esto permitirá trazabilidad entre comentarios del profesor, cambios de diseño, implementación y resultados.</w:t>
+        <w:t>La documentación se organizará en archivos versionados dentro del repositorio, separando propuesta, estado del arte, problema, solución, validación, gestión y anexos. Esto permitirá trazabilidad entre comentarios del profesor, cambios de diseño, implementación y resultados.</w:t>
       </w:r>
     </w:p>
     <w:p>
@@ -21736,7 +21736,7 @@
           <w:color w:val="191919"/>
           <w:sz w:val="22"/>
         </w:rPr>
-        <w:t>Los anexos reúnen material de apoyo para lectura, trazabilidad y futura exportación del documento.</w:t>
+        <w:t>Los anexos reúnen material de apoyo para lectura y trazabilidad.</w:t>
       </w:r>
     </w:p>
     <w:p>

</xml_diff>

<commit_message>
docs: address final thesis review blockers
</commit_message>
<xml_diff>
--- a/tesis/entrega/plan-tesis-proyecto-final-integrador.docx
+++ b/tesis/entrega/plan-tesis-proyecto-final-integrador.docx
@@ -639,7 +639,7 @@
         <w:pStyle w:val="Heading1"/>
         <w:keepNext/>
         <w:pageBreakBefore/>
-        <w:spacing w:line="276" w:lineRule="auto" w:before="200" w:after="100"/>
+        <w:spacing w:line="360" w:lineRule="auto" w:before="200" w:after="100"/>
         <w:jc w:val="center"/>
       </w:pPr>
       <w:r>
@@ -656,7 +656,7 @@
     <w:p>
       <w:pPr>
         <w:keepNext w:val="0"/>
-        <w:spacing w:line="324" w:lineRule="auto" w:before="0" w:after="100"/>
+        <w:spacing w:line="360" w:lineRule="auto" w:before="0" w:after="100"/>
       </w:pPr>
       <w:r>
         <w:rPr>
@@ -673,7 +673,7 @@
       <w:pPr>
         <w:pStyle w:val="Heading2"/>
         <w:keepNext/>
-        <w:spacing w:line="276" w:lineRule="auto" w:before="200" w:after="100"/>
+        <w:spacing w:line="360" w:lineRule="auto" w:before="200" w:after="100"/>
       </w:pPr>
       <w:r>
         <w:rPr>
@@ -729,7 +729,7 @@
       <w:pPr>
         <w:pStyle w:val="Heading2"/>
         <w:keepNext/>
-        <w:spacing w:line="276" w:lineRule="auto" w:before="200" w:after="100"/>
+        <w:spacing w:line="360" w:lineRule="auto" w:before="200" w:after="100"/>
       </w:pPr>
       <w:r>
         <w:rPr>
@@ -745,7 +745,7 @@
     <w:p>
       <w:pPr>
         <w:keepNext w:val="0"/>
-        <w:spacing w:line="324" w:lineRule="auto" w:before="0" w:after="100"/>
+        <w:spacing w:line="360" w:lineRule="auto" w:before="0" w:after="100"/>
       </w:pPr>
       <w:r>
         <w:rPr>
@@ -762,7 +762,7 @@
       <w:pPr>
         <w:pStyle w:val="Heading3"/>
         <w:keepNext/>
-        <w:spacing w:line="276" w:lineRule="auto" w:before="120" w:after="60"/>
+        <w:spacing w:line="360" w:lineRule="auto" w:before="120" w:after="60"/>
       </w:pPr>
       <w:r>
         <w:rPr>
@@ -778,7 +778,7 @@
     <w:p>
       <w:pPr>
         <w:keepNext w:val="0"/>
-        <w:spacing w:line="324" w:lineRule="auto" w:before="0" w:after="100"/>
+        <w:spacing w:line="360" w:lineRule="auto" w:before="0" w:after="100"/>
       </w:pPr>
       <w:r>
         <w:rPr>
@@ -825,7 +825,7 @@
       <w:pPr>
         <w:pStyle w:val="Heading3"/>
         <w:keepNext/>
-        <w:spacing w:line="276" w:lineRule="auto" w:before="120" w:after="60"/>
+        <w:spacing w:line="360" w:lineRule="auto" w:before="120" w:after="60"/>
       </w:pPr>
       <w:r>
         <w:rPr>
@@ -841,7 +841,7 @@
     <w:p>
       <w:pPr>
         <w:keepNext w:val="0"/>
-        <w:spacing w:line="324" w:lineRule="auto" w:before="0" w:after="100"/>
+        <w:spacing w:line="360" w:lineRule="auto" w:before="0" w:after="100"/>
       </w:pPr>
       <w:r>
         <w:rPr>
@@ -858,7 +858,7 @@
       <w:pPr>
         <w:pStyle w:val="Heading3"/>
         <w:keepNext/>
-        <w:spacing w:line="276" w:lineRule="auto" w:before="120" w:after="60"/>
+        <w:spacing w:line="360" w:lineRule="auto" w:before="120" w:after="60"/>
       </w:pPr>
       <w:r>
         <w:rPr>
@@ -875,7 +875,7 @@
       <w:pPr>
         <w:pStyle w:val="ListBullet"/>
         <w:keepNext w:val="0"/>
-        <w:spacing w:line="312" w:lineRule="auto" w:before="0" w:after="60"/>
+        <w:spacing w:line="360" w:lineRule="auto" w:before="0" w:after="60"/>
       </w:pPr>
       <w:r>
         <w:rPr>
@@ -902,7 +902,7 @@
       <w:pPr>
         <w:pStyle w:val="ListBullet"/>
         <w:keepNext w:val="0"/>
-        <w:spacing w:line="312" w:lineRule="auto" w:before="0" w:after="60"/>
+        <w:spacing w:line="360" w:lineRule="auto" w:before="0" w:after="60"/>
       </w:pPr>
       <w:r>
         <w:rPr>
@@ -929,7 +929,7 @@
       <w:pPr>
         <w:pStyle w:val="ListBullet"/>
         <w:keepNext w:val="0"/>
-        <w:spacing w:line="312" w:lineRule="auto" w:before="0" w:after="60"/>
+        <w:spacing w:line="360" w:lineRule="auto" w:before="0" w:after="60"/>
       </w:pPr>
       <w:r>
         <w:rPr>
@@ -956,7 +956,7 @@
       <w:pPr>
         <w:pStyle w:val="ListBullet"/>
         <w:keepNext w:val="0"/>
-        <w:spacing w:line="312" w:lineRule="auto" w:before="0" w:after="60"/>
+        <w:spacing w:line="360" w:lineRule="auto" w:before="0" w:after="60"/>
       </w:pPr>
       <w:r>
         <w:rPr>
@@ -983,7 +983,7 @@
       <w:pPr>
         <w:pStyle w:val="ListBullet"/>
         <w:keepNext w:val="0"/>
-        <w:spacing w:line="312" w:lineRule="auto" w:before="0" w:after="60"/>
+        <w:spacing w:line="360" w:lineRule="auto" w:before="0" w:after="60"/>
       </w:pPr>
       <w:r>
         <w:rPr>
@@ -1019,7 +1019,7 @@
       <w:pPr>
         <w:pStyle w:val="Heading2"/>
         <w:keepNext/>
-        <w:spacing w:line="276" w:lineRule="auto" w:before="200" w:after="100"/>
+        <w:spacing w:line="360" w:lineRule="auto" w:before="200" w:after="100"/>
       </w:pPr>
       <w:r>
         <w:rPr>
@@ -1811,7 +1811,7 @@
     <w:p>
       <w:pPr>
         <w:keepNext/>
-        <w:spacing w:line="276" w:lineRule="auto" w:before="40" w:after="100"/>
+        <w:spacing w:line="360" w:lineRule="auto" w:before="40" w:after="100"/>
         <w:pBdr>
           <w:bottom w:val="single" w:sz="8" w:space="4" w:color="D9E2F3"/>
         </w:pBdr>
@@ -1830,7 +1830,7 @@
     <w:p>
       <w:pPr>
         <w:keepNext w:val="0"/>
-        <w:spacing w:line="324" w:lineRule="auto" w:before="0" w:after="100"/>
+        <w:spacing w:line="360" w:lineRule="auto" w:before="0" w:after="100"/>
       </w:pPr>
       <w:r>
         <w:rPr>
@@ -1856,7 +1856,7 @@
       <w:pPr>
         <w:pStyle w:val="Heading2"/>
         <w:keepNext/>
-        <w:spacing w:line="276" w:lineRule="auto" w:before="200" w:after="100"/>
+        <w:spacing w:line="360" w:lineRule="auto" w:before="200" w:after="100"/>
       </w:pPr>
       <w:r>
         <w:rPr>
@@ -1872,7 +1872,7 @@
     <w:p>
       <w:pPr>
         <w:keepNext w:val="0"/>
-        <w:spacing w:line="324" w:lineRule="auto" w:before="0" w:after="100"/>
+        <w:spacing w:line="360" w:lineRule="auto" w:before="0" w:after="100"/>
       </w:pPr>
       <w:r>
         <w:rPr>
@@ -1908,7 +1908,7 @@
     <w:p>
       <w:pPr>
         <w:keepNext w:val="0"/>
-        <w:spacing w:line="324" w:lineRule="auto" w:before="0" w:after="100"/>
+        <w:spacing w:line="360" w:lineRule="auto" w:before="0" w:after="100"/>
       </w:pPr>
       <w:r>
         <w:rPr>
@@ -1984,7 +1984,7 @@
     <w:p>
       <w:pPr>
         <w:keepNext w:val="0"/>
-        <w:spacing w:line="324" w:lineRule="auto" w:before="0" w:after="100"/>
+        <w:spacing w:line="360" w:lineRule="auto" w:before="0" w:after="100"/>
       </w:pPr>
       <w:r>
         <w:rPr>
@@ -2010,7 +2010,7 @@
       <w:pPr>
         <w:pStyle w:val="Heading2"/>
         <w:keepNext/>
-        <w:spacing w:line="276" w:lineRule="auto" w:before="200" w:after="100"/>
+        <w:spacing w:line="360" w:lineRule="auto" w:before="200" w:after="100"/>
       </w:pPr>
       <w:r>
         <w:rPr>
@@ -2026,7 +2026,7 @@
     <w:p>
       <w:pPr>
         <w:keepNext w:val="0"/>
-        <w:spacing w:line="324" w:lineRule="auto" w:before="0" w:after="100"/>
+        <w:spacing w:line="360" w:lineRule="auto" w:before="0" w:after="100"/>
       </w:pPr>
       <w:r>
         <w:rPr>
@@ -2112,7 +2112,7 @@
       <w:pPr>
         <w:pStyle w:val="Heading2"/>
         <w:keepNext/>
-        <w:spacing w:line="276" w:lineRule="auto" w:before="200" w:after="100"/>
+        <w:spacing w:line="360" w:lineRule="auto" w:before="200" w:after="100"/>
       </w:pPr>
       <w:r>
         <w:rPr>
@@ -2128,7 +2128,7 @@
     <w:p>
       <w:pPr>
         <w:keepNext w:val="0"/>
-        <w:spacing w:line="324" w:lineRule="auto" w:before="0" w:after="100"/>
+        <w:spacing w:line="360" w:lineRule="auto" w:before="0" w:after="100"/>
       </w:pPr>
       <w:r>
         <w:rPr>
@@ -2144,7 +2144,7 @@
     <w:p>
       <w:pPr>
         <w:keepNext w:val="0"/>
-        <w:spacing w:line="324" w:lineRule="auto" w:before="0" w:after="100"/>
+        <w:spacing w:line="360" w:lineRule="auto" w:before="0" w:after="100"/>
       </w:pPr>
       <w:r>
         <w:rPr>
@@ -2180,7 +2180,7 @@
     <w:p>
       <w:pPr>
         <w:keepNext w:val="0"/>
-        <w:spacing w:line="324" w:lineRule="auto" w:before="0" w:after="100"/>
+        <w:spacing w:line="360" w:lineRule="auto" w:before="0" w:after="100"/>
       </w:pPr>
       <w:r>
         <w:rPr>
@@ -2206,7 +2206,7 @@
       <w:pPr>
         <w:pStyle w:val="Heading2"/>
         <w:keepNext/>
-        <w:spacing w:line="276" w:lineRule="auto" w:before="200" w:after="100"/>
+        <w:spacing w:line="360" w:lineRule="auto" w:before="200" w:after="100"/>
       </w:pPr>
       <w:r>
         <w:rPr>
@@ -2222,7 +2222,7 @@
     <w:p>
       <w:pPr>
         <w:keepNext w:val="0"/>
-        <w:spacing w:line="324" w:lineRule="auto" w:before="0" w:after="100"/>
+        <w:spacing w:line="360" w:lineRule="auto" w:before="0" w:after="100"/>
       </w:pPr>
       <w:r>
         <w:rPr>
@@ -2248,7 +2248,7 @@
       <w:pPr>
         <w:pStyle w:val="Heading2"/>
         <w:keepNext/>
-        <w:spacing w:line="276" w:lineRule="auto" w:before="200" w:after="100"/>
+        <w:spacing w:line="360" w:lineRule="auto" w:before="200" w:after="100"/>
       </w:pPr>
       <w:r>
         <w:rPr>
@@ -2264,7 +2264,7 @@
     <w:p>
       <w:pPr>
         <w:keepNext w:val="0"/>
-        <w:spacing w:line="324" w:lineRule="auto" w:before="0" w:after="100"/>
+        <w:spacing w:line="360" w:lineRule="auto" w:before="0" w:after="100"/>
       </w:pPr>
       <w:r>
         <w:rPr>
@@ -2300,7 +2300,7 @@
     <w:p>
       <w:pPr>
         <w:keepNext w:val="0"/>
-        <w:spacing w:line="324" w:lineRule="auto" w:before="0" w:after="100"/>
+        <w:spacing w:line="360" w:lineRule="auto" w:before="0" w:after="100"/>
       </w:pPr>
       <w:r>
         <w:rPr>
@@ -2336,7 +2336,7 @@
     <w:p>
       <w:pPr>
         <w:keepNext w:val="0"/>
-        <w:spacing w:line="324" w:lineRule="auto" w:before="0" w:after="100"/>
+        <w:spacing w:line="360" w:lineRule="auto" w:before="0" w:after="100"/>
       </w:pPr>
       <w:r>
         <w:rPr>
@@ -2352,7 +2352,7 @@
     <w:p>
       <w:pPr>
         <w:keepNext w:val="0"/>
-        <w:spacing w:line="324" w:lineRule="auto" w:before="0" w:after="100"/>
+        <w:spacing w:line="360" w:lineRule="auto" w:before="0" w:after="100"/>
       </w:pPr>
       <w:r>
         <w:rPr>
@@ -2408,7 +2408,7 @@
     <w:p>
       <w:pPr>
         <w:keepNext w:val="0"/>
-        <w:spacing w:line="324" w:lineRule="auto" w:before="0" w:after="100"/>
+        <w:spacing w:line="360" w:lineRule="auto" w:before="0" w:after="100"/>
       </w:pPr>
       <w:r>
         <w:rPr>
@@ -2464,7 +2464,7 @@
     <w:p>
       <w:pPr>
         <w:keepNext w:val="0"/>
-        <w:spacing w:line="324" w:lineRule="auto" w:before="0" w:after="100"/>
+        <w:spacing w:line="360" w:lineRule="auto" w:before="0" w:after="100"/>
       </w:pPr>
       <w:r>
         <w:rPr>
@@ -2500,7 +2500,7 @@
     <w:p>
       <w:pPr>
         <w:keepNext w:val="0"/>
-        <w:spacing w:line="324" w:lineRule="auto" w:before="0" w:after="100"/>
+        <w:spacing w:line="360" w:lineRule="auto" w:before="0" w:after="100"/>
       </w:pPr>
       <w:r>
         <w:rPr>
@@ -2526,7 +2526,7 @@
       <w:pPr>
         <w:pStyle w:val="Heading2"/>
         <w:keepNext/>
-        <w:spacing w:line="276" w:lineRule="auto" w:before="200" w:after="100"/>
+        <w:spacing w:line="360" w:lineRule="auto" w:before="200" w:after="100"/>
       </w:pPr>
       <w:r>
         <w:rPr>
@@ -2542,7 +2542,7 @@
     <w:p>
       <w:pPr>
         <w:keepNext w:val="0"/>
-        <w:spacing w:line="324" w:lineRule="auto" w:before="0" w:after="100"/>
+        <w:spacing w:line="360" w:lineRule="auto" w:before="0" w:after="100"/>
       </w:pPr>
       <w:r>
         <w:rPr>
@@ -2559,7 +2559,7 @@
       <w:pPr>
         <w:pStyle w:val="Heading3"/>
         <w:keepNext/>
-        <w:spacing w:line="276" w:lineRule="auto" w:before="120" w:after="60"/>
+        <w:spacing w:line="360" w:lineRule="auto" w:before="120" w:after="60"/>
       </w:pPr>
       <w:r>
         <w:rPr>
@@ -2595,7 +2595,7 @@
     <w:p>
       <w:pPr>
         <w:keepNext w:val="0"/>
-        <w:spacing w:line="324" w:lineRule="auto" w:before="0" w:after="100"/>
+        <w:spacing w:line="360" w:lineRule="auto" w:before="0" w:after="100"/>
       </w:pPr>
       <w:r>
         <w:rPr>
@@ -2631,7 +2631,7 @@
     <w:p>
       <w:pPr>
         <w:keepNext w:val="0"/>
-        <w:spacing w:line="324" w:lineRule="auto" w:before="0" w:after="100"/>
+        <w:spacing w:line="360" w:lineRule="auto" w:before="0" w:after="100"/>
       </w:pPr>
       <w:r>
         <w:rPr>
@@ -2687,7 +2687,7 @@
     <w:p>
       <w:pPr>
         <w:keepNext w:val="0"/>
-        <w:spacing w:line="324" w:lineRule="auto" w:before="0" w:after="100"/>
+        <w:spacing w:line="360" w:lineRule="auto" w:before="0" w:after="100"/>
       </w:pPr>
       <w:r>
         <w:rPr>
@@ -2724,7 +2724,7 @@
       <w:pPr>
         <w:pStyle w:val="Heading3"/>
         <w:keepNext/>
-        <w:spacing w:line="276" w:lineRule="auto" w:before="120" w:after="60"/>
+        <w:spacing w:line="360" w:lineRule="auto" w:before="120" w:after="60"/>
       </w:pPr>
       <w:r>
         <w:rPr>
@@ -2740,7 +2740,7 @@
     <w:p>
       <w:pPr>
         <w:keepNext w:val="0"/>
-        <w:spacing w:line="324" w:lineRule="auto" w:before="0" w:after="100"/>
+        <w:spacing w:line="360" w:lineRule="auto" w:before="0" w:after="100"/>
       </w:pPr>
       <w:r>
         <w:rPr>
@@ -2776,7 +2776,7 @@
     <w:p>
       <w:pPr>
         <w:keepNext w:val="0"/>
-        <w:spacing w:line="324" w:lineRule="auto" w:before="0" w:after="100"/>
+        <w:spacing w:line="360" w:lineRule="auto" w:before="0" w:after="100"/>
       </w:pPr>
       <w:r>
         <w:rPr>
@@ -2813,7 +2813,7 @@
       <w:pPr>
         <w:pStyle w:val="Heading3"/>
         <w:keepNext/>
-        <w:spacing w:line="276" w:lineRule="auto" w:before="120" w:after="60"/>
+        <w:spacing w:line="360" w:lineRule="auto" w:before="120" w:after="60"/>
       </w:pPr>
       <w:r>
         <w:rPr>
@@ -2849,7 +2849,7 @@
     <w:p>
       <w:pPr>
         <w:keepNext w:val="0"/>
-        <w:spacing w:line="324" w:lineRule="auto" w:before="0" w:after="100"/>
+        <w:spacing w:line="360" w:lineRule="auto" w:before="0" w:after="100"/>
       </w:pPr>
       <w:r>
         <w:rPr>
@@ -2865,7 +2865,7 @@
     <w:p>
       <w:pPr>
         <w:keepNext w:val="0"/>
-        <w:spacing w:line="324" w:lineRule="auto" w:before="0" w:after="100"/>
+        <w:spacing w:line="360" w:lineRule="auto" w:before="0" w:after="100"/>
       </w:pPr>
       <w:r>
         <w:rPr>
@@ -2881,7 +2881,7 @@
     <w:p>
       <w:pPr>
         <w:keepNext w:val="0"/>
-        <w:spacing w:line="324" w:lineRule="auto" w:before="0" w:after="100"/>
+        <w:spacing w:line="360" w:lineRule="auto" w:before="0" w:after="100"/>
       </w:pPr>
       <w:r>
         <w:rPr>
@@ -2898,7 +2898,7 @@
       <w:pPr>
         <w:pStyle w:val="Heading3"/>
         <w:keepNext/>
-        <w:spacing w:line="276" w:lineRule="auto" w:before="120" w:after="60"/>
+        <w:spacing w:line="360" w:lineRule="auto" w:before="120" w:after="60"/>
       </w:pPr>
       <w:r>
         <w:rPr>
@@ -2914,7 +2914,7 @@
     <w:p>
       <w:pPr>
         <w:keepNext w:val="0"/>
-        <w:spacing w:line="324" w:lineRule="auto" w:before="0" w:after="100"/>
+        <w:spacing w:line="360" w:lineRule="auto" w:before="0" w:after="100"/>
       </w:pPr>
       <w:r>
         <w:rPr>
@@ -2930,7 +2930,7 @@
     <w:p>
       <w:pPr>
         <w:keepNext w:val="0"/>
-        <w:spacing w:line="324" w:lineRule="auto" w:before="0" w:after="100"/>
+        <w:spacing w:line="360" w:lineRule="auto" w:before="0" w:after="100"/>
       </w:pPr>
       <w:r>
         <w:rPr>
@@ -2947,7 +2947,7 @@
       <w:pPr>
         <w:pStyle w:val="Heading3"/>
         <w:keepNext/>
-        <w:spacing w:line="276" w:lineRule="auto" w:before="120" w:after="60"/>
+        <w:spacing w:line="360" w:lineRule="auto" w:before="120" w:after="60"/>
       </w:pPr>
       <w:r>
         <w:rPr>
@@ -2983,7 +2983,7 @@
     <w:p>
       <w:pPr>
         <w:keepNext w:val="0"/>
-        <w:spacing w:line="324" w:lineRule="auto" w:before="0" w:after="100"/>
+        <w:spacing w:line="360" w:lineRule="auto" w:before="0" w:after="100"/>
       </w:pPr>
       <w:r>
         <w:rPr>
@@ -3019,7 +3019,7 @@
     <w:p>
       <w:pPr>
         <w:keepNext w:val="0"/>
-        <w:spacing w:line="324" w:lineRule="auto" w:before="0" w:after="100"/>
+        <w:spacing w:line="360" w:lineRule="auto" w:before="0" w:after="100"/>
       </w:pPr>
       <w:r>
         <w:rPr>
@@ -3096,7 +3096,7 @@
       <w:pPr>
         <w:pStyle w:val="Heading3"/>
         <w:keepNext/>
-        <w:spacing w:line="276" w:lineRule="auto" w:before="120" w:after="60"/>
+        <w:spacing w:line="360" w:lineRule="auto" w:before="120" w:after="60"/>
       </w:pPr>
       <w:r>
         <w:rPr>
@@ -3112,7 +3112,7 @@
     <w:p>
       <w:pPr>
         <w:keepNext w:val="0"/>
-        <w:spacing w:line="324" w:lineRule="auto" w:before="0" w:after="100"/>
+        <w:spacing w:line="360" w:lineRule="auto" w:before="0" w:after="100"/>
       </w:pPr>
       <w:r>
         <w:rPr>
@@ -3188,7 +3188,7 @@
     <w:p>
       <w:pPr>
         <w:keepNext w:val="0"/>
-        <w:spacing w:line="324" w:lineRule="auto" w:before="0" w:after="100"/>
+        <w:spacing w:line="360" w:lineRule="auto" w:before="0" w:after="100"/>
       </w:pPr>
       <w:r>
         <w:rPr>
@@ -3204,7 +3204,7 @@
     <w:p>
       <w:pPr>
         <w:keepNext w:val="0"/>
-        <w:spacing w:line="324" w:lineRule="auto" w:before="0" w:after="100"/>
+        <w:spacing w:line="360" w:lineRule="auto" w:before="0" w:after="100"/>
       </w:pPr>
       <w:r>
         <w:rPr>
@@ -3241,7 +3241,7 @@
       <w:pPr>
         <w:pStyle w:val="Heading3"/>
         <w:keepNext/>
-        <w:spacing w:line="276" w:lineRule="auto" w:before="120" w:after="60"/>
+        <w:spacing w:line="360" w:lineRule="auto" w:before="120" w:after="60"/>
       </w:pPr>
       <w:r>
         <w:rPr>
@@ -3257,7 +3257,7 @@
     <w:p>
       <w:pPr>
         <w:keepNext w:val="0"/>
-        <w:spacing w:line="324" w:lineRule="auto" w:before="0" w:after="100"/>
+        <w:spacing w:line="360" w:lineRule="auto" w:before="0" w:after="100"/>
       </w:pPr>
       <w:r>
         <w:rPr>
@@ -3313,7 +3313,7 @@
     <w:p>
       <w:pPr>
         <w:keepNext w:val="0"/>
-        <w:spacing w:line="324" w:lineRule="auto" w:before="0" w:after="100"/>
+        <w:spacing w:line="360" w:lineRule="auto" w:before="0" w:after="100"/>
       </w:pPr>
       <w:r>
         <w:rPr>
@@ -3328,9 +3328,12 @@
     </w:p>
     <w:p>
       <w:pPr>
-        <w:pStyle w:val="ListNumber"/>
         <w:keepNext w:val="0"/>
-        <w:spacing w:line="312" w:lineRule="auto" w:before="0" w:after="60"/>
+        <w:numPr>
+          <w:ilvl w:val="0"/>
+          <w:numId w:val="10"/>
+        </w:numPr>
+        <w:spacing w:line="360" w:lineRule="auto" w:before="0" w:after="60"/>
       </w:pPr>
       <w:r>
         <w:rPr>
@@ -3375,9 +3378,12 @@
     </w:p>
     <w:p>
       <w:pPr>
-        <w:pStyle w:val="ListNumber"/>
         <w:keepNext w:val="0"/>
-        <w:spacing w:line="312" w:lineRule="auto" w:before="0" w:after="60"/>
+        <w:numPr>
+          <w:ilvl w:val="0"/>
+          <w:numId w:val="10"/>
+        </w:numPr>
+        <w:spacing w:line="360" w:lineRule="auto" w:before="0" w:after="60"/>
       </w:pPr>
       <w:r>
         <w:rPr>
@@ -3402,9 +3408,12 @@
     </w:p>
     <w:p>
       <w:pPr>
-        <w:pStyle w:val="ListNumber"/>
         <w:keepNext w:val="0"/>
-        <w:spacing w:line="312" w:lineRule="auto" w:before="0" w:after="60"/>
+        <w:numPr>
+          <w:ilvl w:val="0"/>
+          <w:numId w:val="10"/>
+        </w:numPr>
+        <w:spacing w:line="360" w:lineRule="auto" w:before="0" w:after="60"/>
       </w:pPr>
       <w:r>
         <w:rPr>
@@ -3429,9 +3438,12 @@
     </w:p>
     <w:p>
       <w:pPr>
-        <w:pStyle w:val="ListNumber"/>
         <w:keepNext w:val="0"/>
-        <w:spacing w:line="312" w:lineRule="auto" w:before="0" w:after="60"/>
+        <w:numPr>
+          <w:ilvl w:val="0"/>
+          <w:numId w:val="10"/>
+        </w:numPr>
+        <w:spacing w:line="360" w:lineRule="auto" w:before="0" w:after="60"/>
       </w:pPr>
       <w:r>
         <w:rPr>
@@ -3456,9 +3468,12 @@
     </w:p>
     <w:p>
       <w:pPr>
-        <w:pStyle w:val="ListNumber"/>
         <w:keepNext w:val="0"/>
-        <w:spacing w:line="312" w:lineRule="auto" w:before="0" w:after="60"/>
+        <w:numPr>
+          <w:ilvl w:val="0"/>
+          <w:numId w:val="10"/>
+        </w:numPr>
+        <w:spacing w:line="360" w:lineRule="auto" w:before="0" w:after="60"/>
       </w:pPr>
       <w:r>
         <w:rPr>
@@ -3483,9 +3498,12 @@
     </w:p>
     <w:p>
       <w:pPr>
-        <w:pStyle w:val="ListNumber"/>
         <w:keepNext w:val="0"/>
-        <w:spacing w:line="312" w:lineRule="auto" w:before="0" w:after="60"/>
+        <w:numPr>
+          <w:ilvl w:val="0"/>
+          <w:numId w:val="10"/>
+        </w:numPr>
+        <w:spacing w:line="360" w:lineRule="auto" w:before="0" w:after="60"/>
       </w:pPr>
       <w:r>
         <w:rPr>
@@ -3510,9 +3528,12 @@
     </w:p>
     <w:p>
       <w:pPr>
-        <w:pStyle w:val="ListNumber"/>
         <w:keepNext w:val="0"/>
-        <w:spacing w:line="312" w:lineRule="auto" w:before="0" w:after="60"/>
+        <w:numPr>
+          <w:ilvl w:val="0"/>
+          <w:numId w:val="10"/>
+        </w:numPr>
+        <w:spacing w:line="360" w:lineRule="auto" w:before="0" w:after="60"/>
       </w:pPr>
       <w:r>
         <w:rPr>
@@ -4286,7 +4307,7 @@
     <w:p>
       <w:pPr>
         <w:keepNext/>
-        <w:spacing w:line="276" w:lineRule="auto" w:before="40" w:after="100"/>
+        <w:spacing w:line="360" w:lineRule="auto" w:before="40" w:after="100"/>
         <w:pBdr>
           <w:bottom w:val="single" w:sz="8" w:space="4" w:color="D9E2F3"/>
         </w:pBdr>
@@ -4305,7 +4326,7 @@
     <w:p>
       <w:pPr>
         <w:keepNext w:val="0"/>
-        <w:spacing w:line="324" w:lineRule="auto" w:before="0" w:after="100"/>
+        <w:spacing w:line="360" w:lineRule="auto" w:before="0" w:after="100"/>
       </w:pPr>
       <w:r>
         <w:rPr>
@@ -4331,7 +4352,7 @@
       <w:pPr>
         <w:pStyle w:val="Heading2"/>
         <w:keepNext/>
-        <w:spacing w:line="276" w:lineRule="auto" w:before="200" w:after="100"/>
+        <w:spacing w:line="360" w:lineRule="auto" w:before="200" w:after="100"/>
       </w:pPr>
       <w:r>
         <w:rPr>
@@ -4347,7 +4368,7 @@
     <w:p>
       <w:pPr>
         <w:keepNext w:val="0"/>
-        <w:spacing w:line="324" w:lineRule="auto" w:before="0" w:after="100"/>
+        <w:spacing w:line="360" w:lineRule="auto" w:before="0" w:after="100"/>
       </w:pPr>
       <w:r>
         <w:rPr>
@@ -4363,7 +4384,7 @@
     <w:p>
       <w:pPr>
         <w:keepNext w:val="0"/>
-        <w:spacing w:line="324" w:lineRule="auto" w:before="0" w:after="100"/>
+        <w:spacing w:line="360" w:lineRule="auto" w:before="0" w:after="100"/>
       </w:pPr>
       <w:r>
         <w:rPr>
@@ -4380,7 +4401,7 @@
       <w:pPr>
         <w:pStyle w:val="ListBullet"/>
         <w:keepNext w:val="0"/>
-        <w:spacing w:line="312" w:lineRule="auto" w:before="0" w:after="60"/>
+        <w:spacing w:line="360" w:lineRule="auto" w:before="0" w:after="60"/>
       </w:pPr>
       <w:r>
         <w:rPr>
@@ -4417,7 +4438,7 @@
       <w:pPr>
         <w:pStyle w:val="ListBullet"/>
         <w:keepNext w:val="0"/>
-        <w:spacing w:line="312" w:lineRule="auto" w:before="0" w:after="60"/>
+        <w:spacing w:line="360" w:lineRule="auto" w:before="0" w:after="60"/>
       </w:pPr>
       <w:r>
         <w:rPr>
@@ -4434,7 +4455,7 @@
       <w:pPr>
         <w:pStyle w:val="ListBullet"/>
         <w:keepNext w:val="0"/>
-        <w:spacing w:line="312" w:lineRule="auto" w:before="0" w:after="60"/>
+        <w:spacing w:line="360" w:lineRule="auto" w:before="0" w:after="60"/>
       </w:pPr>
       <w:r>
         <w:rPr>
@@ -4451,7 +4472,7 @@
       <w:pPr>
         <w:pStyle w:val="ListBullet"/>
         <w:keepNext w:val="0"/>
-        <w:spacing w:line="312" w:lineRule="auto" w:before="0" w:after="60"/>
+        <w:spacing w:line="360" w:lineRule="auto" w:before="0" w:after="60"/>
       </w:pPr>
       <w:r>
         <w:rPr>
@@ -4488,7 +4509,7 @@
       <w:pPr>
         <w:pStyle w:val="ListBullet"/>
         <w:keepNext w:val="0"/>
-        <w:spacing w:line="312" w:lineRule="auto" w:before="0" w:after="60"/>
+        <w:spacing w:line="360" w:lineRule="auto" w:before="0" w:after="60"/>
       </w:pPr>
       <w:r>
         <w:rPr>
@@ -4505,7 +4526,7 @@
       <w:pPr>
         <w:pStyle w:val="ListBullet"/>
         <w:keepNext w:val="0"/>
-        <w:spacing w:line="312" w:lineRule="auto" w:before="0" w:after="60"/>
+        <w:spacing w:line="360" w:lineRule="auto" w:before="0" w:after="60"/>
       </w:pPr>
       <w:r>
         <w:rPr>
@@ -4522,7 +4543,7 @@
       <w:pPr>
         <w:pStyle w:val="ListBullet"/>
         <w:keepNext w:val="0"/>
-        <w:spacing w:line="312" w:lineRule="auto" w:before="0" w:after="60"/>
+        <w:spacing w:line="360" w:lineRule="auto" w:before="0" w:after="60"/>
       </w:pPr>
       <w:r>
         <w:rPr>
@@ -4539,7 +4560,7 @@
       <w:pPr>
         <w:pStyle w:val="ListBullet"/>
         <w:keepNext w:val="0"/>
-        <w:spacing w:line="312" w:lineRule="auto" w:before="0" w:after="60"/>
+        <w:spacing w:line="360" w:lineRule="auto" w:before="0" w:after="60"/>
       </w:pPr>
       <w:r>
         <w:rPr>
@@ -4555,7 +4576,7 @@
     <w:p>
       <w:pPr>
         <w:keepNext w:val="0"/>
-        <w:spacing w:line="324" w:lineRule="auto" w:before="0" w:after="100"/>
+        <w:spacing w:line="360" w:lineRule="auto" w:before="0" w:after="100"/>
       </w:pPr>
       <w:r>
         <w:rPr>
@@ -4572,7 +4593,7 @@
       <w:pPr>
         <w:pStyle w:val="Heading3"/>
         <w:keepNext/>
-        <w:spacing w:line="276" w:lineRule="auto" w:before="120" w:after="60"/>
+        <w:spacing w:line="360" w:lineRule="auto" w:before="120" w:after="60"/>
       </w:pPr>
       <w:r>
         <w:rPr>
@@ -4588,7 +4609,7 @@
     <w:p>
       <w:pPr>
         <w:keepNext w:val="0"/>
-        <w:spacing w:line="324" w:lineRule="auto" w:before="0" w:after="100"/>
+        <w:spacing w:line="360" w:lineRule="auto" w:before="0" w:after="100"/>
       </w:pPr>
       <w:r>
         <w:rPr>
@@ -4604,7 +4625,7 @@
     <w:p>
       <w:pPr>
         <w:keepNext w:val="0"/>
-        <w:spacing w:line="324" w:lineRule="auto" w:before="0" w:after="100"/>
+        <w:spacing w:line="360" w:lineRule="auto" w:before="0" w:after="100"/>
       </w:pPr>
       <w:r>
         <w:rPr>
@@ -4630,7 +4651,7 @@
       <w:pPr>
         <w:pStyle w:val="Heading2"/>
         <w:keepNext/>
-        <w:spacing w:line="276" w:lineRule="auto" w:before="200" w:after="100"/>
+        <w:spacing w:line="360" w:lineRule="auto" w:before="200" w:after="100"/>
       </w:pPr>
       <w:r>
         <w:rPr>
@@ -4646,7 +4667,7 @@
     <w:p>
       <w:pPr>
         <w:keepNext w:val="0"/>
-        <w:spacing w:line="324" w:lineRule="auto" w:before="0" w:after="100"/>
+        <w:spacing w:line="360" w:lineRule="auto" w:before="0" w:after="100"/>
       </w:pPr>
       <w:r>
         <w:rPr>
@@ -4662,7 +4683,7 @@
     <w:p>
       <w:pPr>
         <w:keepNext w:val="0"/>
-        <w:spacing w:line="324" w:lineRule="auto" w:before="0" w:after="100"/>
+        <w:spacing w:line="360" w:lineRule="auto" w:before="0" w:after="100"/>
       </w:pPr>
       <w:r>
         <w:rPr>
@@ -4677,9 +4698,12 @@
     </w:p>
     <w:p>
       <w:pPr>
-        <w:pStyle w:val="ListNumber"/>
         <w:keepNext w:val="0"/>
-        <w:spacing w:line="312" w:lineRule="auto" w:before="0" w:after="60"/>
+        <w:numPr>
+          <w:ilvl w:val="0"/>
+          <w:numId w:val="11"/>
+        </w:numPr>
+        <w:spacing w:line="360" w:lineRule="auto" w:before="0" w:after="60"/>
       </w:pPr>
       <w:r>
         <w:rPr>
@@ -4704,9 +4728,12 @@
     </w:p>
     <w:p>
       <w:pPr>
-        <w:pStyle w:val="ListNumber"/>
         <w:keepNext w:val="0"/>
-        <w:spacing w:line="312" w:lineRule="auto" w:before="0" w:after="60"/>
+        <w:numPr>
+          <w:ilvl w:val="0"/>
+          <w:numId w:val="11"/>
+        </w:numPr>
+        <w:spacing w:line="360" w:lineRule="auto" w:before="0" w:after="60"/>
       </w:pPr>
       <w:r>
         <w:rPr>
@@ -4731,9 +4758,12 @@
     </w:p>
     <w:p>
       <w:pPr>
-        <w:pStyle w:val="ListNumber"/>
         <w:keepNext w:val="0"/>
-        <w:spacing w:line="312" w:lineRule="auto" w:before="0" w:after="60"/>
+        <w:numPr>
+          <w:ilvl w:val="0"/>
+          <w:numId w:val="11"/>
+        </w:numPr>
+        <w:spacing w:line="360" w:lineRule="auto" w:before="0" w:after="60"/>
       </w:pPr>
       <w:r>
         <w:rPr>
@@ -4758,9 +4788,12 @@
     </w:p>
     <w:p>
       <w:pPr>
-        <w:pStyle w:val="ListNumber"/>
         <w:keepNext w:val="0"/>
-        <w:spacing w:line="312" w:lineRule="auto" w:before="0" w:after="60"/>
+        <w:numPr>
+          <w:ilvl w:val="0"/>
+          <w:numId w:val="11"/>
+        </w:numPr>
+        <w:spacing w:line="360" w:lineRule="auto" w:before="0" w:after="60"/>
       </w:pPr>
       <w:r>
         <w:rPr>
@@ -4785,9 +4818,12 @@
     </w:p>
     <w:p>
       <w:pPr>
-        <w:pStyle w:val="ListNumber"/>
         <w:keepNext w:val="0"/>
-        <w:spacing w:line="312" w:lineRule="auto" w:before="0" w:after="60"/>
+        <w:numPr>
+          <w:ilvl w:val="0"/>
+          <w:numId w:val="11"/>
+        </w:numPr>
+        <w:spacing w:line="360" w:lineRule="auto" w:before="0" w:after="60"/>
       </w:pPr>
       <w:r>
         <w:rPr>
@@ -4812,9 +4848,12 @@
     </w:p>
     <w:p>
       <w:pPr>
-        <w:pStyle w:val="ListNumber"/>
         <w:keepNext w:val="0"/>
-        <w:spacing w:line="312" w:lineRule="auto" w:before="0" w:after="60"/>
+        <w:numPr>
+          <w:ilvl w:val="0"/>
+          <w:numId w:val="11"/>
+        </w:numPr>
+        <w:spacing w:line="360" w:lineRule="auto" w:before="0" w:after="60"/>
       </w:pPr>
       <w:r>
         <w:rPr>
@@ -4839,9 +4878,12 @@
     </w:p>
     <w:p>
       <w:pPr>
-        <w:pStyle w:val="ListNumber"/>
         <w:keepNext w:val="0"/>
-        <w:spacing w:line="312" w:lineRule="auto" w:before="0" w:after="60"/>
+        <w:numPr>
+          <w:ilvl w:val="0"/>
+          <w:numId w:val="11"/>
+        </w:numPr>
+        <w:spacing w:line="360" w:lineRule="auto" w:before="0" w:after="60"/>
       </w:pPr>
       <w:r>
         <w:rPr>
@@ -4866,9 +4908,12 @@
     </w:p>
     <w:p>
       <w:pPr>
-        <w:pStyle w:val="ListNumber"/>
         <w:keepNext w:val="0"/>
-        <w:spacing w:line="312" w:lineRule="auto" w:before="0" w:after="60"/>
+        <w:numPr>
+          <w:ilvl w:val="0"/>
+          <w:numId w:val="11"/>
+        </w:numPr>
+        <w:spacing w:line="360" w:lineRule="auto" w:before="0" w:after="60"/>
       </w:pPr>
       <w:r>
         <w:rPr>
@@ -4894,7 +4939,7 @@
     <w:p>
       <w:pPr>
         <w:keepNext w:val="0"/>
-        <w:spacing w:line="324" w:lineRule="auto" w:before="0" w:after="100"/>
+        <w:spacing w:line="360" w:lineRule="auto" w:before="0" w:after="100"/>
       </w:pPr>
       <w:r>
         <w:rPr>
@@ -4951,7 +4996,7 @@
       <w:pPr>
         <w:pStyle w:val="Heading3"/>
         <w:keepNext/>
-        <w:spacing w:line="276" w:lineRule="auto" w:before="120" w:after="60"/>
+        <w:spacing w:line="360" w:lineRule="auto" w:before="120" w:after="60"/>
       </w:pPr>
       <w:r>
         <w:rPr>
@@ -4967,7 +5012,7 @@
     <w:p>
       <w:pPr>
         <w:keepNext w:val="0"/>
-        <w:spacing w:line="324" w:lineRule="auto" w:before="0" w:after="100"/>
+        <w:spacing w:line="360" w:lineRule="auto" w:before="0" w:after="100"/>
       </w:pPr>
       <w:r>
         <w:rPr>
@@ -5024,7 +5069,7 @@
       <w:pPr>
         <w:pStyle w:val="Heading3"/>
         <w:keepNext/>
-        <w:spacing w:line="276" w:lineRule="auto" w:before="120" w:after="60"/>
+        <w:spacing w:line="360" w:lineRule="auto" w:before="120" w:after="60"/>
       </w:pPr>
       <w:r>
         <w:rPr>
@@ -5039,9 +5084,12 @@
     </w:p>
     <w:p>
       <w:pPr>
-        <w:pStyle w:val="ListNumber"/>
         <w:keepNext w:val="0"/>
-        <w:spacing w:line="312" w:lineRule="auto" w:before="0" w:after="60"/>
+        <w:numPr>
+          <w:ilvl w:val="0"/>
+          <w:numId w:val="12"/>
+        </w:numPr>
+        <w:spacing w:line="360" w:lineRule="auto" w:before="0" w:after="60"/>
       </w:pPr>
       <w:r>
         <w:rPr>
@@ -5096,9 +5144,12 @@
     </w:p>
     <w:p>
       <w:pPr>
-        <w:pStyle w:val="ListNumber"/>
         <w:keepNext w:val="0"/>
-        <w:spacing w:line="312" w:lineRule="auto" w:before="0" w:after="60"/>
+        <w:numPr>
+          <w:ilvl w:val="0"/>
+          <w:numId w:val="12"/>
+        </w:numPr>
+        <w:spacing w:line="360" w:lineRule="auto" w:before="0" w:after="60"/>
       </w:pPr>
       <w:r>
         <w:rPr>
@@ -5113,9 +5164,12 @@
     </w:p>
     <w:p>
       <w:pPr>
-        <w:pStyle w:val="ListNumber"/>
         <w:keepNext w:val="0"/>
-        <w:spacing w:line="312" w:lineRule="auto" w:before="0" w:after="60"/>
+        <w:numPr>
+          <w:ilvl w:val="0"/>
+          <w:numId w:val="12"/>
+        </w:numPr>
+        <w:spacing w:line="360" w:lineRule="auto" w:before="0" w:after="60"/>
       </w:pPr>
       <w:r>
         <w:rPr>
@@ -5130,9 +5184,12 @@
     </w:p>
     <w:p>
       <w:pPr>
-        <w:pStyle w:val="ListNumber"/>
         <w:keepNext w:val="0"/>
-        <w:spacing w:line="312" w:lineRule="auto" w:before="0" w:after="60"/>
+        <w:numPr>
+          <w:ilvl w:val="0"/>
+          <w:numId w:val="12"/>
+        </w:numPr>
+        <w:spacing w:line="360" w:lineRule="auto" w:before="0" w:after="60"/>
       </w:pPr>
       <w:r>
         <w:rPr>
@@ -5167,9 +5224,12 @@
     </w:p>
     <w:p>
       <w:pPr>
-        <w:pStyle w:val="ListNumber"/>
         <w:keepNext w:val="0"/>
-        <w:spacing w:line="312" w:lineRule="auto" w:before="0" w:after="60"/>
+        <w:numPr>
+          <w:ilvl w:val="0"/>
+          <w:numId w:val="12"/>
+        </w:numPr>
+        <w:spacing w:line="360" w:lineRule="auto" w:before="0" w:after="60"/>
       </w:pPr>
       <w:r>
         <w:rPr>
@@ -5184,9 +5244,12 @@
     </w:p>
     <w:p>
       <w:pPr>
-        <w:pStyle w:val="ListNumber"/>
         <w:keepNext w:val="0"/>
-        <w:spacing w:line="312" w:lineRule="auto" w:before="0" w:after="60"/>
+        <w:numPr>
+          <w:ilvl w:val="0"/>
+          <w:numId w:val="12"/>
+        </w:numPr>
+        <w:spacing w:line="360" w:lineRule="auto" w:before="0" w:after="60"/>
       </w:pPr>
       <w:r>
         <w:rPr>
@@ -5201,9 +5264,12 @@
     </w:p>
     <w:p>
       <w:pPr>
-        <w:pStyle w:val="ListNumber"/>
         <w:keepNext w:val="0"/>
-        <w:spacing w:line="312" w:lineRule="auto" w:before="0" w:after="60"/>
+        <w:numPr>
+          <w:ilvl w:val="0"/>
+          <w:numId w:val="12"/>
+        </w:numPr>
+        <w:spacing w:line="360" w:lineRule="auto" w:before="0" w:after="60"/>
       </w:pPr>
       <w:r>
         <w:rPr>
@@ -5218,9 +5284,12 @@
     </w:p>
     <w:p>
       <w:pPr>
-        <w:pStyle w:val="ListNumber"/>
         <w:keepNext w:val="0"/>
-        <w:spacing w:line="312" w:lineRule="auto" w:before="0" w:after="60"/>
+        <w:numPr>
+          <w:ilvl w:val="0"/>
+          <w:numId w:val="12"/>
+        </w:numPr>
+        <w:spacing w:line="360" w:lineRule="auto" w:before="0" w:after="60"/>
       </w:pPr>
       <w:r>
         <w:rPr>
@@ -5237,7 +5306,7 @@
       <w:pPr>
         <w:pStyle w:val="Heading3"/>
         <w:keepNext/>
-        <w:spacing w:line="276" w:lineRule="auto" w:before="120" w:after="60"/>
+        <w:spacing w:line="360" w:lineRule="auto" w:before="120" w:after="60"/>
       </w:pPr>
       <w:r>
         <w:rPr>
@@ -5253,7 +5322,7 @@
     <w:p>
       <w:pPr>
         <w:keepNext w:val="0"/>
-        <w:spacing w:line="324" w:lineRule="auto" w:before="0" w:after="100"/>
+        <w:spacing w:line="360" w:lineRule="auto" w:before="0" w:after="100"/>
       </w:pPr>
       <w:r>
         <w:rPr>
@@ -5270,7 +5339,7 @@
       <w:pPr>
         <w:pStyle w:val="Heading4"/>
         <w:keepNext/>
-        <w:spacing w:line="276" w:lineRule="auto" w:before="120" w:after="60"/>
+        <w:spacing w:line="360" w:lineRule="auto" w:before="120" w:after="60"/>
       </w:pPr>
       <w:r>
         <w:rPr>
@@ -5287,7 +5356,7 @@
       <w:pPr>
         <w:pStyle w:val="ListBullet"/>
         <w:keepNext w:val="0"/>
-        <w:spacing w:line="312" w:lineRule="auto" w:before="0" w:after="60"/>
+        <w:spacing w:line="360" w:lineRule="auto" w:before="0" w:after="60"/>
       </w:pPr>
       <w:r>
         <w:rPr>
@@ -5324,7 +5393,7 @@
       <w:pPr>
         <w:pStyle w:val="ListBullet"/>
         <w:keepNext w:val="0"/>
-        <w:spacing w:line="312" w:lineRule="auto" w:before="0" w:after="60"/>
+        <w:spacing w:line="360" w:lineRule="auto" w:before="0" w:after="60"/>
       </w:pPr>
       <w:r>
         <w:rPr>
@@ -5341,7 +5410,7 @@
       <w:pPr>
         <w:pStyle w:val="ListBullet"/>
         <w:keepNext w:val="0"/>
-        <w:spacing w:line="312" w:lineRule="auto" w:before="0" w:after="60"/>
+        <w:spacing w:line="360" w:lineRule="auto" w:before="0" w:after="60"/>
       </w:pPr>
       <w:r>
         <w:rPr>
@@ -5358,7 +5427,7 @@
       <w:pPr>
         <w:pStyle w:val="ListBullet"/>
         <w:keepNext w:val="0"/>
-        <w:spacing w:line="312" w:lineRule="auto" w:before="0" w:after="60"/>
+        <w:spacing w:line="360" w:lineRule="auto" w:before="0" w:after="60"/>
       </w:pPr>
       <w:r>
         <w:rPr>
@@ -5375,7 +5444,7 @@
       <w:pPr>
         <w:pStyle w:val="ListBullet"/>
         <w:keepNext w:val="0"/>
-        <w:spacing w:line="312" w:lineRule="auto" w:before="0" w:after="60"/>
+        <w:spacing w:line="360" w:lineRule="auto" w:before="0" w:after="60"/>
       </w:pPr>
       <w:r>
         <w:rPr>
@@ -5402,7 +5471,7 @@
       <w:pPr>
         <w:pStyle w:val="ListBullet"/>
         <w:keepNext w:val="0"/>
-        <w:spacing w:line="312" w:lineRule="auto" w:before="0" w:after="60"/>
+        <w:spacing w:line="360" w:lineRule="auto" w:before="0" w:after="60"/>
       </w:pPr>
       <w:r>
         <w:rPr>
@@ -5419,7 +5488,7 @@
       <w:pPr>
         <w:pStyle w:val="ListBullet"/>
         <w:keepNext w:val="0"/>
-        <w:spacing w:line="312" w:lineRule="auto" w:before="0" w:after="60"/>
+        <w:spacing w:line="360" w:lineRule="auto" w:before="0" w:after="60"/>
       </w:pPr>
       <w:r>
         <w:rPr>
@@ -5436,7 +5505,7 @@
       <w:pPr>
         <w:pStyle w:val="ListBullet"/>
         <w:keepNext w:val="0"/>
-        <w:spacing w:line="312" w:lineRule="auto" w:before="0" w:after="60"/>
+        <w:spacing w:line="360" w:lineRule="auto" w:before="0" w:after="60"/>
       </w:pPr>
       <w:r>
         <w:rPr>
@@ -5453,7 +5522,7 @@
       <w:pPr>
         <w:pStyle w:val="ListBullet"/>
         <w:keepNext w:val="0"/>
-        <w:spacing w:line="312" w:lineRule="auto" w:before="0" w:after="60"/>
+        <w:spacing w:line="360" w:lineRule="auto" w:before="0" w:after="60"/>
       </w:pPr>
       <w:r>
         <w:rPr>
@@ -5470,7 +5539,7 @@
       <w:pPr>
         <w:pStyle w:val="Heading4"/>
         <w:keepNext/>
-        <w:spacing w:line="276" w:lineRule="auto" w:before="120" w:after="60"/>
+        <w:spacing w:line="360" w:lineRule="auto" w:before="120" w:after="60"/>
       </w:pPr>
       <w:r>
         <w:rPr>
@@ -5487,7 +5556,7 @@
       <w:pPr>
         <w:pStyle w:val="ListBullet"/>
         <w:keepNext w:val="0"/>
-        <w:spacing w:line="312" w:lineRule="auto" w:before="0" w:after="60"/>
+        <w:spacing w:line="360" w:lineRule="auto" w:before="0" w:after="60"/>
       </w:pPr>
       <w:r>
         <w:rPr>
@@ -5504,7 +5573,7 @@
       <w:pPr>
         <w:pStyle w:val="ListBullet"/>
         <w:keepNext w:val="0"/>
-        <w:spacing w:line="312" w:lineRule="auto" w:before="0" w:after="60"/>
+        <w:spacing w:line="360" w:lineRule="auto" w:before="0" w:after="60"/>
       </w:pPr>
       <w:r>
         <w:rPr>
@@ -5521,7 +5590,7 @@
       <w:pPr>
         <w:pStyle w:val="ListBullet"/>
         <w:keepNext w:val="0"/>
-        <w:spacing w:line="312" w:lineRule="auto" w:before="0" w:after="60"/>
+        <w:spacing w:line="360" w:lineRule="auto" w:before="0" w:after="60"/>
       </w:pPr>
       <w:r>
         <w:rPr>
@@ -5538,7 +5607,7 @@
       <w:pPr>
         <w:pStyle w:val="ListBullet"/>
         <w:keepNext w:val="0"/>
-        <w:spacing w:line="312" w:lineRule="auto" w:before="0" w:after="60"/>
+        <w:spacing w:line="360" w:lineRule="auto" w:before="0" w:after="60"/>
       </w:pPr>
       <w:r>
         <w:rPr>
@@ -5555,7 +5624,7 @@
       <w:pPr>
         <w:pStyle w:val="ListBullet"/>
         <w:keepNext w:val="0"/>
-        <w:spacing w:line="312" w:lineRule="auto" w:before="0" w:after="60"/>
+        <w:spacing w:line="360" w:lineRule="auto" w:before="0" w:after="60"/>
       </w:pPr>
       <w:r>
         <w:rPr>
@@ -5572,7 +5641,7 @@
       <w:pPr>
         <w:pStyle w:val="ListBullet"/>
         <w:keepNext w:val="0"/>
-        <w:spacing w:line="312" w:lineRule="auto" w:before="0" w:after="60"/>
+        <w:spacing w:line="360" w:lineRule="auto" w:before="0" w:after="60"/>
       </w:pPr>
       <w:r>
         <w:rPr>
@@ -5589,7 +5658,7 @@
       <w:pPr>
         <w:pStyle w:val="ListBullet"/>
         <w:keepNext w:val="0"/>
-        <w:spacing w:line="312" w:lineRule="auto" w:before="0" w:after="60"/>
+        <w:spacing w:line="360" w:lineRule="auto" w:before="0" w:after="60"/>
       </w:pPr>
       <w:r>
         <w:rPr>
@@ -5605,7 +5674,7 @@
     <w:p>
       <w:pPr>
         <w:keepNext w:val="0"/>
-        <w:spacing w:line="324" w:lineRule="auto" w:before="0" w:after="100"/>
+        <w:spacing w:line="360" w:lineRule="auto" w:before="0" w:after="100"/>
       </w:pPr>
       <w:r>
         <w:rPr>
@@ -5622,7 +5691,7 @@
       <w:pPr>
         <w:pStyle w:val="Heading3"/>
         <w:keepNext/>
-        <w:spacing w:line="276" w:lineRule="auto" w:before="120" w:after="60"/>
+        <w:spacing w:line="360" w:lineRule="auto" w:before="120" w:after="60"/>
       </w:pPr>
       <w:r>
         <w:rPr>
@@ -6498,7 +6567,7 @@
     <w:p>
       <w:pPr>
         <w:keepNext/>
-        <w:spacing w:line="276" w:lineRule="auto" w:before="40" w:after="100"/>
+        <w:spacing w:line="360" w:lineRule="auto" w:before="40" w:after="100"/>
         <w:pBdr>
           <w:bottom w:val="single" w:sz="8" w:space="4" w:color="D9E2F3"/>
         </w:pBdr>
@@ -6517,7 +6586,7 @@
     <w:p>
       <w:pPr>
         <w:keepNext w:val="0"/>
-        <w:spacing w:line="324" w:lineRule="auto" w:before="0" w:after="100"/>
+        <w:spacing w:line="360" w:lineRule="auto" w:before="0" w:after="100"/>
       </w:pPr>
       <w:r>
         <w:rPr>
@@ -6534,7 +6603,7 @@
       <w:pPr>
         <w:pStyle w:val="Heading3"/>
         <w:keepNext/>
-        <w:spacing w:line="276" w:lineRule="auto" w:before="120" w:after="60"/>
+        <w:spacing w:line="360" w:lineRule="auto" w:before="120" w:after="60"/>
       </w:pPr>
       <w:r>
         <w:rPr>
@@ -7535,7 +7604,7 @@
     <w:p>
       <w:pPr>
         <w:keepNext/>
-        <w:spacing w:line="276" w:lineRule="auto" w:before="40" w:after="100"/>
+        <w:spacing w:line="360" w:lineRule="auto" w:before="40" w:after="100"/>
         <w:pBdr>
           <w:bottom w:val="single" w:sz="8" w:space="4" w:color="D9E2F3"/>
         </w:pBdr>
@@ -7554,7 +7623,7 @@
     <w:p>
       <w:pPr>
         <w:keepNext w:val="0"/>
-        <w:spacing w:line="324" w:lineRule="auto" w:before="0" w:after="100"/>
+        <w:spacing w:line="360" w:lineRule="auto" w:before="0" w:after="100"/>
       </w:pPr>
       <w:r>
         <w:rPr>
@@ -7571,7 +7640,7 @@
       <w:pPr>
         <w:pStyle w:val="Heading3"/>
         <w:keepNext/>
-        <w:spacing w:line="276" w:lineRule="auto" w:before="120" w:after="60"/>
+        <w:spacing w:line="360" w:lineRule="auto" w:before="120" w:after="60"/>
       </w:pPr>
       <w:r>
         <w:rPr>
@@ -7587,7 +7656,7 @@
     <w:p>
       <w:pPr>
         <w:keepNext w:val="0"/>
-        <w:spacing w:line="324" w:lineRule="auto" w:before="0" w:after="100"/>
+        <w:spacing w:line="360" w:lineRule="auto" w:before="0" w:after="100"/>
       </w:pPr>
       <w:r>
         <w:rPr>
@@ -8950,7 +9019,7 @@
     <w:p>
       <w:pPr>
         <w:keepNext/>
-        <w:spacing w:line="276" w:lineRule="auto" w:before="40" w:after="100"/>
+        <w:spacing w:line="360" w:lineRule="auto" w:before="40" w:after="100"/>
         <w:pBdr>
           <w:bottom w:val="single" w:sz="8" w:space="4" w:color="D9E2F3"/>
         </w:pBdr>
@@ -8969,7 +9038,7 @@
     <w:p>
       <w:pPr>
         <w:keepNext w:val="0"/>
-        <w:spacing w:line="324" w:lineRule="auto" w:before="0" w:after="100"/>
+        <w:spacing w:line="360" w:lineRule="auto" w:before="0" w:after="100"/>
       </w:pPr>
       <w:r>
         <w:rPr>
@@ -8985,7 +9054,7 @@
     <w:p>
       <w:pPr>
         <w:keepNext w:val="0"/>
-        <w:spacing w:line="324" w:lineRule="auto" w:before="0" w:after="100"/>
+        <w:spacing w:line="360" w:lineRule="auto" w:before="0" w:after="100"/>
       </w:pPr>
       <w:r>
         <w:rPr>
@@ -9002,7 +9071,7 @@
       <w:pPr>
         <w:pStyle w:val="Heading3"/>
         <w:keepNext/>
-        <w:spacing w:line="276" w:lineRule="auto" w:before="120" w:after="60"/>
+        <w:spacing w:line="360" w:lineRule="auto" w:before="120" w:after="60"/>
       </w:pPr>
       <w:r>
         <w:rPr>
@@ -9018,7 +9087,7 @@
     <w:p>
       <w:pPr>
         <w:keepNext w:val="0"/>
-        <w:spacing w:line="324" w:lineRule="auto" w:before="0" w:after="100"/>
+        <w:spacing w:line="360" w:lineRule="auto" w:before="0" w:after="100"/>
       </w:pPr>
       <w:r>
         <w:rPr>
@@ -9035,7 +9104,7 @@
       <w:pPr>
         <w:pStyle w:val="Heading4"/>
         <w:keepNext/>
-        <w:spacing w:line="276" w:lineRule="auto" w:before="120" w:after="60"/>
+        <w:spacing w:line="360" w:lineRule="auto" w:before="120" w:after="60"/>
       </w:pPr>
       <w:r>
         <w:rPr>
@@ -9786,7 +9855,7 @@
     <w:p>
       <w:pPr>
         <w:keepNext/>
-        <w:spacing w:line="276" w:lineRule="auto" w:before="40" w:after="100"/>
+        <w:spacing w:line="360" w:lineRule="auto" w:before="40" w:after="100"/>
         <w:pBdr>
           <w:bottom w:val="single" w:sz="8" w:space="4" w:color="D9E2F3"/>
         </w:pBdr>
@@ -9805,7 +9874,7 @@
     <w:p>
       <w:pPr>
         <w:keepNext w:val="0"/>
-        <w:spacing w:line="324" w:lineRule="auto" w:before="0" w:after="100"/>
+        <w:spacing w:line="360" w:lineRule="auto" w:before="0" w:after="100"/>
       </w:pPr>
       <w:r>
         <w:rPr>
@@ -9822,7 +9891,7 @@
       <w:pPr>
         <w:pStyle w:val="Heading4"/>
         <w:keepNext/>
-        <w:spacing w:line="276" w:lineRule="auto" w:before="120" w:after="60"/>
+        <w:spacing w:line="360" w:lineRule="auto" w:before="120" w:after="60"/>
       </w:pPr>
       <w:r>
         <w:rPr>
@@ -10411,7 +10480,7 @@
     <w:p>
       <w:pPr>
         <w:keepNext/>
-        <w:spacing w:line="276" w:lineRule="auto" w:before="40" w:after="100"/>
+        <w:spacing w:line="360" w:lineRule="auto" w:before="40" w:after="100"/>
         <w:pBdr>
           <w:bottom w:val="single" w:sz="8" w:space="4" w:color="D9E2F3"/>
         </w:pBdr>
@@ -10430,7 +10499,7 @@
     <w:p>
       <w:pPr>
         <w:keepNext w:val="0"/>
-        <w:spacing w:line="324" w:lineRule="auto" w:before="0" w:after="100"/>
+        <w:spacing w:line="360" w:lineRule="auto" w:before="0" w:after="100"/>
       </w:pPr>
       <w:r>
         <w:rPr>
@@ -10447,7 +10516,7 @@
       <w:pPr>
         <w:pStyle w:val="Heading3"/>
         <w:keepNext/>
-        <w:spacing w:line="276" w:lineRule="auto" w:before="120" w:after="60"/>
+        <w:spacing w:line="360" w:lineRule="auto" w:before="120" w:after="60"/>
       </w:pPr>
       <w:r>
         <w:rPr>
@@ -10463,7 +10532,7 @@
     <w:p>
       <w:pPr>
         <w:keepNext w:val="0"/>
-        <w:spacing w:line="324" w:lineRule="auto" w:before="0" w:after="100"/>
+        <w:spacing w:line="360" w:lineRule="auto" w:before="0" w:after="100"/>
       </w:pPr>
       <w:r>
         <w:rPr>
@@ -10480,7 +10549,7 @@
       <w:pPr>
         <w:pStyle w:val="Heading4"/>
         <w:keepNext/>
-        <w:spacing w:line="276" w:lineRule="auto" w:before="120" w:after="60"/>
+        <w:spacing w:line="360" w:lineRule="auto" w:before="120" w:after="60"/>
       </w:pPr>
       <w:r>
         <w:rPr>
@@ -11425,7 +11494,7 @@
     <w:p>
       <w:pPr>
         <w:keepNext/>
-        <w:spacing w:line="276" w:lineRule="auto" w:before="40" w:after="100"/>
+        <w:spacing w:line="360" w:lineRule="auto" w:before="40" w:after="100"/>
         <w:pBdr>
           <w:bottom w:val="single" w:sz="8" w:space="4" w:color="D9E2F3"/>
         </w:pBdr>
@@ -11444,7 +11513,7 @@
     <w:p>
       <w:pPr>
         <w:keepNext w:val="0"/>
-        <w:spacing w:line="324" w:lineRule="auto" w:before="0" w:after="100"/>
+        <w:spacing w:line="360" w:lineRule="auto" w:before="0" w:after="100"/>
       </w:pPr>
       <w:r>
         <w:rPr>
@@ -11461,7 +11530,7 @@
       <w:pPr>
         <w:pStyle w:val="Heading4"/>
         <w:keepNext/>
-        <w:spacing w:line="276" w:lineRule="auto" w:before="120" w:after="60"/>
+        <w:spacing w:line="360" w:lineRule="auto" w:before="120" w:after="60"/>
       </w:pPr>
       <w:r>
         <w:rPr>
@@ -11478,7 +11547,7 @@
       <w:pPr>
         <w:pStyle w:val="ListBullet"/>
         <w:keepNext w:val="0"/>
-        <w:spacing w:line="312" w:lineRule="auto" w:before="0" w:after="60"/>
+        <w:spacing w:line="360" w:lineRule="auto" w:before="0" w:after="60"/>
       </w:pPr>
       <w:r>
         <w:rPr>
@@ -11495,7 +11564,7 @@
       <w:pPr>
         <w:pStyle w:val="ListBullet"/>
         <w:keepNext w:val="0"/>
-        <w:spacing w:line="312" w:lineRule="auto" w:before="0" w:after="60"/>
+        <w:spacing w:line="360" w:lineRule="auto" w:before="0" w:after="60"/>
       </w:pPr>
       <w:r>
         <w:rPr>
@@ -11512,7 +11581,7 @@
       <w:pPr>
         <w:pStyle w:val="ListBullet"/>
         <w:keepNext w:val="0"/>
-        <w:spacing w:line="312" w:lineRule="auto" w:before="0" w:after="60"/>
+        <w:spacing w:line="360" w:lineRule="auto" w:before="0" w:after="60"/>
       </w:pPr>
       <w:r>
         <w:rPr>
@@ -11529,7 +11598,7 @@
       <w:pPr>
         <w:pStyle w:val="ListBullet"/>
         <w:keepNext w:val="0"/>
-        <w:spacing w:line="312" w:lineRule="auto" w:before="0" w:after="60"/>
+        <w:spacing w:line="360" w:lineRule="auto" w:before="0" w:after="60"/>
       </w:pPr>
       <w:r>
         <w:rPr>
@@ -11546,7 +11615,7 @@
       <w:pPr>
         <w:pStyle w:val="ListBullet"/>
         <w:keepNext w:val="0"/>
-        <w:spacing w:line="312" w:lineRule="auto" w:before="0" w:after="60"/>
+        <w:spacing w:line="360" w:lineRule="auto" w:before="0" w:after="60"/>
       </w:pPr>
       <w:r>
         <w:rPr>
@@ -11563,7 +11632,7 @@
       <w:pPr>
         <w:pStyle w:val="ListBullet"/>
         <w:keepNext w:val="0"/>
-        <w:spacing w:line="312" w:lineRule="auto" w:before="0" w:after="60"/>
+        <w:spacing w:line="360" w:lineRule="auto" w:before="0" w:after="60"/>
       </w:pPr>
       <w:r>
         <w:rPr>
@@ -11609,7 +11678,7 @@
       <w:pPr>
         <w:pStyle w:val="Heading2"/>
         <w:keepNext/>
-        <w:spacing w:line="276" w:lineRule="auto" w:before="200" w:after="100"/>
+        <w:spacing w:line="360" w:lineRule="auto" w:before="200" w:after="100"/>
       </w:pPr>
       <w:r>
         <w:rPr>
@@ -11625,7 +11694,7 @@
     <w:p>
       <w:pPr>
         <w:keepNext w:val="0"/>
-        <w:spacing w:line="324" w:lineRule="auto" w:before="0" w:after="100"/>
+        <w:spacing w:line="360" w:lineRule="auto" w:before="0" w:after="100"/>
       </w:pPr>
       <w:r>
         <w:rPr>
@@ -11642,7 +11711,7 @@
       <w:pPr>
         <w:pStyle w:val="Heading3"/>
         <w:keepNext/>
-        <w:spacing w:line="276" w:lineRule="auto" w:before="120" w:after="60"/>
+        <w:spacing w:line="360" w:lineRule="auto" w:before="120" w:after="60"/>
       </w:pPr>
       <w:r>
         <w:rPr>
@@ -11658,7 +11727,7 @@
     <w:p>
       <w:pPr>
         <w:keepNext w:val="0"/>
-        <w:spacing w:line="324" w:lineRule="auto" w:before="0" w:after="100"/>
+        <w:spacing w:line="360" w:lineRule="auto" w:before="0" w:after="100"/>
       </w:pPr>
       <w:r>
         <w:rPr>
@@ -11674,7 +11743,7 @@
     <w:p>
       <w:pPr>
         <w:keepNext w:val="0"/>
-        <w:spacing w:line="324" w:lineRule="auto" w:before="0" w:after="100"/>
+        <w:spacing w:line="360" w:lineRule="auto" w:before="0" w:after="100"/>
       </w:pPr>
       <w:r>
         <w:rPr>
@@ -11691,7 +11760,7 @@
       <w:pPr>
         <w:pStyle w:val="ListBullet"/>
         <w:keepNext w:val="0"/>
-        <w:spacing w:line="312" w:lineRule="auto" w:before="0" w:after="60"/>
+        <w:spacing w:line="360" w:lineRule="auto" w:before="0" w:after="60"/>
       </w:pPr>
       <w:r>
         <w:rPr>
@@ -11708,7 +11777,7 @@
       <w:pPr>
         <w:pStyle w:val="ListBullet"/>
         <w:keepNext w:val="0"/>
-        <w:spacing w:line="312" w:lineRule="auto" w:before="0" w:after="60"/>
+        <w:spacing w:line="360" w:lineRule="auto" w:before="0" w:after="60"/>
       </w:pPr>
       <w:r>
         <w:rPr>
@@ -11725,7 +11794,7 @@
       <w:pPr>
         <w:pStyle w:val="ListBullet"/>
         <w:keepNext w:val="0"/>
-        <w:spacing w:line="312" w:lineRule="auto" w:before="0" w:after="60"/>
+        <w:spacing w:line="360" w:lineRule="auto" w:before="0" w:after="60"/>
       </w:pPr>
       <w:r>
         <w:rPr>
@@ -11742,7 +11811,7 @@
       <w:pPr>
         <w:pStyle w:val="ListBullet"/>
         <w:keepNext w:val="0"/>
-        <w:spacing w:line="312" w:lineRule="auto" w:before="0" w:after="60"/>
+        <w:spacing w:line="360" w:lineRule="auto" w:before="0" w:after="60"/>
       </w:pPr>
       <w:r>
         <w:rPr>
@@ -11759,7 +11828,7 @@
       <w:pPr>
         <w:pStyle w:val="Heading3"/>
         <w:keepNext/>
-        <w:spacing w:line="276" w:lineRule="auto" w:before="120" w:after="60"/>
+        <w:spacing w:line="360" w:lineRule="auto" w:before="120" w:after="60"/>
       </w:pPr>
       <w:r>
         <w:rPr>
@@ -13296,7 +13365,7 @@
     <w:p>
       <w:pPr>
         <w:keepNext/>
-        <w:spacing w:line="276" w:lineRule="auto" w:before="40" w:after="100"/>
+        <w:spacing w:line="360" w:lineRule="auto" w:before="40" w:after="100"/>
         <w:pBdr>
           <w:bottom w:val="single" w:sz="8" w:space="4" w:color="D9E2F3"/>
         </w:pBdr>
@@ -13315,7 +13384,7 @@
     <w:p>
       <w:pPr>
         <w:keepNext w:val="0"/>
-        <w:spacing w:line="324" w:lineRule="auto" w:before="0" w:after="100"/>
+        <w:spacing w:line="360" w:lineRule="auto" w:before="0" w:after="100"/>
       </w:pPr>
       <w:r>
         <w:rPr>
@@ -13332,7 +13401,7 @@
       <w:pPr>
         <w:pStyle w:val="Heading3"/>
         <w:keepNext/>
-        <w:spacing w:line="276" w:lineRule="auto" w:before="120" w:after="60"/>
+        <w:spacing w:line="360" w:lineRule="auto" w:before="120" w:after="60"/>
       </w:pPr>
       <w:r>
         <w:rPr>
@@ -14228,7 +14297,7 @@
     <w:p>
       <w:pPr>
         <w:keepNext/>
-        <w:spacing w:line="276" w:lineRule="auto" w:before="40" w:after="100"/>
+        <w:spacing w:line="360" w:lineRule="auto" w:before="40" w:after="100"/>
         <w:pBdr>
           <w:bottom w:val="single" w:sz="8" w:space="4" w:color="D9E2F3"/>
         </w:pBdr>
@@ -14247,7 +14316,7 @@
     <w:p>
       <w:pPr>
         <w:keepNext w:val="0"/>
-        <w:spacing w:line="324" w:lineRule="auto" w:before="0" w:after="100"/>
+        <w:spacing w:line="360" w:lineRule="auto" w:before="0" w:after="100"/>
       </w:pPr>
       <w:r>
         <w:rPr>
@@ -14264,7 +14333,7 @@
       <w:pPr>
         <w:pStyle w:val="Heading3"/>
         <w:keepNext/>
-        <w:spacing w:line="276" w:lineRule="auto" w:before="120" w:after="60"/>
+        <w:spacing w:line="360" w:lineRule="auto" w:before="120" w:after="60"/>
       </w:pPr>
       <w:r>
         <w:rPr>
@@ -15048,7 +15117,7 @@
     <w:p>
       <w:pPr>
         <w:keepNext/>
-        <w:spacing w:line="276" w:lineRule="auto" w:before="40" w:after="100"/>
+        <w:spacing w:line="360" w:lineRule="auto" w:before="40" w:after="100"/>
         <w:pBdr>
           <w:bottom w:val="single" w:sz="8" w:space="4" w:color="D9E2F3"/>
         </w:pBdr>
@@ -15067,7 +15136,7 @@
     <w:p>
       <w:pPr>
         <w:keepNext w:val="0"/>
-        <w:spacing w:line="324" w:lineRule="auto" w:before="0" w:after="100"/>
+        <w:spacing w:line="360" w:lineRule="auto" w:before="0" w:after="100"/>
       </w:pPr>
       <w:r>
         <w:rPr>
@@ -15084,7 +15153,7 @@
       <w:pPr>
         <w:pStyle w:val="Heading3"/>
         <w:keepNext/>
-        <w:spacing w:line="276" w:lineRule="auto" w:before="120" w:after="60"/>
+        <w:spacing w:line="360" w:lineRule="auto" w:before="120" w:after="60"/>
       </w:pPr>
       <w:r>
         <w:rPr>
@@ -15673,7 +15742,7 @@
     <w:p>
       <w:pPr>
         <w:keepNext/>
-        <w:spacing w:line="276" w:lineRule="auto" w:before="40" w:after="100"/>
+        <w:spacing w:line="360" w:lineRule="auto" w:before="40" w:after="100"/>
         <w:pBdr>
           <w:bottom w:val="single" w:sz="8" w:space="4" w:color="D9E2F3"/>
         </w:pBdr>
@@ -15692,7 +15761,7 @@
     <w:p>
       <w:pPr>
         <w:keepNext w:val="0"/>
-        <w:spacing w:line="324" w:lineRule="auto" w:before="0" w:after="100"/>
+        <w:spacing w:line="360" w:lineRule="auto" w:before="0" w:after="100"/>
       </w:pPr>
       <w:r>
         <w:rPr>
@@ -15718,7 +15787,7 @@
       <w:pPr>
         <w:pStyle w:val="Heading2"/>
         <w:keepNext/>
-        <w:spacing w:line="276" w:lineRule="auto" w:before="200" w:after="100"/>
+        <w:spacing w:line="360" w:lineRule="auto" w:before="200" w:after="100"/>
       </w:pPr>
       <w:r>
         <w:rPr>
@@ -15734,7 +15803,7 @@
     <w:p>
       <w:pPr>
         <w:keepNext w:val="0"/>
-        <w:spacing w:line="324" w:lineRule="auto" w:before="0" w:after="100"/>
+        <w:spacing w:line="360" w:lineRule="auto" w:before="0" w:after="100"/>
       </w:pPr>
       <w:r>
         <w:rPr>
@@ -15751,7 +15820,7 @@
       <w:pPr>
         <w:pStyle w:val="Heading3"/>
         <w:keepNext/>
-        <w:spacing w:line="276" w:lineRule="auto" w:before="120" w:after="60"/>
+        <w:spacing w:line="360" w:lineRule="auto" w:before="120" w:after="60"/>
       </w:pPr>
       <w:r>
         <w:rPr>
@@ -15766,9 +15835,12 @@
     </w:p>
     <w:p>
       <w:pPr>
-        <w:pStyle w:val="ListNumber"/>
         <w:keepNext w:val="0"/>
-        <w:spacing w:line="312" w:lineRule="auto" w:before="0" w:after="60"/>
+        <w:numPr>
+          <w:ilvl w:val="0"/>
+          <w:numId w:val="13"/>
+        </w:numPr>
+        <w:spacing w:line="360" w:lineRule="auto" w:before="0" w:after="60"/>
       </w:pPr>
       <w:r>
         <w:rPr>
@@ -15793,9 +15865,12 @@
     </w:p>
     <w:p>
       <w:pPr>
-        <w:pStyle w:val="ListNumber"/>
         <w:keepNext w:val="0"/>
-        <w:spacing w:line="312" w:lineRule="auto" w:before="0" w:after="60"/>
+        <w:numPr>
+          <w:ilvl w:val="0"/>
+          <w:numId w:val="13"/>
+        </w:numPr>
+        <w:spacing w:line="360" w:lineRule="auto" w:before="0" w:after="60"/>
       </w:pPr>
       <w:r>
         <w:rPr>
@@ -15820,9 +15895,12 @@
     </w:p>
     <w:p>
       <w:pPr>
-        <w:pStyle w:val="ListNumber"/>
         <w:keepNext w:val="0"/>
-        <w:spacing w:line="312" w:lineRule="auto" w:before="0" w:after="60"/>
+        <w:numPr>
+          <w:ilvl w:val="0"/>
+          <w:numId w:val="13"/>
+        </w:numPr>
+        <w:spacing w:line="360" w:lineRule="auto" w:before="0" w:after="60"/>
       </w:pPr>
       <w:r>
         <w:rPr>
@@ -15847,9 +15925,12 @@
     </w:p>
     <w:p>
       <w:pPr>
-        <w:pStyle w:val="ListNumber"/>
         <w:keepNext w:val="0"/>
-        <w:spacing w:line="312" w:lineRule="auto" w:before="0" w:after="60"/>
+        <w:numPr>
+          <w:ilvl w:val="0"/>
+          <w:numId w:val="13"/>
+        </w:numPr>
+        <w:spacing w:line="360" w:lineRule="auto" w:before="0" w:after="60"/>
       </w:pPr>
       <w:r>
         <w:rPr>
@@ -15874,9 +15955,12 @@
     </w:p>
     <w:p>
       <w:pPr>
-        <w:pStyle w:val="ListNumber"/>
         <w:keepNext w:val="0"/>
-        <w:spacing w:line="312" w:lineRule="auto" w:before="0" w:after="60"/>
+        <w:numPr>
+          <w:ilvl w:val="0"/>
+          <w:numId w:val="13"/>
+        </w:numPr>
+        <w:spacing w:line="360" w:lineRule="auto" w:before="0" w:after="60"/>
       </w:pPr>
       <w:r>
         <w:rPr>
@@ -15901,9 +15985,12 @@
     </w:p>
     <w:p>
       <w:pPr>
-        <w:pStyle w:val="ListNumber"/>
         <w:keepNext w:val="0"/>
-        <w:spacing w:line="312" w:lineRule="auto" w:before="0" w:after="60"/>
+        <w:numPr>
+          <w:ilvl w:val="0"/>
+          <w:numId w:val="13"/>
+        </w:numPr>
+        <w:spacing w:line="360" w:lineRule="auto" w:before="0" w:after="60"/>
       </w:pPr>
       <w:r>
         <w:rPr>
@@ -15928,9 +16015,12 @@
     </w:p>
     <w:p>
       <w:pPr>
-        <w:pStyle w:val="ListNumber"/>
         <w:keepNext w:val="0"/>
-        <w:spacing w:line="312" w:lineRule="auto" w:before="0" w:after="60"/>
+        <w:numPr>
+          <w:ilvl w:val="0"/>
+          <w:numId w:val="13"/>
+        </w:numPr>
+        <w:spacing w:line="360" w:lineRule="auto" w:before="0" w:after="60"/>
       </w:pPr>
       <w:r>
         <w:rPr>
@@ -15955,9 +16045,12 @@
     </w:p>
     <w:p>
       <w:pPr>
-        <w:pStyle w:val="ListNumber"/>
         <w:keepNext w:val="0"/>
-        <w:spacing w:line="312" w:lineRule="auto" w:before="0" w:after="60"/>
+        <w:numPr>
+          <w:ilvl w:val="0"/>
+          <w:numId w:val="13"/>
+        </w:numPr>
+        <w:spacing w:line="360" w:lineRule="auto" w:before="0" w:after="60"/>
       </w:pPr>
       <w:r>
         <w:rPr>
@@ -15982,9 +16075,12 @@
     </w:p>
     <w:p>
       <w:pPr>
-        <w:pStyle w:val="ListNumber"/>
         <w:keepNext w:val="0"/>
-        <w:spacing w:line="312" w:lineRule="auto" w:before="0" w:after="60"/>
+        <w:numPr>
+          <w:ilvl w:val="0"/>
+          <w:numId w:val="13"/>
+        </w:numPr>
+        <w:spacing w:line="360" w:lineRule="auto" w:before="0" w:after="60"/>
       </w:pPr>
       <w:r>
         <w:rPr>
@@ -16011,7 +16107,7 @@
       <w:pPr>
         <w:pStyle w:val="Heading3"/>
         <w:keepNext/>
-        <w:spacing w:line="276" w:lineRule="auto" w:before="120" w:after="60"/>
+        <w:spacing w:line="360" w:lineRule="auto" w:before="120" w:after="60"/>
       </w:pPr>
       <w:r>
         <w:rPr>
@@ -16956,7 +17052,7 @@
     <w:p>
       <w:pPr>
         <w:keepNext/>
-        <w:spacing w:line="276" w:lineRule="auto" w:before="40" w:after="100"/>
+        <w:spacing w:line="360" w:lineRule="auto" w:before="40" w:after="100"/>
         <w:pBdr>
           <w:bottom w:val="single" w:sz="8" w:space="4" w:color="D9E2F3"/>
         </w:pBdr>
@@ -16975,7 +17071,7 @@
     <w:p>
       <w:pPr>
         <w:keepNext w:val="0"/>
-        <w:spacing w:line="324" w:lineRule="auto" w:before="0" w:after="100"/>
+        <w:spacing w:line="360" w:lineRule="auto" w:before="0" w:after="100"/>
       </w:pPr>
       <w:r>
         <w:rPr>
@@ -16992,7 +17088,7 @@
       <w:pPr>
         <w:pStyle w:val="Heading3"/>
         <w:keepNext/>
-        <w:spacing w:line="276" w:lineRule="auto" w:before="120" w:after="60"/>
+        <w:spacing w:line="360" w:lineRule="auto" w:before="120" w:after="60"/>
       </w:pPr>
       <w:r>
         <w:rPr>
@@ -17756,7 +17852,7 @@
     <w:p>
       <w:pPr>
         <w:keepNext/>
-        <w:spacing w:line="276" w:lineRule="auto" w:before="40" w:after="100"/>
+        <w:spacing w:line="360" w:lineRule="auto" w:before="40" w:after="100"/>
         <w:pBdr>
           <w:bottom w:val="single" w:sz="8" w:space="4" w:color="D9E2F3"/>
         </w:pBdr>
@@ -17775,7 +17871,7 @@
     <w:p>
       <w:pPr>
         <w:keepNext w:val="0"/>
-        <w:spacing w:line="324" w:lineRule="auto" w:before="0" w:after="100"/>
+        <w:spacing w:line="360" w:lineRule="auto" w:before="0" w:after="100"/>
       </w:pPr>
       <w:r>
         <w:rPr>
@@ -17792,7 +17888,7 @@
       <w:pPr>
         <w:pStyle w:val="Heading3"/>
         <w:keepNext/>
-        <w:spacing w:line="276" w:lineRule="auto" w:before="120" w:after="60"/>
+        <w:spacing w:line="360" w:lineRule="auto" w:before="120" w:after="60"/>
       </w:pPr>
       <w:r>
         <w:rPr>
@@ -17808,7 +17904,7 @@
     <w:p>
       <w:pPr>
         <w:keepNext w:val="0"/>
-        <w:spacing w:line="324" w:lineRule="auto" w:before="0" w:after="100"/>
+        <w:spacing w:line="360" w:lineRule="auto" w:before="0" w:after="100"/>
       </w:pPr>
       <w:r>
         <w:rPr>
@@ -17825,7 +17921,7 @@
       <w:pPr>
         <w:pStyle w:val="Heading3"/>
         <w:keepNext/>
-        <w:spacing w:line="276" w:lineRule="auto" w:before="120" w:after="60"/>
+        <w:spacing w:line="360" w:lineRule="auto" w:before="120" w:after="60"/>
       </w:pPr>
       <w:r>
         <w:rPr>
@@ -17841,7 +17937,7 @@
     <w:p>
       <w:pPr>
         <w:keepNext w:val="0"/>
-        <w:spacing w:line="324" w:lineRule="auto" w:before="0" w:after="100"/>
+        <w:spacing w:line="360" w:lineRule="auto" w:before="0" w:after="100"/>
       </w:pPr>
       <w:r>
         <w:rPr>
@@ -17858,7 +17954,7 @@
       <w:pPr>
         <w:pStyle w:val="Heading3"/>
         <w:keepNext/>
-        <w:spacing w:line="276" w:lineRule="auto" w:before="120" w:after="60"/>
+        <w:spacing w:line="360" w:lineRule="auto" w:before="120" w:after="60"/>
       </w:pPr>
       <w:r>
         <w:rPr>
@@ -19099,7 +19195,7 @@
     <w:p>
       <w:pPr>
         <w:keepNext/>
-        <w:spacing w:line="276" w:lineRule="auto" w:before="40" w:after="100"/>
+        <w:spacing w:line="360" w:lineRule="auto" w:before="40" w:after="100"/>
         <w:pBdr>
           <w:bottom w:val="single" w:sz="8" w:space="4" w:color="D9E2F3"/>
         </w:pBdr>
@@ -19118,7 +19214,7 @@
     <w:p>
       <w:pPr>
         <w:keepNext w:val="0"/>
-        <w:spacing w:line="324" w:lineRule="auto" w:before="0" w:after="100"/>
+        <w:spacing w:line="360" w:lineRule="auto" w:before="0" w:after="100"/>
       </w:pPr>
       <w:r>
         <w:rPr>
@@ -19135,7 +19231,7 @@
       <w:pPr>
         <w:pStyle w:val="Heading3"/>
         <w:keepNext/>
-        <w:spacing w:line="276" w:lineRule="auto" w:before="120" w:after="60"/>
+        <w:spacing w:line="360" w:lineRule="auto" w:before="120" w:after="60"/>
       </w:pPr>
       <w:r>
         <w:rPr>
@@ -19151,7 +19247,7 @@
     <w:p>
       <w:pPr>
         <w:keepNext w:val="0"/>
-        <w:spacing w:line="324" w:lineRule="auto" w:before="0" w:after="100"/>
+        <w:spacing w:line="360" w:lineRule="auto" w:before="0" w:after="100"/>
       </w:pPr>
       <w:r>
         <w:rPr>
@@ -19168,7 +19264,7 @@
       <w:pPr>
         <w:pStyle w:val="ListBullet"/>
         <w:keepNext w:val="0"/>
-        <w:spacing w:line="312" w:lineRule="auto" w:before="0" w:after="60"/>
+        <w:spacing w:line="360" w:lineRule="auto" w:before="0" w:after="60"/>
       </w:pPr>
       <w:r>
         <w:rPr>
@@ -19185,7 +19281,7 @@
       <w:pPr>
         <w:pStyle w:val="ListBullet"/>
         <w:keepNext w:val="0"/>
-        <w:spacing w:line="312" w:lineRule="auto" w:before="0" w:after="60"/>
+        <w:spacing w:line="360" w:lineRule="auto" w:before="0" w:after="60"/>
       </w:pPr>
       <w:r>
         <w:rPr>
@@ -19202,7 +19298,7 @@
       <w:pPr>
         <w:pStyle w:val="ListBullet"/>
         <w:keepNext w:val="0"/>
-        <w:spacing w:line="312" w:lineRule="auto" w:before="0" w:after="60"/>
+        <w:spacing w:line="360" w:lineRule="auto" w:before="0" w:after="60"/>
       </w:pPr>
       <w:r>
         <w:rPr>
@@ -19219,7 +19315,7 @@
       <w:pPr>
         <w:pStyle w:val="ListBullet"/>
         <w:keepNext w:val="0"/>
-        <w:spacing w:line="312" w:lineRule="auto" w:before="0" w:after="60"/>
+        <w:spacing w:line="360" w:lineRule="auto" w:before="0" w:after="60"/>
       </w:pPr>
       <w:r>
         <w:rPr>
@@ -19236,7 +19332,7 @@
       <w:pPr>
         <w:pStyle w:val="ListBullet"/>
         <w:keepNext w:val="0"/>
-        <w:spacing w:line="312" w:lineRule="auto" w:before="0" w:after="60"/>
+        <w:spacing w:line="360" w:lineRule="auto" w:before="0" w:after="60"/>
       </w:pPr>
       <w:r>
         <w:rPr>
@@ -19253,7 +19349,7 @@
       <w:pPr>
         <w:pStyle w:val="ListBullet"/>
         <w:keepNext w:val="0"/>
-        <w:spacing w:line="312" w:lineRule="auto" w:before="0" w:after="60"/>
+        <w:spacing w:line="360" w:lineRule="auto" w:before="0" w:after="60"/>
       </w:pPr>
       <w:r>
         <w:rPr>
@@ -19270,7 +19366,7 @@
       <w:pPr>
         <w:pStyle w:val="ListBullet"/>
         <w:keepNext w:val="0"/>
-        <w:spacing w:line="312" w:lineRule="auto" w:before="0" w:after="60"/>
+        <w:spacing w:line="360" w:lineRule="auto" w:before="0" w:after="60"/>
       </w:pPr>
       <w:r>
         <w:rPr>
@@ -19287,7 +19383,7 @@
       <w:pPr>
         <w:pStyle w:val="Heading3"/>
         <w:keepNext/>
-        <w:spacing w:line="276" w:lineRule="auto" w:before="120" w:after="60"/>
+        <w:spacing w:line="360" w:lineRule="auto" w:before="120" w:after="60"/>
       </w:pPr>
       <w:r>
         <w:rPr>
@@ -19303,7 +19399,7 @@
     <w:p>
       <w:pPr>
         <w:keepNext w:val="0"/>
-        <w:spacing w:line="324" w:lineRule="auto" w:before="0" w:after="100"/>
+        <w:spacing w:line="360" w:lineRule="auto" w:before="0" w:after="100"/>
       </w:pPr>
       <w:r>
         <w:rPr>
@@ -19320,7 +19416,7 @@
       <w:pPr>
         <w:pStyle w:val="ListBullet"/>
         <w:keepNext w:val="0"/>
-        <w:spacing w:line="312" w:lineRule="auto" w:before="0" w:after="60"/>
+        <w:spacing w:line="360" w:lineRule="auto" w:before="0" w:after="60"/>
       </w:pPr>
       <w:r>
         <w:rPr>
@@ -19337,7 +19433,7 @@
       <w:pPr>
         <w:pStyle w:val="ListBullet"/>
         <w:keepNext w:val="0"/>
-        <w:spacing w:line="312" w:lineRule="auto" w:before="0" w:after="60"/>
+        <w:spacing w:line="360" w:lineRule="auto" w:before="0" w:after="60"/>
       </w:pPr>
       <w:r>
         <w:rPr>
@@ -19354,7 +19450,7 @@
       <w:pPr>
         <w:pStyle w:val="ListBullet"/>
         <w:keepNext w:val="0"/>
-        <w:spacing w:line="312" w:lineRule="auto" w:before="0" w:after="60"/>
+        <w:spacing w:line="360" w:lineRule="auto" w:before="0" w:after="60"/>
       </w:pPr>
       <w:r>
         <w:rPr>
@@ -19371,7 +19467,7 @@
       <w:pPr>
         <w:pStyle w:val="ListBullet"/>
         <w:keepNext w:val="0"/>
-        <w:spacing w:line="312" w:lineRule="auto" w:before="0" w:after="60"/>
+        <w:spacing w:line="360" w:lineRule="auto" w:before="0" w:after="60"/>
       </w:pPr>
       <w:r>
         <w:rPr>
@@ -19388,7 +19484,7 @@
       <w:pPr>
         <w:pStyle w:val="ListBullet"/>
         <w:keepNext w:val="0"/>
-        <w:spacing w:line="312" w:lineRule="auto" w:before="0" w:after="60"/>
+        <w:spacing w:line="360" w:lineRule="auto" w:before="0" w:after="60"/>
       </w:pPr>
       <w:r>
         <w:rPr>
@@ -19405,7 +19501,7 @@
       <w:pPr>
         <w:pStyle w:val="ListBullet"/>
         <w:keepNext w:val="0"/>
-        <w:spacing w:line="312" w:lineRule="auto" w:before="0" w:after="60"/>
+        <w:spacing w:line="360" w:lineRule="auto" w:before="0" w:after="60"/>
       </w:pPr>
       <w:r>
         <w:rPr>
@@ -19422,7 +19518,7 @@
       <w:pPr>
         <w:pStyle w:val="ListBullet"/>
         <w:keepNext w:val="0"/>
-        <w:spacing w:line="312" w:lineRule="auto" w:before="0" w:after="60"/>
+        <w:spacing w:line="360" w:lineRule="auto" w:before="0" w:after="60"/>
       </w:pPr>
       <w:r>
         <w:rPr>
@@ -19439,7 +19535,7 @@
       <w:pPr>
         <w:pStyle w:val="ListBullet"/>
         <w:keepNext w:val="0"/>
-        <w:spacing w:line="312" w:lineRule="auto" w:before="0" w:after="60"/>
+        <w:spacing w:line="360" w:lineRule="auto" w:before="0" w:after="60"/>
       </w:pPr>
       <w:r>
         <w:rPr>
@@ -19455,7 +19551,7 @@
     <w:p>
       <w:pPr>
         <w:keepNext w:val="0"/>
-        <w:spacing w:line="324" w:lineRule="auto" w:before="0" w:after="100"/>
+        <w:spacing w:line="360" w:lineRule="auto" w:before="0" w:after="100"/>
       </w:pPr>
       <w:r>
         <w:rPr>
@@ -19472,7 +19568,7 @@
       <w:pPr>
         <w:pStyle w:val="Heading3"/>
         <w:keepNext/>
-        <w:spacing w:line="276" w:lineRule="auto" w:before="120" w:after="60"/>
+        <w:spacing w:line="360" w:lineRule="auto" w:before="120" w:after="60"/>
       </w:pPr>
       <w:r>
         <w:rPr>
@@ -19488,7 +19584,7 @@
     <w:p>
       <w:pPr>
         <w:keepNext w:val="0"/>
-        <w:spacing w:line="324" w:lineRule="auto" w:before="0" w:after="100"/>
+        <w:spacing w:line="360" w:lineRule="auto" w:before="0" w:after="100"/>
       </w:pPr>
       <w:r>
         <w:rPr>
@@ -19505,7 +19601,7 @@
       <w:pPr>
         <w:pStyle w:val="Heading3"/>
         <w:keepNext/>
-        <w:spacing w:line="276" w:lineRule="auto" w:before="120" w:after="60"/>
+        <w:spacing w:line="360" w:lineRule="auto" w:before="120" w:after="60"/>
       </w:pPr>
       <w:r>
         <w:rPr>
@@ -19521,7 +19617,7 @@
     <w:p>
       <w:pPr>
         <w:keepNext w:val="0"/>
-        <w:spacing w:line="324" w:lineRule="auto" w:before="0" w:after="100"/>
+        <w:spacing w:line="360" w:lineRule="auto" w:before="0" w:after="100"/>
       </w:pPr>
       <w:r>
         <w:rPr>
@@ -19538,7 +19634,7 @@
       <w:pPr>
         <w:pStyle w:val="Heading4"/>
         <w:keepNext/>
-        <w:spacing w:line="276" w:lineRule="auto" w:before="120" w:after="60"/>
+        <w:spacing w:line="360" w:lineRule="auto" w:before="120" w:after="60"/>
       </w:pPr>
       <w:r>
         <w:rPr>
@@ -19554,7 +19650,7 @@
     <w:p>
       <w:pPr>
         <w:keepNext w:val="0"/>
-        <w:spacing w:line="324" w:lineRule="auto" w:before="0" w:after="100"/>
+        <w:spacing w:line="360" w:lineRule="auto" w:before="0" w:after="100"/>
       </w:pPr>
       <w:r>
         <w:rPr>
@@ -19571,7 +19667,7 @@
       <w:pPr>
         <w:pStyle w:val="ListBullet"/>
         <w:keepNext w:val="0"/>
-        <w:spacing w:line="312" w:lineRule="auto" w:before="0" w:after="60"/>
+        <w:spacing w:line="360" w:lineRule="auto" w:before="0" w:after="60"/>
       </w:pPr>
       <w:r>
         <w:rPr>
@@ -19588,7 +19684,7 @@
       <w:pPr>
         <w:pStyle w:val="ListBullet"/>
         <w:keepNext w:val="0"/>
-        <w:spacing w:line="312" w:lineRule="auto" w:before="0" w:after="60"/>
+        <w:spacing w:line="360" w:lineRule="auto" w:before="0" w:after="60"/>
       </w:pPr>
       <w:r>
         <w:rPr>
@@ -19615,7 +19711,7 @@
       <w:pPr>
         <w:pStyle w:val="ListBullet"/>
         <w:keepNext w:val="0"/>
-        <w:spacing w:line="312" w:lineRule="auto" w:before="0" w:after="60"/>
+        <w:spacing w:line="360" w:lineRule="auto" w:before="0" w:after="60"/>
       </w:pPr>
       <w:r>
         <w:rPr>
@@ -19632,7 +19728,7 @@
       <w:pPr>
         <w:pStyle w:val="ListBullet"/>
         <w:keepNext w:val="0"/>
-        <w:spacing w:line="312" w:lineRule="auto" w:before="0" w:after="60"/>
+        <w:spacing w:line="360" w:lineRule="auto" w:before="0" w:after="60"/>
       </w:pPr>
       <w:r>
         <w:rPr>
@@ -19649,7 +19745,7 @@
       <w:pPr>
         <w:pStyle w:val="ListBullet"/>
         <w:keepNext w:val="0"/>
-        <w:spacing w:line="312" w:lineRule="auto" w:before="0" w:after="60"/>
+        <w:spacing w:line="360" w:lineRule="auto" w:before="0" w:after="60"/>
       </w:pPr>
       <w:r>
         <w:rPr>
@@ -19666,7 +19762,7 @@
       <w:pPr>
         <w:pStyle w:val="Heading4"/>
         <w:keepNext/>
-        <w:spacing w:line="276" w:lineRule="auto" w:before="120" w:after="60"/>
+        <w:spacing w:line="360" w:lineRule="auto" w:before="120" w:after="60"/>
       </w:pPr>
       <w:r>
         <w:rPr>
@@ -19682,7 +19778,7 @@
     <w:p>
       <w:pPr>
         <w:keepNext w:val="0"/>
-        <w:spacing w:line="324" w:lineRule="auto" w:before="0" w:after="100"/>
+        <w:spacing w:line="360" w:lineRule="auto" w:before="0" w:after="100"/>
       </w:pPr>
       <w:r>
         <w:rPr>
@@ -19699,7 +19795,7 @@
       <w:pPr>
         <w:pStyle w:val="ListBullet"/>
         <w:keepNext w:val="0"/>
-        <w:spacing w:line="312" w:lineRule="auto" w:before="0" w:after="60"/>
+        <w:spacing w:line="360" w:lineRule="auto" w:before="0" w:after="60"/>
       </w:pPr>
       <w:r>
         <w:rPr>
@@ -19716,7 +19812,7 @@
       <w:pPr>
         <w:pStyle w:val="ListBullet"/>
         <w:keepNext w:val="0"/>
-        <w:spacing w:line="312" w:lineRule="auto" w:before="0" w:after="60"/>
+        <w:spacing w:line="360" w:lineRule="auto" w:before="0" w:after="60"/>
       </w:pPr>
       <w:r>
         <w:rPr>
@@ -19733,7 +19829,7 @@
       <w:pPr>
         <w:pStyle w:val="ListBullet"/>
         <w:keepNext w:val="0"/>
-        <w:spacing w:line="312" w:lineRule="auto" w:before="0" w:after="60"/>
+        <w:spacing w:line="360" w:lineRule="auto" w:before="0" w:after="60"/>
       </w:pPr>
       <w:r>
         <w:rPr>
@@ -19750,7 +19846,7 @@
       <w:pPr>
         <w:pStyle w:val="ListBullet"/>
         <w:keepNext w:val="0"/>
-        <w:spacing w:line="312" w:lineRule="auto" w:before="0" w:after="60"/>
+        <w:spacing w:line="360" w:lineRule="auto" w:before="0" w:after="60"/>
       </w:pPr>
       <w:r>
         <w:rPr>
@@ -19767,7 +19863,7 @@
       <w:pPr>
         <w:pStyle w:val="ListBullet"/>
         <w:keepNext w:val="0"/>
-        <w:spacing w:line="312" w:lineRule="auto" w:before="0" w:after="60"/>
+        <w:spacing w:line="360" w:lineRule="auto" w:before="0" w:after="60"/>
       </w:pPr>
       <w:r>
         <w:rPr>
@@ -19784,7 +19880,7 @@
       <w:pPr>
         <w:pStyle w:val="ListBullet"/>
         <w:keepNext w:val="0"/>
-        <w:spacing w:line="312" w:lineRule="auto" w:before="0" w:after="60"/>
+        <w:spacing w:line="360" w:lineRule="auto" w:before="0" w:after="60"/>
       </w:pPr>
       <w:r>
         <w:rPr>
@@ -19801,7 +19897,7 @@
       <w:pPr>
         <w:pStyle w:val="ListBullet"/>
         <w:keepNext w:val="0"/>
-        <w:spacing w:line="312" w:lineRule="auto" w:before="0" w:after="60"/>
+        <w:spacing w:line="360" w:lineRule="auto" w:before="0" w:after="60"/>
       </w:pPr>
       <w:r>
         <w:rPr>
@@ -19818,7 +19914,7 @@
       <w:pPr>
         <w:pStyle w:val="ListBullet"/>
         <w:keepNext w:val="0"/>
-        <w:spacing w:line="312" w:lineRule="auto" w:before="0" w:after="60"/>
+        <w:spacing w:line="360" w:lineRule="auto" w:before="0" w:after="60"/>
       </w:pPr>
       <w:r>
         <w:rPr>
@@ -19835,7 +19931,7 @@
       <w:pPr>
         <w:pStyle w:val="Heading4"/>
         <w:keepNext/>
-        <w:spacing w:line="276" w:lineRule="auto" w:before="120" w:after="60"/>
+        <w:spacing w:line="360" w:lineRule="auto" w:before="120" w:after="60"/>
       </w:pPr>
       <w:r>
         <w:rPr>
@@ -20418,7 +20514,7 @@
     <w:p>
       <w:pPr>
         <w:keepNext/>
-        <w:spacing w:line="276" w:lineRule="auto" w:before="40" w:after="100"/>
+        <w:spacing w:line="360" w:lineRule="auto" w:before="40" w:after="100"/>
         <w:pBdr>
           <w:bottom w:val="single" w:sz="8" w:space="4" w:color="D9E2F3"/>
         </w:pBdr>
@@ -20437,7 +20533,7 @@
     <w:p>
       <w:pPr>
         <w:keepNext w:val="0"/>
-        <w:spacing w:line="324" w:lineRule="auto" w:before="0" w:after="100"/>
+        <w:spacing w:line="360" w:lineRule="auto" w:before="0" w:after="100"/>
       </w:pPr>
       <w:r>
         <w:rPr>
@@ -20454,7 +20550,7 @@
       <w:pPr>
         <w:pStyle w:val="Heading3"/>
         <w:keepNext/>
-        <w:spacing w:line="276" w:lineRule="auto" w:before="120" w:after="60"/>
+        <w:spacing w:line="360" w:lineRule="auto" w:before="120" w:after="60"/>
       </w:pPr>
       <w:r>
         <w:rPr>
@@ -20470,7 +20566,7 @@
     <w:p>
       <w:pPr>
         <w:keepNext w:val="0"/>
-        <w:spacing w:line="324" w:lineRule="auto" w:before="0" w:after="100"/>
+        <w:spacing w:line="360" w:lineRule="auto" w:before="0" w:after="100"/>
       </w:pPr>
       <w:r>
         <w:rPr>
@@ -20486,7 +20582,7 @@
     <w:p>
       <w:pPr>
         <w:keepNext w:val="0"/>
-        <w:spacing w:line="324" w:lineRule="auto" w:before="0" w:after="100"/>
+        <w:spacing w:line="360" w:lineRule="auto" w:before="0" w:after="100"/>
       </w:pPr>
       <w:r>
         <w:rPr>
@@ -20503,7 +20599,7 @@
       <w:pPr>
         <w:pStyle w:val="ListBullet"/>
         <w:keepNext w:val="0"/>
-        <w:spacing w:line="312" w:lineRule="auto" w:before="0" w:after="60"/>
+        <w:spacing w:line="360" w:lineRule="auto" w:before="0" w:after="60"/>
       </w:pPr>
       <w:r>
         <w:rPr>
@@ -20520,7 +20616,7 @@
       <w:pPr>
         <w:pStyle w:val="ListBullet"/>
         <w:keepNext w:val="0"/>
-        <w:spacing w:line="312" w:lineRule="auto" w:before="0" w:after="60"/>
+        <w:spacing w:line="360" w:lineRule="auto" w:before="0" w:after="60"/>
       </w:pPr>
       <w:r>
         <w:rPr>
@@ -20537,7 +20633,7 @@
       <w:pPr>
         <w:pStyle w:val="ListBullet"/>
         <w:keepNext w:val="0"/>
-        <w:spacing w:line="312" w:lineRule="auto" w:before="0" w:after="60"/>
+        <w:spacing w:line="360" w:lineRule="auto" w:before="0" w:after="60"/>
       </w:pPr>
       <w:r>
         <w:rPr>
@@ -20554,7 +20650,7 @@
       <w:pPr>
         <w:pStyle w:val="ListBullet"/>
         <w:keepNext w:val="0"/>
-        <w:spacing w:line="312" w:lineRule="auto" w:before="0" w:after="60"/>
+        <w:spacing w:line="360" w:lineRule="auto" w:before="0" w:after="60"/>
       </w:pPr>
       <w:r>
         <w:rPr>
@@ -20571,7 +20667,7 @@
       <w:pPr>
         <w:pStyle w:val="ListBullet"/>
         <w:keepNext w:val="0"/>
-        <w:spacing w:line="312" w:lineRule="auto" w:before="0" w:after="60"/>
+        <w:spacing w:line="360" w:lineRule="auto" w:before="0" w:after="60"/>
       </w:pPr>
       <w:r>
         <w:rPr>
@@ -20588,7 +20684,7 @@
       <w:pPr>
         <w:pStyle w:val="ListBullet"/>
         <w:keepNext w:val="0"/>
-        <w:spacing w:line="312" w:lineRule="auto" w:before="0" w:after="60"/>
+        <w:spacing w:line="360" w:lineRule="auto" w:before="0" w:after="60"/>
       </w:pPr>
       <w:r>
         <w:rPr>
@@ -20604,7 +20700,7 @@
     <w:p>
       <w:pPr>
         <w:keepNext w:val="0"/>
-        <w:spacing w:line="324" w:lineRule="auto" w:before="0" w:after="100"/>
+        <w:spacing w:line="360" w:lineRule="auto" w:before="0" w:after="100"/>
       </w:pPr>
       <w:r>
         <w:rPr>
@@ -20620,7 +20716,7 @@
     <w:p>
       <w:pPr>
         <w:keepNext w:val="0"/>
-        <w:spacing w:line="324" w:lineRule="auto" w:before="0" w:after="100"/>
+        <w:spacing w:line="360" w:lineRule="auto" w:before="0" w:after="100"/>
       </w:pPr>
       <w:r>
         <w:rPr>
@@ -20637,7 +20733,7 @@
       <w:pPr>
         <w:pStyle w:val="Heading3"/>
         <w:keepNext/>
-        <w:spacing w:line="276" w:lineRule="auto" w:before="120" w:after="60"/>
+        <w:spacing w:line="360" w:lineRule="auto" w:before="120" w:after="60"/>
       </w:pPr>
       <w:r>
         <w:rPr>
@@ -20653,7 +20749,7 @@
     <w:p>
       <w:pPr>
         <w:keepNext w:val="0"/>
-        <w:spacing w:line="324" w:lineRule="auto" w:before="0" w:after="100"/>
+        <w:spacing w:line="360" w:lineRule="auto" w:before="0" w:after="100"/>
       </w:pPr>
       <w:r>
         <w:rPr>
@@ -20668,9 +20764,12 @@
     </w:p>
     <w:p>
       <w:pPr>
-        <w:pStyle w:val="ListNumber"/>
         <w:keepNext w:val="0"/>
-        <w:spacing w:line="312" w:lineRule="auto" w:before="0" w:after="60"/>
+        <w:numPr>
+          <w:ilvl w:val="0"/>
+          <w:numId w:val="14"/>
+        </w:numPr>
+        <w:spacing w:line="360" w:lineRule="auto" w:before="0" w:after="60"/>
       </w:pPr>
       <w:r>
         <w:rPr>
@@ -20725,9 +20824,12 @@
     </w:p>
     <w:p>
       <w:pPr>
-        <w:pStyle w:val="ListNumber"/>
         <w:keepNext w:val="0"/>
-        <w:spacing w:line="312" w:lineRule="auto" w:before="0" w:after="60"/>
+        <w:numPr>
+          <w:ilvl w:val="0"/>
+          <w:numId w:val="14"/>
+        </w:numPr>
+        <w:spacing w:line="360" w:lineRule="auto" w:before="0" w:after="60"/>
       </w:pPr>
       <w:r>
         <w:rPr>
@@ -20742,9 +20844,12 @@
     </w:p>
     <w:p>
       <w:pPr>
-        <w:pStyle w:val="ListNumber"/>
         <w:keepNext w:val="0"/>
-        <w:spacing w:line="312" w:lineRule="auto" w:before="0" w:after="60"/>
+        <w:numPr>
+          <w:ilvl w:val="0"/>
+          <w:numId w:val="14"/>
+        </w:numPr>
+        <w:spacing w:line="360" w:lineRule="auto" w:before="0" w:after="60"/>
       </w:pPr>
       <w:r>
         <w:rPr>
@@ -20779,9 +20884,12 @@
     </w:p>
     <w:p>
       <w:pPr>
-        <w:pStyle w:val="ListNumber"/>
         <w:keepNext w:val="0"/>
-        <w:spacing w:line="312" w:lineRule="auto" w:before="0" w:after="60"/>
+        <w:numPr>
+          <w:ilvl w:val="0"/>
+          <w:numId w:val="14"/>
+        </w:numPr>
+        <w:spacing w:line="360" w:lineRule="auto" w:before="0" w:after="60"/>
       </w:pPr>
       <w:r>
         <w:rPr>
@@ -20796,9 +20904,12 @@
     </w:p>
     <w:p>
       <w:pPr>
-        <w:pStyle w:val="ListNumber"/>
         <w:keepNext w:val="0"/>
-        <w:spacing w:line="312" w:lineRule="auto" w:before="0" w:after="60"/>
+        <w:numPr>
+          <w:ilvl w:val="0"/>
+          <w:numId w:val="14"/>
+        </w:numPr>
+        <w:spacing w:line="360" w:lineRule="auto" w:before="0" w:after="60"/>
       </w:pPr>
       <w:r>
         <w:rPr>
@@ -20813,9 +20924,12 @@
     </w:p>
     <w:p>
       <w:pPr>
-        <w:pStyle w:val="ListNumber"/>
         <w:keepNext w:val="0"/>
-        <w:spacing w:line="312" w:lineRule="auto" w:before="0" w:after="60"/>
+        <w:numPr>
+          <w:ilvl w:val="0"/>
+          <w:numId w:val="14"/>
+        </w:numPr>
+        <w:spacing w:line="360" w:lineRule="auto" w:before="0" w:after="60"/>
       </w:pPr>
       <w:r>
         <w:rPr>
@@ -20830,9 +20944,12 @@
     </w:p>
     <w:p>
       <w:pPr>
-        <w:pStyle w:val="ListNumber"/>
         <w:keepNext w:val="0"/>
-        <w:spacing w:line="312" w:lineRule="auto" w:before="0" w:after="60"/>
+        <w:numPr>
+          <w:ilvl w:val="0"/>
+          <w:numId w:val="14"/>
+        </w:numPr>
+        <w:spacing w:line="360" w:lineRule="auto" w:before="0" w:after="60"/>
       </w:pPr>
       <w:r>
         <w:rPr>
@@ -20847,9 +20964,12 @@
     </w:p>
     <w:p>
       <w:pPr>
-        <w:pStyle w:val="ListNumber"/>
         <w:keepNext w:val="0"/>
-        <w:spacing w:line="312" w:lineRule="auto" w:before="0" w:after="60"/>
+        <w:numPr>
+          <w:ilvl w:val="0"/>
+          <w:numId w:val="14"/>
+        </w:numPr>
+        <w:spacing w:line="360" w:lineRule="auto" w:before="0" w:after="60"/>
       </w:pPr>
       <w:r>
         <w:rPr>
@@ -20864,9 +20984,12 @@
     </w:p>
     <w:p>
       <w:pPr>
-        <w:pStyle w:val="ListNumber"/>
         <w:keepNext w:val="0"/>
-        <w:spacing w:line="312" w:lineRule="auto" w:before="0" w:after="60"/>
+        <w:numPr>
+          <w:ilvl w:val="0"/>
+          <w:numId w:val="14"/>
+        </w:numPr>
+        <w:spacing w:line="360" w:lineRule="auto" w:before="0" w:after="60"/>
       </w:pPr>
       <w:r>
         <w:rPr>
@@ -20892,7 +21015,7 @@
       <w:pPr>
         <w:pStyle w:val="Heading2"/>
         <w:keepNext/>
-        <w:spacing w:line="276" w:lineRule="auto" w:before="200" w:after="100"/>
+        <w:spacing w:line="360" w:lineRule="auto" w:before="200" w:after="100"/>
       </w:pPr>
       <w:r>
         <w:rPr>
@@ -20908,7 +21031,7 @@
     <w:p>
       <w:pPr>
         <w:keepNext w:val="0"/>
-        <w:spacing w:line="324" w:lineRule="auto" w:before="0" w:after="100"/>
+        <w:spacing w:line="360" w:lineRule="auto" w:before="0" w:after="100"/>
       </w:pPr>
       <w:r>
         <w:rPr>
@@ -20938,13 +21061,13 @@
           <w:color w:val="191919"/>
           <w:sz w:val="22"/>
         </w:rPr>
-        <w:t>. OpenAI. Recuperado el 8 de mayo de 2026, de [https://openai.com/index/unlocking-the-codex-harness/](https://openai.com/index/unlocking-the-codex-harness/)</w:t>
+        <w:t>. OpenAI. Recuperado el 8 de mayo de 2026, de https://openai.com/index/unlocking-the-codex-harness/</w:t>
       </w:r>
     </w:p>
     <w:p>
       <w:pPr>
         <w:keepNext w:val="0"/>
-        <w:spacing w:line="324" w:lineRule="auto" w:before="0" w:after="100"/>
+        <w:spacing w:line="360" w:lineRule="auto" w:before="0" w:after="100"/>
       </w:pPr>
       <w:r>
         <w:rPr>
@@ -20974,13 +21097,13 @@
           <w:color w:val="191919"/>
           <w:sz w:val="22"/>
         </w:rPr>
-        <w:t xml:space="preserve"> [Repositorio GitHub]. GitHub. Recuperado el 8 de mayo de 2026, de [https://github.com/gaspardip/symphony](https://github.com/gaspardip/symphony)</w:t>
+        <w:t xml:space="preserve"> [Repositorio GitHub]. GitHub. Recuperado el 8 de mayo de 2026, de https://github.com/gaspardip/symphony</w:t>
       </w:r>
     </w:p>
     <w:p>
       <w:pPr>
         <w:keepNext w:val="0"/>
-        <w:spacing w:line="324" w:lineRule="auto" w:before="0" w:after="100"/>
+        <w:spacing w:line="360" w:lineRule="auto" w:before="0" w:after="100"/>
       </w:pPr>
       <w:r>
         <w:rPr>
@@ -21010,13 +21133,13 @@
           <w:color w:val="191919"/>
           <w:sz w:val="22"/>
         </w:rPr>
-        <w:t xml:space="preserve"> [Archivo en repositorio GitHub]. GitHub. Recuperado el 8 de mayo de 2026, de [https://github.com/gaspardip/symphony/blob/main/SPEC.md](https://github.com/gaspardip/symphony/blob/main/SPEC.md)</w:t>
+        <w:t xml:space="preserve"> [Archivo en repositorio GitHub]. GitHub. Recuperado el 8 de mayo de 2026, de https://github.com/gaspardip/symphony/blob/main/SPEC.md</w:t>
       </w:r>
     </w:p>
     <w:p>
       <w:pPr>
         <w:keepNext w:val="0"/>
-        <w:spacing w:line="324" w:lineRule="auto" w:before="0" w:after="100"/>
+        <w:spacing w:line="360" w:lineRule="auto" w:before="0" w:after="100"/>
       </w:pPr>
       <w:r>
         <w:rPr>
@@ -21046,13 +21169,13 @@
           <w:color w:val="191919"/>
           <w:sz w:val="22"/>
         </w:rPr>
-        <w:t xml:space="preserve"> [Archivo en repositorio GitHub]. GitHub. Recuperado el 8 de mayo de 2026, de [https://github.com/gaspardip/symphony/blob/main/.symphony/knowledge/architecture.md](https://github.com/gaspardip/symphony/blob/main/.symphony/knowledge/architecture.md)</w:t>
+        <w:t xml:space="preserve"> [Archivo en repositorio GitHub]. GitHub. Recuperado el 8 de mayo de 2026, de https://github.com/gaspardip/symphony/blob/main/.symphony/knowledge/architecture.md</w:t>
       </w:r>
     </w:p>
     <w:p>
       <w:pPr>
         <w:keepNext w:val="0"/>
-        <w:spacing w:line="324" w:lineRule="auto" w:before="0" w:after="100"/>
+        <w:spacing w:line="360" w:lineRule="auto" w:before="0" w:after="100"/>
       </w:pPr>
       <w:r>
         <w:rPr>
@@ -21082,13 +21205,13 @@
           <w:color w:val="191919"/>
           <w:sz w:val="22"/>
         </w:rPr>
-        <w:t xml:space="preserve"> [Archivo en repositorio GitHub]. GitHub. Recuperado el 8 de mayo de 2026, de [https://github.com/gaspardip/symphony/blob/main/.symphony/knowledge/product.md](https://github.com/gaspardip/symphony/blob/main/.symphony/knowledge/product.md)</w:t>
+        <w:t xml:space="preserve"> [Archivo en repositorio GitHub]. GitHub. Recuperado el 8 de mayo de 2026, de https://github.com/gaspardip/symphony/blob/main/.symphony/knowledge/product.md</w:t>
       </w:r>
     </w:p>
     <w:p>
       <w:pPr>
         <w:keepNext w:val="0"/>
-        <w:spacing w:line="324" w:lineRule="auto" w:before="0" w:after="100"/>
+        <w:spacing w:line="360" w:lineRule="auto" w:before="0" w:after="100"/>
       </w:pPr>
       <w:r>
         <w:rPr>
@@ -21118,13 +21241,13 @@
           <w:color w:val="191919"/>
           <w:sz w:val="22"/>
         </w:rPr>
-        <w:t xml:space="preserve"> [Archivo en repositorio GitHub]. GitHub. Recuperado el 8 de mayo de 2026, de [https://github.com/gaspardip/symphony/blob/main/docs/AGENT_HARNESS.md](https://github.com/gaspardip/symphony/blob/main/docs/AGENT_HARNESS.md)</w:t>
+        <w:t xml:space="preserve"> [Archivo en repositorio GitHub]. GitHub. Recuperado el 8 de mayo de 2026, de https://github.com/gaspardip/symphony/blob/main/docs/AGENT_HARNESS.md</w:t>
       </w:r>
     </w:p>
     <w:p>
       <w:pPr>
         <w:keepNext w:val="0"/>
-        <w:spacing w:line="324" w:lineRule="auto" w:before="0" w:after="100"/>
+        <w:spacing w:line="360" w:lineRule="auto" w:before="0" w:after="100"/>
       </w:pPr>
       <w:r>
         <w:rPr>
@@ -21154,13 +21277,13 @@
           <w:color w:val="191919"/>
           <w:sz w:val="22"/>
         </w:rPr>
-        <w:t xml:space="preserve"> [Archivo en repositorio GitHub]. GitHub. Recuperado el 8 de mayo de 2026, de [https://github.com/gaspardip/symphony/blob/main/.symphony/harness.yml](https://github.com/gaspardip/symphony/blob/main/.symphony/harness.yml)</w:t>
+        <w:t xml:space="preserve"> [Archivo en repositorio GitHub]. GitHub. Recuperado el 8 de mayo de 2026, de https://github.com/gaspardip/symphony/blob/main/.symphony/harness.yml</w:t>
       </w:r>
     </w:p>
     <w:p>
       <w:pPr>
         <w:keepNext w:val="0"/>
-        <w:spacing w:line="324" w:lineRule="auto" w:before="0" w:after="100"/>
+        <w:spacing w:line="360" w:lineRule="auto" w:before="0" w:after="100"/>
       </w:pPr>
       <w:r>
         <w:rPr>
@@ -21190,13 +21313,13 @@
           <w:color w:val="191919"/>
           <w:sz w:val="22"/>
         </w:rPr>
-        <w:t>. Recuperado el 8 de mayo de 2026, de [https://elixir-lang.org/docs.html](https://elixir-lang.org/docs.html)</w:t>
+        <w:t>. Recuperado el 8 de mayo de 2026, de https://elixir-lang.org/docs.html</w:t>
       </w:r>
     </w:p>
     <w:p>
       <w:pPr>
         <w:keepNext w:val="0"/>
-        <w:spacing w:line="324" w:lineRule="auto" w:before="0" w:after="100"/>
+        <w:spacing w:line="360" w:lineRule="auto" w:before="0" w:after="100"/>
       </w:pPr>
       <w:r>
         <w:rPr>
@@ -21226,13 +21349,13 @@
           <w:color w:val="191919"/>
           <w:sz w:val="22"/>
         </w:rPr>
-        <w:t>. Recuperado el 8 de mayo de 2026, de [https://docs.github.com/copilot/concepts/about-copilot-coding-agent](https://docs.github.com/copilot/concepts/about-copilot-coding-agent)</w:t>
+        <w:t>. Recuperado el 8 de mayo de 2026, de https://docs.github.com/copilot/concepts/about-copilot-coding-agent</w:t>
       </w:r>
     </w:p>
     <w:p>
       <w:pPr>
         <w:keepNext w:val="0"/>
-        <w:spacing w:line="324" w:lineRule="auto" w:before="0" w:after="100"/>
+        <w:spacing w:line="360" w:lineRule="auto" w:before="0" w:after="100"/>
       </w:pPr>
       <w:r>
         <w:rPr>
@@ -21262,13 +21385,13 @@
           <w:color w:val="191919"/>
           <w:sz w:val="22"/>
         </w:rPr>
-        <w:t>. Recuperado el 8 de mayo de 2026, de [https://docs.github.com/articles/about-protected-branches](https://docs.github.com/articles/about-protected-branches)</w:t>
+        <w:t>. Recuperado el 8 de mayo de 2026, de https://docs.github.com/articles/about-protected-branches</w:t>
       </w:r>
     </w:p>
     <w:p>
       <w:pPr>
         <w:keepNext w:val="0"/>
-        <w:spacing w:line="324" w:lineRule="auto" w:before="0" w:after="100"/>
+        <w:spacing w:line="360" w:lineRule="auto" w:before="0" w:after="100"/>
       </w:pPr>
       <w:r>
         <w:rPr>
@@ -21298,13 +21421,13 @@
           <w:color w:val="191919"/>
           <w:sz w:val="22"/>
         </w:rPr>
-        <w:t>. Recuperado el 8 de mayo de 2026, de [https://docs.github.com/en/actions](https://docs.github.com/en/actions)</w:t>
+        <w:t>. Recuperado el 8 de mayo de 2026, de https://docs.github.com/en/actions</w:t>
       </w:r>
     </w:p>
     <w:p>
       <w:pPr>
         <w:keepNext w:val="0"/>
-        <w:spacing w:line="324" w:lineRule="auto" w:before="0" w:after="100"/>
+        <w:spacing w:line="360" w:lineRule="auto" w:before="0" w:after="100"/>
       </w:pPr>
       <w:r>
         <w:rPr>
@@ -21334,13 +21457,13 @@
           <w:color w:val="191919"/>
           <w:sz w:val="22"/>
         </w:rPr>
-        <w:t>. Recuperado el 8 de mayo de 2026, de [https://standards.ieee.org/standard/830-1998.html](https://standards.ieee.org/standard/830-1998.html)</w:t>
+        <w:t>. Recuperado el 8 de mayo de 2026, de https://standards.ieee.org/standard/830-1998.html</w:t>
       </w:r>
     </w:p>
     <w:p>
       <w:pPr>
         <w:keepNext w:val="0"/>
-        <w:spacing w:line="324" w:lineRule="auto" w:before="0" w:after="100"/>
+        <w:spacing w:line="360" w:lineRule="auto" w:before="0" w:after="100"/>
       </w:pPr>
       <w:r>
         <w:rPr>
@@ -21370,13 +21493,13 @@
           <w:color w:val="191919"/>
           <w:sz w:val="22"/>
         </w:rPr>
-        <w:t>. Recuperado el 8 de mayo de 2026, de [https://www.iso.org/standard/72089.html](https://www.iso.org/standard/72089.html)</w:t>
+        <w:t>. Recuperado el 8 de mayo de 2026, de https://www.iso.org/standard/72089.html</w:t>
       </w:r>
     </w:p>
     <w:p>
       <w:pPr>
         <w:keepNext w:val="0"/>
-        <w:spacing w:line="324" w:lineRule="auto" w:before="0" w:after="100"/>
+        <w:spacing w:line="360" w:lineRule="auto" w:before="0" w:after="100"/>
       </w:pPr>
       <w:r>
         <w:rPr>
@@ -21406,13 +21529,13 @@
           <w:color w:val="191919"/>
           <w:sz w:val="22"/>
         </w:rPr>
-        <w:t>. Recuperado el 8 de mayo de 2026, de [https://docs.langchain.com/oss/python/langgraph/durable-execution](https://docs.langchain.com/oss/python/langgraph/durable-execution)</w:t>
+        <w:t>. Recuperado el 8 de mayo de 2026, de https://docs.langchain.com/oss/python/langgraph/durable-execution</w:t>
       </w:r>
     </w:p>
     <w:p>
       <w:pPr>
         <w:keepNext w:val="0"/>
-        <w:spacing w:line="324" w:lineRule="auto" w:before="0" w:after="100"/>
+        <w:spacing w:line="360" w:lineRule="auto" w:before="0" w:after="100"/>
       </w:pPr>
       <w:r>
         <w:rPr>
@@ -21442,13 +21565,13 @@
           <w:color w:val="191919"/>
           <w:sz w:val="22"/>
         </w:rPr>
-        <w:t>. Recuperado el 8 de mayo de 2026, de [https://docs.langchain.com/oss/python/langchain/human-in-the-loop](https://docs.langchain.com/oss/python/langchain/human-in-the-loop)</w:t>
+        <w:t>. Recuperado el 8 de mayo de 2026, de https://docs.langchain.com/oss/python/langchain/human-in-the-loop</w:t>
       </w:r>
     </w:p>
     <w:p>
       <w:pPr>
         <w:keepNext w:val="0"/>
-        <w:spacing w:line="324" w:lineRule="auto" w:before="0" w:after="100"/>
+        <w:spacing w:line="360" w:lineRule="auto" w:before="0" w:after="100"/>
       </w:pPr>
       <w:r>
         <w:rPr>
@@ -21478,13 +21601,13 @@
           <w:color w:val="191919"/>
           <w:sz w:val="22"/>
         </w:rPr>
-        <w:t>. OpenAI. Recuperado el 8 de mayo de 2026, de [https://openai.com/index/harness-engineering/](https://openai.com/index/harness-engineering/)</w:t>
+        <w:t>. OpenAI. Recuperado el 8 de mayo de 2026, de https://openai.com/index/harness-engineering/</w:t>
       </w:r>
     </w:p>
     <w:p>
       <w:pPr>
         <w:keepNext w:val="0"/>
-        <w:spacing w:line="324" w:lineRule="auto" w:before="0" w:after="100"/>
+        <w:spacing w:line="360" w:lineRule="auto" w:before="0" w:after="100"/>
       </w:pPr>
       <w:r>
         <w:rPr>
@@ -21514,13 +21637,13 @@
           <w:color w:val="191919"/>
           <w:sz w:val="22"/>
         </w:rPr>
-        <w:t>. Recuperado el 8 de mayo de 2026, de [https://www.openpolicyagent.org/docs](https://www.openpolicyagent.org/docs)</w:t>
+        <w:t>. Recuperado el 8 de mayo de 2026, de https://www.openpolicyagent.org/docs</w:t>
       </w:r>
     </w:p>
     <w:p>
       <w:pPr>
         <w:keepNext w:val="0"/>
-        <w:spacing w:line="324" w:lineRule="auto" w:before="0" w:after="100"/>
+        <w:spacing w:line="360" w:lineRule="auto" w:before="0" w:after="100"/>
       </w:pPr>
       <w:r>
         <w:rPr>
@@ -21550,13 +21673,13 @@
           <w:color w:val="191919"/>
           <w:sz w:val="22"/>
         </w:rPr>
-        <w:t xml:space="preserve"> [Archivo en repositorio GitHub]. GitHub. Recuperado el 8 de mayo de 2026, de [https://github.com/openai/symphony/blob/main/SPEC.md](https://github.com/openai/symphony/blob/main/SPEC.md)</w:t>
+        <w:t xml:space="preserve"> [Archivo en repositorio GitHub]. GitHub. Recuperado el 8 de mayo de 2026, de https://github.com/openai/symphony/blob/main/SPEC.md</w:t>
       </w:r>
     </w:p>
     <w:p>
       <w:pPr>
         <w:keepNext w:val="0"/>
-        <w:spacing w:line="324" w:lineRule="auto" w:before="0" w:after="100"/>
+        <w:spacing w:line="360" w:lineRule="auto" w:before="0" w:after="100"/>
       </w:pPr>
       <w:r>
         <w:rPr>
@@ -21586,13 +21709,13 @@
           <w:color w:val="191919"/>
           <w:sz w:val="22"/>
         </w:rPr>
-        <w:t xml:space="preserve"> [Archivo en repositorio GitHub]. GitHub. Recuperado el 8 de mayo de 2026, de [https://github.com/openai/symphony/blob/main/elixir/README.md](https://github.com/openai/symphony/blob/main/elixir/README.md)</w:t>
+        <w:t xml:space="preserve"> [Archivo en repositorio GitHub]. GitHub. Recuperado el 8 de mayo de 2026, de https://github.com/openai/symphony/blob/main/elixir/README.md</w:t>
       </w:r>
     </w:p>
     <w:p>
       <w:pPr>
         <w:keepNext w:val="0"/>
-        <w:spacing w:line="324" w:lineRule="auto" w:before="0" w:after="100"/>
+        <w:spacing w:line="360" w:lineRule="auto" w:before="0" w:after="100"/>
       </w:pPr>
       <w:r>
         <w:rPr>
@@ -21622,13 +21745,13 @@
           <w:color w:val="191919"/>
           <w:sz w:val="22"/>
         </w:rPr>
-        <w:t>. Recuperado el 8 de mayo de 2026, de [https://docs.openhands.dev/openhands/usage/how-to/github-action](https://docs.openhands.dev/openhands/usage/how-to/github-action)</w:t>
+        <w:t>. Recuperado el 8 de mayo de 2026, de https://docs.openhands.dev/openhands/usage/how-to/github-action</w:t>
       </w:r>
     </w:p>
     <w:p>
       <w:pPr>
         <w:keepNext w:val="0"/>
-        <w:spacing w:line="324" w:lineRule="auto" w:before="0" w:after="100"/>
+        <w:spacing w:line="360" w:lineRule="auto" w:before="0" w:after="100"/>
       </w:pPr>
       <w:r>
         <w:rPr>
@@ -21658,13 +21781,13 @@
           <w:color w:val="191919"/>
           <w:sz w:val="22"/>
         </w:rPr>
-        <w:t xml:space="preserve"> [Repositorio GitHub]. GitHub. Recuperado el 8 de mayo de 2026, de [https://github.com/phoenixframework/phoenix_live_view](https://github.com/phoenixframework/phoenix_live_view)</w:t>
+        <w:t xml:space="preserve"> [Repositorio GitHub]. GitHub. Recuperado el 8 de mayo de 2026, de https://github.com/phoenixframework/phoenix_live_view</w:t>
       </w:r>
     </w:p>
     <w:p>
       <w:pPr>
         <w:keepNext w:val="0"/>
-        <w:spacing w:line="324" w:lineRule="auto" w:before="0" w:after="100"/>
+        <w:spacing w:line="360" w:lineRule="auto" w:before="0" w:after="100"/>
       </w:pPr>
       <w:r>
         <w:rPr>
@@ -21694,7 +21817,7 @@
           <w:color w:val="191919"/>
           <w:sz w:val="22"/>
         </w:rPr>
-        <w:t>. Recuperado el 8 de mayo de 2026, de [https://prometheus.io/docs/introduction/overview/](https://prometheus.io/docs/introduction/overview/)</w:t>
+        <w:t>. Recuperado el 8 de mayo de 2026, de https://prometheus.io/docs/introduction/overview/</w:t>
       </w:r>
     </w:p>
     <w:p>
@@ -21710,7 +21833,7 @@
       <w:pPr>
         <w:pStyle w:val="Heading2"/>
         <w:keepNext/>
-        <w:spacing w:line="276" w:lineRule="auto" w:before="200" w:after="100"/>
+        <w:spacing w:line="360" w:lineRule="auto" w:before="200" w:after="100"/>
       </w:pPr>
       <w:r>
         <w:rPr>
@@ -21726,7 +21849,7 @@
     <w:p>
       <w:pPr>
         <w:keepNext w:val="0"/>
-        <w:spacing w:line="324" w:lineRule="auto" w:before="0" w:after="100"/>
+        <w:spacing w:line="360" w:lineRule="auto" w:before="0" w:after="100"/>
       </w:pPr>
       <w:r>
         <w:rPr>
@@ -21743,7 +21866,7 @@
       <w:pPr>
         <w:pStyle w:val="Heading3"/>
         <w:keepNext/>
-        <w:spacing w:line="276" w:lineRule="auto" w:before="120" w:after="60"/>
+        <w:spacing w:line="360" w:lineRule="auto" w:before="120" w:after="60"/>
       </w:pPr>
       <w:r>
         <w:rPr>
@@ -22952,7 +23075,7 @@
     <w:p>
       <w:pPr>
         <w:keepNext/>
-        <w:spacing w:line="276" w:lineRule="auto" w:before="40" w:after="100"/>
+        <w:spacing w:line="360" w:lineRule="auto" w:before="40" w:after="100"/>
         <w:pBdr>
           <w:bottom w:val="single" w:sz="8" w:space="4" w:color="D9E2F3"/>
         </w:pBdr>
@@ -22971,7 +23094,7 @@
     <w:p>
       <w:pPr>
         <w:keepNext w:val="0"/>
-        <w:spacing w:line="324" w:lineRule="auto" w:before="0" w:after="100"/>
+        <w:spacing w:line="360" w:lineRule="auto" w:before="0" w:after="100"/>
       </w:pPr>
       <w:r>
         <w:rPr>
@@ -22988,7 +23111,7 @@
       <w:pPr>
         <w:pStyle w:val="Heading3"/>
         <w:keepNext/>
-        <w:spacing w:line="276" w:lineRule="auto" w:before="120" w:after="60"/>
+        <w:spacing w:line="360" w:lineRule="auto" w:before="120" w:after="60"/>
       </w:pPr>
       <w:r>
         <w:rPr>
@@ -23004,7 +23127,7 @@
     <w:p>
       <w:pPr>
         <w:keepNext w:val="0"/>
-        <w:spacing w:line="324" w:lineRule="auto" w:before="0" w:after="100"/>
+        <w:spacing w:line="360" w:lineRule="auto" w:before="0" w:after="100"/>
       </w:pPr>
       <w:r>
         <w:rPr>
@@ -23034,13 +23157,13 @@
           <w:color w:val="191919"/>
           <w:sz w:val="22"/>
         </w:rPr>
-        <w:t xml:space="preserve"> [Repositorio GitHub]. GitHub. Recuperado el 8 de mayo de 2026, de [https://github.com/All-Hands-AI/openhands-github-action](https://github.com/All-Hands-AI/openhands-github-action)</w:t>
+        <w:t xml:space="preserve"> [Repositorio GitHub]. GitHub. Recuperado el 8 de mayo de 2026, de https://github.com/All-Hands-AI/openhands-github-action</w:t>
       </w:r>
     </w:p>
     <w:p>
       <w:pPr>
         <w:keepNext w:val="0"/>
-        <w:spacing w:line="324" w:lineRule="auto" w:before="0" w:after="100"/>
+        <w:spacing w:line="360" w:lineRule="auto" w:before="0" w:after="100"/>
       </w:pPr>
       <w:r>
         <w:rPr>
@@ -23070,13 +23193,13 @@
           <w:color w:val="191919"/>
           <w:sz w:val="22"/>
         </w:rPr>
-        <w:t>. Recuperado el 8 de mayo de 2026, de [https://docs.github.com/en/copilot/how-tos/use-copilot-agents/manage-agents](https://docs.github.com/en/copilot/how-tos/use-copilot-agents/manage-agents)</w:t>
+        <w:t>. Recuperado el 8 de mayo de 2026, de https://docs.github.com/en/copilot/how-tos/use-copilot-agents/manage-agents</w:t>
       </w:r>
     </w:p>
     <w:p>
       <w:pPr>
         <w:keepNext w:val="0"/>
-        <w:spacing w:line="324" w:lineRule="auto" w:before="0" w:after="100"/>
+        <w:spacing w:line="360" w:lineRule="auto" w:before="0" w:after="100"/>
       </w:pPr>
       <w:r>
         <w:rPr>
@@ -23106,13 +23229,13 @@
           <w:color w:val="191919"/>
           <w:sz w:val="22"/>
         </w:rPr>
-        <w:t>. Recuperado el 8 de mayo de 2026, de [https://docs.github.com/en/copilot/how-tos/use-copilot-agents/cloud-agent/start-copilot-sessions](https://docs.github.com/en/copilot/how-tos/use-copilot-agents/cloud-agent/start-copilot-sessions)</w:t>
+        <w:t>. Recuperado el 8 de mayo de 2026, de https://docs.github.com/en/copilot/how-tos/use-copilot-agents/cloud-agent/start-copilot-sessions</w:t>
       </w:r>
     </w:p>
     <w:p>
       <w:pPr>
         <w:keepNext w:val="0"/>
-        <w:spacing w:line="324" w:lineRule="auto" w:before="0" w:after="100"/>
+        <w:spacing w:line="360" w:lineRule="auto" w:before="0" w:after="100"/>
       </w:pPr>
       <w:r>
         <w:rPr>
@@ -23142,13 +23265,13 @@
           <w:color w:val="191919"/>
           <w:sz w:val="22"/>
         </w:rPr>
-        <w:t>. Recuperado el 8 de mayo de 2026, de [https://docs.langchain.com/oss/python/langgraph/](https://docs.langchain.com/oss/python/langgraph/)</w:t>
+        <w:t>. Recuperado el 8 de mayo de 2026, de https://docs.langchain.com/oss/python/langgraph/</w:t>
       </w:r>
     </w:p>
     <w:p>
       <w:pPr>
         <w:keepNext w:val="0"/>
-        <w:spacing w:line="324" w:lineRule="auto" w:before="0" w:after="100"/>
+        <w:spacing w:line="360" w:lineRule="auto" w:before="0" w:after="100"/>
       </w:pPr>
       <w:r>
         <w:rPr>
@@ -23178,13 +23301,13 @@
           <w:color w:val="191919"/>
           <w:sz w:val="22"/>
         </w:rPr>
-        <w:t>. Recuperado el 8 de mayo de 2026, de [https://openai.com/index/open-source-codex-orchestration-symphony/](https://openai.com/index/open-source-codex-orchestration-symphony/)</w:t>
+        <w:t>. Recuperado el 8 de mayo de 2026, de https://openai.com/index/open-source-codex-orchestration-symphony/</w:t>
       </w:r>
     </w:p>
     <w:p>
       <w:pPr>
         <w:keepNext w:val="0"/>
-        <w:spacing w:line="324" w:lineRule="auto" w:before="0" w:after="100"/>
+        <w:spacing w:line="360" w:lineRule="auto" w:before="0" w:after="100"/>
       </w:pPr>
       <w:r>
         <w:rPr>
@@ -23214,14 +23337,14 @@
           <w:color w:val="191919"/>
           <w:sz w:val="22"/>
         </w:rPr>
-        <w:t>. Recuperado el 8 de mayo de 2026, de [https://developers.openai.com/](https://developers.openai.com/)</w:t>
+        <w:t>. Recuperado el 8 de mayo de 2026, de https://developers.openai.com/</w:t>
       </w:r>
     </w:p>
     <w:p>
       <w:pPr>
         <w:pStyle w:val="Heading3"/>
         <w:keepNext/>
-        <w:spacing w:line="276" w:lineRule="auto" w:before="120" w:after="60"/>
+        <w:spacing w:line="360" w:lineRule="auto" w:before="120" w:after="60"/>
       </w:pPr>
       <w:r>
         <w:rPr>
@@ -23237,7 +23360,7 @@
     <w:p>
       <w:pPr>
         <w:keepNext w:val="0"/>
-        <w:spacing w:line="324" w:lineRule="auto" w:before="0" w:after="100"/>
+        <w:spacing w:line="360" w:lineRule="auto" w:before="0" w:after="100"/>
       </w:pPr>
       <w:r>
         <w:rPr>
@@ -23273,7 +23396,7 @@
     <w:p>
       <w:pPr>
         <w:keepNext w:val="0"/>
-        <w:spacing w:line="324" w:lineRule="auto" w:before="0" w:after="100"/>
+        <w:spacing w:line="360" w:lineRule="auto" w:before="0" w:after="100"/>
       </w:pPr>
       <w:r>
         <w:rPr>
@@ -23581,6 +23704,76 @@
   </w:num>
   <w:num w:numId="9">
     <w:abstractNumId w:val="0"/>
+  </w:num>
+  <w:abstractNum w:abstractNumId="9">
+    <w:lvl w:ilvl="0">
+      <w:start w:val="1"/>
+      <w:numFmt w:val="decimal"/>
+      <w:lvlText w:val="%1."/>
+      <w:lvlJc w:val="left"/>
+      <w:pPr>
+        <w:ind w:left="720" w:hanging="360"/>
+      </w:pPr>
+    </w:lvl>
+  </w:abstractNum>
+  <w:num w:numId="10">
+    <w:abstractNumId w:val="9"/>
+  </w:num>
+  <w:abstractNum w:abstractNumId="10">
+    <w:lvl w:ilvl="0">
+      <w:start w:val="1"/>
+      <w:numFmt w:val="decimal"/>
+      <w:lvlText w:val="%1."/>
+      <w:lvlJc w:val="left"/>
+      <w:pPr>
+        <w:ind w:left="720" w:hanging="360"/>
+      </w:pPr>
+    </w:lvl>
+  </w:abstractNum>
+  <w:num w:numId="11">
+    <w:abstractNumId w:val="10"/>
+  </w:num>
+  <w:abstractNum w:abstractNumId="11">
+    <w:lvl w:ilvl="0">
+      <w:start w:val="1"/>
+      <w:numFmt w:val="decimal"/>
+      <w:lvlText w:val="%1."/>
+      <w:lvlJc w:val="left"/>
+      <w:pPr>
+        <w:ind w:left="720" w:hanging="360"/>
+      </w:pPr>
+    </w:lvl>
+  </w:abstractNum>
+  <w:num w:numId="12">
+    <w:abstractNumId w:val="11"/>
+  </w:num>
+  <w:abstractNum w:abstractNumId="12">
+    <w:lvl w:ilvl="0">
+      <w:start w:val="1"/>
+      <w:numFmt w:val="decimal"/>
+      <w:lvlText w:val="%1."/>
+      <w:lvlJc w:val="left"/>
+      <w:pPr>
+        <w:ind w:left="720" w:hanging="360"/>
+      </w:pPr>
+    </w:lvl>
+  </w:abstractNum>
+  <w:num w:numId="13">
+    <w:abstractNumId w:val="12"/>
+  </w:num>
+  <w:abstractNum w:abstractNumId="13">
+    <w:lvl w:ilvl="0">
+      <w:start w:val="1"/>
+      <w:numFmt w:val="decimal"/>
+      <w:lvlText w:val="%1."/>
+      <w:lvlJc w:val="left"/>
+      <w:pPr>
+        <w:ind w:left="720" w:hanging="360"/>
+      </w:pPr>
+    </w:lvl>
+  </w:abstractNum>
+  <w:num w:numId="14">
+    <w:abstractNumId w:val="13"/>
   </w:num>
 </w:numbering>
 </file>
@@ -23809,7 +24002,7 @@
     <w:pPr>
       <w:keepNext/>
       <w:keepLines/>
-      <w:spacing w:before="240" w:after="120" w:line="288" w:lineRule="auto"/>
+      <w:spacing w:before="240" w:after="120" w:line="360" w:lineRule="auto"/>
       <w:outlineLvl w:val="0"/>
     </w:pPr>
     <w:rPr>
@@ -23833,7 +24026,7 @@
     <w:pPr>
       <w:keepNext/>
       <w:keepLines/>
-      <w:spacing w:before="200" w:after="80" w:line="288" w:lineRule="auto"/>
+      <w:spacing w:before="200" w:after="80" w:line="360" w:lineRule="auto"/>
       <w:outlineLvl w:val="1"/>
     </w:pPr>
     <w:rPr>
@@ -23857,7 +24050,7 @@
     <w:pPr>
       <w:keepNext/>
       <w:keepLines/>
-      <w:spacing w:before="160" w:after="60" w:line="288" w:lineRule="auto"/>
+      <w:spacing w:before="160" w:after="60" w:line="360" w:lineRule="auto"/>
       <w:outlineLvl w:val="2"/>
     </w:pPr>
     <w:rPr>
@@ -23881,7 +24074,7 @@
     <w:pPr>
       <w:keepNext/>
       <w:keepLines/>
-      <w:spacing w:before="120" w:after="40" w:line="288" w:lineRule="auto"/>
+      <w:spacing w:before="120" w:after="40" w:line="360" w:lineRule="auto"/>
       <w:outlineLvl w:val="3"/>
     </w:pPr>
     <w:rPr>

</xml_diff>

<commit_message>
docs: localize thesis abstract
</commit_message>
<xml_diff>
--- a/tesis/entrega/plan-tesis-proyecto-final-integrador.docx
+++ b/tesis/entrega/plan-tesis-proyecto-final-integrador.docx
@@ -1978,7 +1978,7 @@
           <w:color w:val="191919"/>
           <w:sz w:val="22"/>
         </w:rPr>
-        <w:t xml:space="preserve"> —puntos de control basados en evidencia—, observabilidad operativa y recuperación ante fallas.</w:t>
+        <w:t xml:space="preserve"> (puntos de control basados en evidencia), observabilidad operativa y recuperación ante fallas.</w:t>
       </w:r>
     </w:p>
     <w:p>
@@ -2138,7 +2138,7 @@
           <w:color w:val="191919"/>
           <w:sz w:val="22"/>
         </w:rPr>
-        <w:t>This thesis plan proposes the design, implementation, and validation of a runtime architecture for issue-based autonomous software delivery. The problem addressed is the gap between the current ability of artificial intelligence agents to generate code changes and the need to execute those changes within a software engineering process that is controllable, auditable, recoverable, and validated through evidence.</w:t>
+        <w:t>Este plan de tesis propone el diseño, implementación y validación de una arquitectura de runtime para delivery autónomo de software basado en issues. El problema abordado es la brecha entre la capacidad actual de los agentes de inteligencia artificial para generar cambios de código y la necesidad de ejecutar esos cambios dentro de un proceso de ingeniería de software controlable, auditable, recuperable y validado por evidencia.</w:t>
       </w:r>
     </w:p>
     <w:p>
@@ -2154,7 +2154,7 @@
           <w:color w:val="191919"/>
           <w:sz w:val="22"/>
         </w:rPr>
-        <w:t xml:space="preserve">The proposal uses Symphony, particularly the </w:t>
+        <w:t xml:space="preserve">La propuesta utiliza Symphony, en particular el repositorio </w:t>
       </w:r>
       <w:r>
         <w:rPr>
@@ -2174,7 +2174,7 @@
           <w:color w:val="191919"/>
           <w:sz w:val="22"/>
         </w:rPr>
-        <w:t xml:space="preserve"> repository, as an experimental basis. The goal is not to build a new programming agent, but to formalize and validate a control layer that transforms issue-based work intake into isolated task executions with repository-versioned policies, proof gates, operational observability, and failure recovery mechanisms.</w:t>
+        <w:t>, como base experimental. El objetivo no es construir un nuevo agente de programación, sino formalizar y validar una capa de control que transforme trabajo basado en issues en ejecuciones aisladas por tarea, con políticas versionadas en el repositorio, proof gates, observabilidad operativa y mecanismos de recuperación ante fallas.</w:t>
       </w:r>
     </w:p>
     <w:p>
@@ -2190,7 +2190,7 @@
           <w:color w:val="191919"/>
           <w:sz w:val="22"/>
         </w:rPr>
-        <w:t>Validation will be performed through baseline software tests, reproducible real-world scenarios, and metrics related to traceability, recoverability, correct gate blocking, evidence completeness, observability, and operational diagnosis. The expected result is a functional prototype or verifiable adaptation over Symphony, a documented architecture, a traceability matrix connecting gaps, requirements, components, tests, and metrics, and a technical evaluation of the proposed approach.</w:t>
+        <w:t>La validación se realizará mediante pruebas basales del software, escenarios reales reproducibles y métricas vinculadas con trazabilidad, recuperabilidad, bloqueo correcto por gates, completitud de evidencia, observabilidad y diagnóstico operacional. El resultado esperado es un prototipo funcional o adaptación verificable sobre Symphony, una arquitectura documentada, una matriz de trazabilidad que conecte vacancias, requisitos, componentes, pruebas y métricas, y una evaluación técnica del enfoque propuesto.</w:t>
       </w:r>
     </w:p>
     <w:p>
@@ -2232,7 +2232,7 @@
           <w:color w:val="191919"/>
           <w:sz w:val="22"/>
         </w:rPr>
-        <w:t>Software agents; software engineering; autonomous delivery; continuous integration; observability; proof gates; policy-as-code; runtime; issues; Symphony.</w:t>
+        <w:t>Agentes de software; ingeniería de software; delivery autónomo; integración continua; observabilidad; proof gates; policy-as-code; runtime; issues; Symphony.</w:t>
       </w:r>
     </w:p>
     <w:p>
@@ -2438,7 +2438,7 @@
           <w:color w:val="191919"/>
           <w:sz w:val="22"/>
         </w:rPr>
-        <w:t xml:space="preserve"> (Dip, 2026a). Symphony se presenta como un motor de delivery autónomo donde el runtime es dueño del flujo operativo. En el proyecto se documentan componentes como un servicio de orquestación en Elixir/OTP —donde OTP significa </w:t>
+        <w:t xml:space="preserve"> (Dip, 2026a). Symphony se presenta como un motor de delivery autónomo donde el runtime es dueño del flujo operativo. En el proyecto se documentan componentes como un servicio de orquestación en Elixir/OTP (OTP significa </w:t>
       </w:r>
       <w:r>
         <w:rPr>
@@ -2458,7 +2458,7 @@
           <w:color w:val="191919"/>
           <w:sz w:val="22"/>
         </w:rPr>
-        <w:t>, conjunto de bibliotecas y patrones de Erlang/Elixir para construir sistemas concurrentes y tolerantes a fallas—, intake desde Linear y carga manual, webhooks de GitHub, workspaces aislados por issue, API JSON —interfaz de programación de aplicaciones que intercambia datos en formato JavaScript Object Notation—, métricas Prometheus y un harness versionado en el repositorio (Dip, 2026a, 2026b, 2026e, 2026f).</w:t>
+        <w:t>, conjunto de bibliotecas y patrones de Erlang/Elixir para construir sistemas concurrentes y tolerantes a fallas), intake desde Linear y carga manual, webhooks de GitHub, workspaces aislados por issue, API JSON (interfaz de programación de aplicaciones que intercambia datos en formato JavaScript Object Notation), métricas Prometheus y un harness versionado en el repositorio (Dip, 2026a, 2026b, 2026e, 2026f).</w:t>
       </w:r>
     </w:p>
     <w:p>
@@ -4677,7 +4677,7 @@
           <w:color w:val="191919"/>
           <w:sz w:val="22"/>
         </w:rPr>
-        <w:t>La solución preliminar consiste en un marco integrador —framework— de runtime que actúe como capa de control entre el intake de trabajo y la ejecución de agentes de software.</w:t>
+        <w:t>La solución preliminar consiste en un marco integrador (framework) de runtime que actúe como capa de control entre el intake de trabajo y la ejecución de agentes de software.</w:t>
       </w:r>
     </w:p>
     <w:p>
@@ -21483,7 +21483,7 @@
           <w:color w:val="191919"/>
           <w:sz w:val="22"/>
         </w:rPr>
-        <w:t>ISO/IEC/IEEE 29148:2018 Systems and software engineering — Life cycle processes — Requirements engineering</w:t>
+        <w:t>ISO/IEC/IEEE 29148:2018 Systems and software engineering - Life cycle processes - Requirements engineering</w:t>
       </w:r>
       <w:r>
         <w:rPr>
@@ -22633,6 +22633,860 @@
                 <w:sz w:val="15"/>
               </w:rPr>
               <w:t>Human in the Loop: intervención humana dentro de un proceso automatizado.</w:t>
+            </w:r>
+          </w:p>
+        </w:tc>
+      </w:tr>
+      <w:tr>
+        <w:tc>
+          <w:tcPr>
+            <w:tcW w:type="dxa" w:w="2600"/>
+            <w:shd w:fill="F8FAFC"/>
+            <w:vAlign w:val="center"/>
+            <w:tcMar>
+              <w:top w:w="90" w:type="dxa"/>
+              <w:start w:w="100" w:type="dxa"/>
+              <w:bottom w:w="90" w:type="dxa"/>
+              <w:end w:w="100" w:type="dxa"/>
+            </w:tcMar>
+          </w:tcPr>
+          <w:p>
+            <w:pPr>
+              <w:keepNext w:val="0"/>
+              <w:spacing w:line="259" w:lineRule="auto" w:before="0" w:after="0"/>
+            </w:pPr>
+            <w:r/>
+            <w:r>
+              <w:rPr>
+                <w:rFonts w:ascii="Times New Roman" w:hAnsi="Times New Roman" w:eastAsia="Times New Roman"/>
+                <w:b w:val="0"/>
+                <w:i w:val="0"/>
+                <w:color w:val="191919"/>
+                <w:sz w:val="15"/>
+              </w:rPr>
+              <w:t>Delivery</w:t>
+            </w:r>
+          </w:p>
+        </w:tc>
+        <w:tc>
+          <w:tcPr>
+            <w:tcW w:type="dxa" w:w="6472"/>
+            <w:shd w:fill="F8FAFC"/>
+            <w:vAlign w:val="center"/>
+            <w:tcMar>
+              <w:top w:w="90" w:type="dxa"/>
+              <w:start w:w="100" w:type="dxa"/>
+              <w:bottom w:w="90" w:type="dxa"/>
+              <w:end w:w="100" w:type="dxa"/>
+            </w:tcMar>
+          </w:tcPr>
+          <w:p>
+            <w:pPr>
+              <w:keepNext w:val="0"/>
+              <w:spacing w:line="259" w:lineRule="auto" w:before="0" w:after="0"/>
+            </w:pPr>
+            <w:r/>
+            <w:r>
+              <w:rPr>
+                <w:rFonts w:ascii="Times New Roman" w:hAnsi="Times New Roman" w:eastAsia="Times New Roman"/>
+                <w:b w:val="0"/>
+                <w:i w:val="0"/>
+                <w:color w:val="191919"/>
+                <w:sz w:val="15"/>
+              </w:rPr>
+              <w:t>Proceso por el cual una tarea de software pasa desde su definición hasta una salida revisable, integrable o desplegable.</w:t>
+            </w:r>
+          </w:p>
+        </w:tc>
+      </w:tr>
+      <w:tr>
+        <w:tc>
+          <w:tcPr>
+            <w:tcW w:type="dxa" w:w="2600"/>
+            <w:vAlign w:val="center"/>
+            <w:tcMar>
+              <w:top w:w="90" w:type="dxa"/>
+              <w:start w:w="100" w:type="dxa"/>
+              <w:bottom w:w="90" w:type="dxa"/>
+              <w:end w:w="100" w:type="dxa"/>
+            </w:tcMar>
+          </w:tcPr>
+          <w:p>
+            <w:pPr>
+              <w:keepNext w:val="0"/>
+              <w:spacing w:line="259" w:lineRule="auto" w:before="0" w:after="0"/>
+            </w:pPr>
+            <w:r/>
+            <w:r>
+              <w:rPr>
+                <w:rFonts w:ascii="Times New Roman" w:hAnsi="Times New Roman" w:eastAsia="Times New Roman"/>
+                <w:b w:val="0"/>
+                <w:i w:val="0"/>
+                <w:color w:val="191919"/>
+                <w:sz w:val="15"/>
+              </w:rPr>
+              <w:t>Issue-driven</w:t>
+            </w:r>
+          </w:p>
+        </w:tc>
+        <w:tc>
+          <w:tcPr>
+            <w:tcW w:type="dxa" w:w="6472"/>
+            <w:vAlign w:val="center"/>
+            <w:tcMar>
+              <w:top w:w="90" w:type="dxa"/>
+              <w:start w:w="100" w:type="dxa"/>
+              <w:bottom w:w="90" w:type="dxa"/>
+              <w:end w:w="100" w:type="dxa"/>
+            </w:tcMar>
+          </w:tcPr>
+          <w:p>
+            <w:pPr>
+              <w:keepNext w:val="0"/>
+              <w:spacing w:line="259" w:lineRule="auto" w:before="0" w:after="0"/>
+            </w:pPr>
+            <w:r/>
+            <w:r>
+              <w:rPr>
+                <w:rFonts w:ascii="Times New Roman" w:hAnsi="Times New Roman" w:eastAsia="Times New Roman"/>
+                <w:b w:val="0"/>
+                <w:i w:val="0"/>
+                <w:color w:val="191919"/>
+                <w:sz w:val="15"/>
+              </w:rPr>
+              <w:t>Enfoque en el cual la ejecución del trabajo se origina desde issues o tickets del sistema de seguimiento.</w:t>
+            </w:r>
+          </w:p>
+        </w:tc>
+      </w:tr>
+      <w:tr>
+        <w:tc>
+          <w:tcPr>
+            <w:tcW w:type="dxa" w:w="2600"/>
+            <w:shd w:fill="F8FAFC"/>
+            <w:vAlign w:val="center"/>
+            <w:tcMar>
+              <w:top w:w="90" w:type="dxa"/>
+              <w:start w:w="100" w:type="dxa"/>
+              <w:bottom w:w="90" w:type="dxa"/>
+              <w:end w:w="100" w:type="dxa"/>
+            </w:tcMar>
+          </w:tcPr>
+          <w:p>
+            <w:pPr>
+              <w:keepNext w:val="0"/>
+              <w:spacing w:line="259" w:lineRule="auto" w:before="0" w:after="0"/>
+            </w:pPr>
+            <w:r/>
+            <w:r>
+              <w:rPr>
+                <w:rFonts w:ascii="Times New Roman" w:hAnsi="Times New Roman" w:eastAsia="Times New Roman"/>
+                <w:b w:val="0"/>
+                <w:i w:val="0"/>
+                <w:color w:val="191919"/>
+                <w:sz w:val="15"/>
+              </w:rPr>
+              <w:t>Cloud agent</w:t>
+            </w:r>
+          </w:p>
+        </w:tc>
+        <w:tc>
+          <w:tcPr>
+            <w:tcW w:type="dxa" w:w="6472"/>
+            <w:shd w:fill="F8FAFC"/>
+            <w:vAlign w:val="center"/>
+            <w:tcMar>
+              <w:top w:w="90" w:type="dxa"/>
+              <w:start w:w="100" w:type="dxa"/>
+              <w:bottom w:w="90" w:type="dxa"/>
+              <w:end w:w="100" w:type="dxa"/>
+            </w:tcMar>
+          </w:tcPr>
+          <w:p>
+            <w:pPr>
+              <w:keepNext w:val="0"/>
+              <w:spacing w:line="259" w:lineRule="auto" w:before="0" w:after="0"/>
+            </w:pPr>
+            <w:r/>
+            <w:r>
+              <w:rPr>
+                <w:rFonts w:ascii="Times New Roman" w:hAnsi="Times New Roman" w:eastAsia="Times New Roman"/>
+                <w:b w:val="0"/>
+                <w:i w:val="0"/>
+                <w:color w:val="191919"/>
+                <w:sz w:val="15"/>
+              </w:rPr>
+              <w:t>Agente ejecutado en infraestructura administrada por una plataforma externa.</w:t>
+            </w:r>
+          </w:p>
+        </w:tc>
+      </w:tr>
+      <w:tr>
+        <w:tc>
+          <w:tcPr>
+            <w:tcW w:type="dxa" w:w="2600"/>
+            <w:vAlign w:val="center"/>
+            <w:tcMar>
+              <w:top w:w="90" w:type="dxa"/>
+              <w:start w:w="100" w:type="dxa"/>
+              <w:bottom w:w="90" w:type="dxa"/>
+              <w:end w:w="100" w:type="dxa"/>
+            </w:tcMar>
+          </w:tcPr>
+          <w:p>
+            <w:pPr>
+              <w:keepNext w:val="0"/>
+              <w:spacing w:line="259" w:lineRule="auto" w:before="0" w:after="0"/>
+            </w:pPr>
+            <w:r/>
+            <w:r>
+              <w:rPr>
+                <w:rFonts w:ascii="Times New Roman" w:hAnsi="Times New Roman" w:eastAsia="Times New Roman"/>
+                <w:b w:val="0"/>
+                <w:i w:val="0"/>
+                <w:color w:val="191919"/>
+                <w:sz w:val="15"/>
+              </w:rPr>
+              <w:t>Workspace</w:t>
+            </w:r>
+          </w:p>
+        </w:tc>
+        <w:tc>
+          <w:tcPr>
+            <w:tcW w:type="dxa" w:w="6472"/>
+            <w:vAlign w:val="center"/>
+            <w:tcMar>
+              <w:top w:w="90" w:type="dxa"/>
+              <w:start w:w="100" w:type="dxa"/>
+              <w:bottom w:w="90" w:type="dxa"/>
+              <w:end w:w="100" w:type="dxa"/>
+            </w:tcMar>
+          </w:tcPr>
+          <w:p>
+            <w:pPr>
+              <w:keepNext w:val="0"/>
+              <w:spacing w:line="259" w:lineRule="auto" w:before="0" w:after="0"/>
+            </w:pPr>
+            <w:r/>
+            <w:r>
+              <w:rPr>
+                <w:rFonts w:ascii="Times New Roman" w:hAnsi="Times New Roman" w:eastAsia="Times New Roman"/>
+                <w:b w:val="0"/>
+                <w:i w:val="0"/>
+                <w:color w:val="191919"/>
+                <w:sz w:val="15"/>
+              </w:rPr>
+              <w:t>Espacio de trabajo aislado asociado a una tarea o issue.</w:t>
+            </w:r>
+          </w:p>
+        </w:tc>
+      </w:tr>
+      <w:tr>
+        <w:tc>
+          <w:tcPr>
+            <w:tcW w:type="dxa" w:w="2600"/>
+            <w:shd w:fill="F8FAFC"/>
+            <w:vAlign w:val="center"/>
+            <w:tcMar>
+              <w:top w:w="90" w:type="dxa"/>
+              <w:start w:w="100" w:type="dxa"/>
+              <w:bottom w:w="90" w:type="dxa"/>
+              <w:end w:w="100" w:type="dxa"/>
+            </w:tcMar>
+          </w:tcPr>
+          <w:p>
+            <w:pPr>
+              <w:keepNext w:val="0"/>
+              <w:spacing w:line="259" w:lineRule="auto" w:before="0" w:after="0"/>
+            </w:pPr>
+            <w:r/>
+            <w:r>
+              <w:rPr>
+                <w:rFonts w:ascii="Times New Roman" w:hAnsi="Times New Roman" w:eastAsia="Times New Roman"/>
+                <w:b w:val="0"/>
+                <w:i w:val="0"/>
+                <w:color w:val="191919"/>
+                <w:sz w:val="15"/>
+              </w:rPr>
+              <w:t>Worktree</w:t>
+            </w:r>
+          </w:p>
+        </w:tc>
+        <w:tc>
+          <w:tcPr>
+            <w:tcW w:type="dxa" w:w="6472"/>
+            <w:shd w:fill="F8FAFC"/>
+            <w:vAlign w:val="center"/>
+            <w:tcMar>
+              <w:top w:w="90" w:type="dxa"/>
+              <w:start w:w="100" w:type="dxa"/>
+              <w:bottom w:w="90" w:type="dxa"/>
+              <w:end w:w="100" w:type="dxa"/>
+            </w:tcMar>
+          </w:tcPr>
+          <w:p>
+            <w:pPr>
+              <w:keepNext w:val="0"/>
+              <w:spacing w:line="259" w:lineRule="auto" w:before="0" w:after="0"/>
+            </w:pPr>
+            <w:r/>
+            <w:r>
+              <w:rPr>
+                <w:rFonts w:ascii="Times New Roman" w:hAnsi="Times New Roman" w:eastAsia="Times New Roman"/>
+                <w:b w:val="0"/>
+                <w:i w:val="0"/>
+                <w:color w:val="191919"/>
+                <w:sz w:val="15"/>
+              </w:rPr>
+              <w:t>Copia de trabajo separada de un repositorio Git, usada para aislar cambios por tarea.</w:t>
+            </w:r>
+          </w:p>
+        </w:tc>
+      </w:tr>
+      <w:tr>
+        <w:tc>
+          <w:tcPr>
+            <w:tcW w:type="dxa" w:w="2600"/>
+            <w:vAlign w:val="center"/>
+            <w:tcMar>
+              <w:top w:w="90" w:type="dxa"/>
+              <w:start w:w="100" w:type="dxa"/>
+              <w:bottom w:w="90" w:type="dxa"/>
+              <w:end w:w="100" w:type="dxa"/>
+            </w:tcMar>
+          </w:tcPr>
+          <w:p>
+            <w:pPr>
+              <w:keepNext w:val="0"/>
+              <w:spacing w:line="259" w:lineRule="auto" w:before="0" w:after="0"/>
+            </w:pPr>
+            <w:r/>
+            <w:r>
+              <w:rPr>
+                <w:rFonts w:ascii="Times New Roman" w:hAnsi="Times New Roman" w:eastAsia="Times New Roman"/>
+                <w:b w:val="0"/>
+                <w:i w:val="0"/>
+                <w:color w:val="191919"/>
+                <w:sz w:val="15"/>
+              </w:rPr>
+              <w:t>Workflow</w:t>
+            </w:r>
+          </w:p>
+        </w:tc>
+        <w:tc>
+          <w:tcPr>
+            <w:tcW w:type="dxa" w:w="6472"/>
+            <w:vAlign w:val="center"/>
+            <w:tcMar>
+              <w:top w:w="90" w:type="dxa"/>
+              <w:start w:w="100" w:type="dxa"/>
+              <w:bottom w:w="90" w:type="dxa"/>
+              <w:end w:w="100" w:type="dxa"/>
+            </w:tcMar>
+          </w:tcPr>
+          <w:p>
+            <w:pPr>
+              <w:keepNext w:val="0"/>
+              <w:spacing w:line="259" w:lineRule="auto" w:before="0" w:after="0"/>
+            </w:pPr>
+            <w:r/>
+            <w:r>
+              <w:rPr>
+                <w:rFonts w:ascii="Times New Roman" w:hAnsi="Times New Roman" w:eastAsia="Times New Roman"/>
+                <w:b w:val="0"/>
+                <w:i w:val="0"/>
+                <w:color w:val="191919"/>
+                <w:sz w:val="15"/>
+              </w:rPr>
+              <w:t>Secuencia definida de pasos, reglas y estados para ejecutar una tarea.</w:t>
+            </w:r>
+          </w:p>
+        </w:tc>
+      </w:tr>
+      <w:tr>
+        <w:tc>
+          <w:tcPr>
+            <w:tcW w:type="dxa" w:w="2600"/>
+            <w:shd w:fill="F8FAFC"/>
+            <w:vAlign w:val="center"/>
+            <w:tcMar>
+              <w:top w:w="90" w:type="dxa"/>
+              <w:start w:w="100" w:type="dxa"/>
+              <w:bottom w:w="90" w:type="dxa"/>
+              <w:end w:w="100" w:type="dxa"/>
+            </w:tcMar>
+          </w:tcPr>
+          <w:p>
+            <w:pPr>
+              <w:keepNext w:val="0"/>
+              <w:spacing w:line="259" w:lineRule="auto" w:before="0" w:after="0"/>
+            </w:pPr>
+            <w:r/>
+            <w:r>
+              <w:rPr>
+                <w:rFonts w:ascii="Times New Roman" w:hAnsi="Times New Roman" w:eastAsia="Times New Roman"/>
+                <w:b w:val="0"/>
+                <w:i w:val="0"/>
+                <w:color w:val="191919"/>
+                <w:sz w:val="15"/>
+              </w:rPr>
+              <w:t>Intake</w:t>
+            </w:r>
+          </w:p>
+        </w:tc>
+        <w:tc>
+          <w:tcPr>
+            <w:tcW w:type="dxa" w:w="6472"/>
+            <w:shd w:fill="F8FAFC"/>
+            <w:vAlign w:val="center"/>
+            <w:tcMar>
+              <w:top w:w="90" w:type="dxa"/>
+              <w:start w:w="100" w:type="dxa"/>
+              <w:bottom w:w="90" w:type="dxa"/>
+              <w:end w:w="100" w:type="dxa"/>
+            </w:tcMar>
+          </w:tcPr>
+          <w:p>
+            <w:pPr>
+              <w:keepNext w:val="0"/>
+              <w:spacing w:line="259" w:lineRule="auto" w:before="0" w:after="0"/>
+            </w:pPr>
+            <w:r/>
+            <w:r>
+              <w:rPr>
+                <w:rFonts w:ascii="Times New Roman" w:hAnsi="Times New Roman" w:eastAsia="Times New Roman"/>
+                <w:b w:val="0"/>
+                <w:i w:val="0"/>
+                <w:color w:val="191919"/>
+                <w:sz w:val="15"/>
+              </w:rPr>
+              <w:t>Entrada o recepción inicial de trabajo desde issues, carga manual o eventos de revisión.</w:t>
+            </w:r>
+          </w:p>
+        </w:tc>
+      </w:tr>
+      <w:tr>
+        <w:tc>
+          <w:tcPr>
+            <w:tcW w:type="dxa" w:w="2600"/>
+            <w:vAlign w:val="center"/>
+            <w:tcMar>
+              <w:top w:w="90" w:type="dxa"/>
+              <w:start w:w="100" w:type="dxa"/>
+              <w:bottom w:w="90" w:type="dxa"/>
+              <w:end w:w="100" w:type="dxa"/>
+            </w:tcMar>
+          </w:tcPr>
+          <w:p>
+            <w:pPr>
+              <w:keepNext w:val="0"/>
+              <w:spacing w:line="259" w:lineRule="auto" w:before="0" w:after="0"/>
+            </w:pPr>
+            <w:r/>
+            <w:r>
+              <w:rPr>
+                <w:rFonts w:ascii="Times New Roman" w:hAnsi="Times New Roman" w:eastAsia="Times New Roman"/>
+                <w:b w:val="0"/>
+                <w:i w:val="0"/>
+                <w:color w:val="191919"/>
+                <w:sz w:val="15"/>
+              </w:rPr>
+              <w:t>Gate</w:t>
+            </w:r>
+          </w:p>
+        </w:tc>
+        <w:tc>
+          <w:tcPr>
+            <w:tcW w:type="dxa" w:w="6472"/>
+            <w:vAlign w:val="center"/>
+            <w:tcMar>
+              <w:top w:w="90" w:type="dxa"/>
+              <w:start w:w="100" w:type="dxa"/>
+              <w:bottom w:w="90" w:type="dxa"/>
+              <w:end w:w="100" w:type="dxa"/>
+            </w:tcMar>
+          </w:tcPr>
+          <w:p>
+            <w:pPr>
+              <w:keepNext w:val="0"/>
+              <w:spacing w:line="259" w:lineRule="auto" w:before="0" w:after="0"/>
+            </w:pPr>
+            <w:r/>
+            <w:r>
+              <w:rPr>
+                <w:rFonts w:ascii="Times New Roman" w:hAnsi="Times New Roman" w:eastAsia="Times New Roman"/>
+                <w:b w:val="0"/>
+                <w:i w:val="0"/>
+                <w:color w:val="191919"/>
+                <w:sz w:val="15"/>
+              </w:rPr>
+              <w:t>Punto de control que permite o bloquea el avance de una corrida.</w:t>
+            </w:r>
+          </w:p>
+        </w:tc>
+      </w:tr>
+      <w:tr>
+        <w:tc>
+          <w:tcPr>
+            <w:tcW w:type="dxa" w:w="2600"/>
+            <w:shd w:fill="F8FAFC"/>
+            <w:vAlign w:val="center"/>
+            <w:tcMar>
+              <w:top w:w="90" w:type="dxa"/>
+              <w:start w:w="100" w:type="dxa"/>
+              <w:bottom w:w="90" w:type="dxa"/>
+              <w:end w:w="100" w:type="dxa"/>
+            </w:tcMar>
+          </w:tcPr>
+          <w:p>
+            <w:pPr>
+              <w:keepNext w:val="0"/>
+              <w:spacing w:line="259" w:lineRule="auto" w:before="0" w:after="0"/>
+            </w:pPr>
+            <w:r/>
+            <w:r>
+              <w:rPr>
+                <w:rFonts w:ascii="Times New Roman" w:hAnsi="Times New Roman" w:eastAsia="Times New Roman"/>
+                <w:b w:val="0"/>
+                <w:i w:val="0"/>
+                <w:color w:val="191919"/>
+                <w:sz w:val="15"/>
+              </w:rPr>
+              <w:t>Dashboard</w:t>
+            </w:r>
+          </w:p>
+        </w:tc>
+        <w:tc>
+          <w:tcPr>
+            <w:tcW w:type="dxa" w:w="6472"/>
+            <w:shd w:fill="F8FAFC"/>
+            <w:vAlign w:val="center"/>
+            <w:tcMar>
+              <w:top w:w="90" w:type="dxa"/>
+              <w:start w:w="100" w:type="dxa"/>
+              <w:bottom w:w="90" w:type="dxa"/>
+              <w:end w:w="100" w:type="dxa"/>
+            </w:tcMar>
+          </w:tcPr>
+          <w:p>
+            <w:pPr>
+              <w:keepNext w:val="0"/>
+              <w:spacing w:line="259" w:lineRule="auto" w:before="0" w:after="0"/>
+            </w:pPr>
+            <w:r/>
+            <w:r>
+              <w:rPr>
+                <w:rFonts w:ascii="Times New Roman" w:hAnsi="Times New Roman" w:eastAsia="Times New Roman"/>
+                <w:b w:val="0"/>
+                <w:i w:val="0"/>
+                <w:color w:val="191919"/>
+                <w:sz w:val="15"/>
+              </w:rPr>
+              <w:t>Vista de consulta para estado, métricas, reportes o evidencia operacional.</w:t>
+            </w:r>
+          </w:p>
+        </w:tc>
+      </w:tr>
+      <w:tr>
+        <w:tc>
+          <w:tcPr>
+            <w:tcW w:type="dxa" w:w="2600"/>
+            <w:vAlign w:val="center"/>
+            <w:tcMar>
+              <w:top w:w="90" w:type="dxa"/>
+              <w:start w:w="100" w:type="dxa"/>
+              <w:bottom w:w="90" w:type="dxa"/>
+              <w:end w:w="100" w:type="dxa"/>
+            </w:tcMar>
+          </w:tcPr>
+          <w:p>
+            <w:pPr>
+              <w:keepNext w:val="0"/>
+              <w:spacing w:line="259" w:lineRule="auto" w:before="0" w:after="0"/>
+            </w:pPr>
+            <w:r/>
+            <w:r>
+              <w:rPr>
+                <w:rFonts w:ascii="Times New Roman" w:hAnsi="Times New Roman" w:eastAsia="Times New Roman"/>
+                <w:b w:val="0"/>
+                <w:i w:val="0"/>
+                <w:color w:val="191919"/>
+                <w:sz w:val="15"/>
+              </w:rPr>
+              <w:t>Log</w:t>
+            </w:r>
+          </w:p>
+        </w:tc>
+        <w:tc>
+          <w:tcPr>
+            <w:tcW w:type="dxa" w:w="6472"/>
+            <w:vAlign w:val="center"/>
+            <w:tcMar>
+              <w:top w:w="90" w:type="dxa"/>
+              <w:start w:w="100" w:type="dxa"/>
+              <w:bottom w:w="90" w:type="dxa"/>
+              <w:end w:w="100" w:type="dxa"/>
+            </w:tcMar>
+          </w:tcPr>
+          <w:p>
+            <w:pPr>
+              <w:keepNext w:val="0"/>
+              <w:spacing w:line="259" w:lineRule="auto" w:before="0" w:after="0"/>
+            </w:pPr>
+            <w:r/>
+            <w:r>
+              <w:rPr>
+                <w:rFonts w:ascii="Times New Roman" w:hAnsi="Times New Roman" w:eastAsia="Times New Roman"/>
+                <w:b w:val="0"/>
+                <w:i w:val="0"/>
+                <w:color w:val="191919"/>
+                <w:sz w:val="15"/>
+              </w:rPr>
+              <w:t>Registro cronológico de eventos relevantes de una corrida o componente.</w:t>
+            </w:r>
+          </w:p>
+        </w:tc>
+      </w:tr>
+      <w:tr>
+        <w:tc>
+          <w:tcPr>
+            <w:tcW w:type="dxa" w:w="2600"/>
+            <w:shd w:fill="F8FAFC"/>
+            <w:vAlign w:val="center"/>
+            <w:tcMar>
+              <w:top w:w="90" w:type="dxa"/>
+              <w:start w:w="100" w:type="dxa"/>
+              <w:bottom w:w="90" w:type="dxa"/>
+              <w:end w:w="100" w:type="dxa"/>
+            </w:tcMar>
+          </w:tcPr>
+          <w:p>
+            <w:pPr>
+              <w:keepNext w:val="0"/>
+              <w:spacing w:line="259" w:lineRule="auto" w:before="0" w:after="0"/>
+            </w:pPr>
+            <w:r/>
+            <w:r>
+              <w:rPr>
+                <w:rFonts w:ascii="Times New Roman" w:hAnsi="Times New Roman" w:eastAsia="Times New Roman"/>
+                <w:b w:val="0"/>
+                <w:i w:val="0"/>
+                <w:color w:val="191919"/>
+                <w:sz w:val="15"/>
+              </w:rPr>
+              <w:t>Stub</w:t>
+            </w:r>
+          </w:p>
+        </w:tc>
+        <w:tc>
+          <w:tcPr>
+            <w:tcW w:type="dxa" w:w="6472"/>
+            <w:shd w:fill="F8FAFC"/>
+            <w:vAlign w:val="center"/>
+            <w:tcMar>
+              <w:top w:w="90" w:type="dxa"/>
+              <w:start w:w="100" w:type="dxa"/>
+              <w:bottom w:w="90" w:type="dxa"/>
+              <w:end w:w="100" w:type="dxa"/>
+            </w:tcMar>
+          </w:tcPr>
+          <w:p>
+            <w:pPr>
+              <w:keepNext w:val="0"/>
+              <w:spacing w:line="259" w:lineRule="auto" w:before="0" w:after="0"/>
+            </w:pPr>
+            <w:r/>
+            <w:r>
+              <w:rPr>
+                <w:rFonts w:ascii="Times New Roman" w:hAnsi="Times New Roman" w:eastAsia="Times New Roman"/>
+                <w:b w:val="0"/>
+                <w:i w:val="0"/>
+                <w:color w:val="191919"/>
+                <w:sz w:val="15"/>
+              </w:rPr>
+              <w:t>Implementación simplificada usada para probar integración o comportamiento sin depender del componente real.</w:t>
+            </w:r>
+          </w:p>
+        </w:tc>
+      </w:tr>
+      <w:tr>
+        <w:tc>
+          <w:tcPr>
+            <w:tcW w:type="dxa" w:w="2600"/>
+            <w:vAlign w:val="center"/>
+            <w:tcMar>
+              <w:top w:w="90" w:type="dxa"/>
+              <w:start w:w="100" w:type="dxa"/>
+              <w:bottom w:w="90" w:type="dxa"/>
+              <w:end w:w="100" w:type="dxa"/>
+            </w:tcMar>
+          </w:tcPr>
+          <w:p>
+            <w:pPr>
+              <w:keepNext w:val="0"/>
+              <w:spacing w:line="259" w:lineRule="auto" w:before="0" w:after="0"/>
+            </w:pPr>
+            <w:r/>
+            <w:r>
+              <w:rPr>
+                <w:rFonts w:ascii="Times New Roman" w:hAnsi="Times New Roman" w:eastAsia="Times New Roman"/>
+                <w:b w:val="0"/>
+                <w:i w:val="0"/>
+                <w:color w:val="191919"/>
+                <w:sz w:val="15"/>
+              </w:rPr>
+              <w:t>Bridge</w:t>
+            </w:r>
+          </w:p>
+        </w:tc>
+        <w:tc>
+          <w:tcPr>
+            <w:tcW w:type="dxa" w:w="6472"/>
+            <w:vAlign w:val="center"/>
+            <w:tcMar>
+              <w:top w:w="90" w:type="dxa"/>
+              <w:start w:w="100" w:type="dxa"/>
+              <w:bottom w:w="90" w:type="dxa"/>
+              <w:end w:w="100" w:type="dxa"/>
+            </w:tcMar>
+          </w:tcPr>
+          <w:p>
+            <w:pPr>
+              <w:keepNext w:val="0"/>
+              <w:spacing w:line="259" w:lineRule="auto" w:before="0" w:after="0"/>
+            </w:pPr>
+            <w:r/>
+            <w:r>
+              <w:rPr>
+                <w:rFonts w:ascii="Times New Roman" w:hAnsi="Times New Roman" w:eastAsia="Times New Roman"/>
+                <w:b w:val="0"/>
+                <w:i w:val="0"/>
+                <w:color w:val="191919"/>
+                <w:sz w:val="15"/>
+              </w:rPr>
+              <w:t>Adaptador que desacopla el runtime del agente o proveedor concreto.</w:t>
+            </w:r>
+          </w:p>
+        </w:tc>
+      </w:tr>
+      <w:tr>
+        <w:tc>
+          <w:tcPr>
+            <w:tcW w:type="dxa" w:w="2600"/>
+            <w:shd w:fill="F8FAFC"/>
+            <w:vAlign w:val="center"/>
+            <w:tcMar>
+              <w:top w:w="90" w:type="dxa"/>
+              <w:start w:w="100" w:type="dxa"/>
+              <w:bottom w:w="90" w:type="dxa"/>
+              <w:end w:w="100" w:type="dxa"/>
+            </w:tcMar>
+          </w:tcPr>
+          <w:p>
+            <w:pPr>
+              <w:keepNext w:val="0"/>
+              <w:spacing w:line="259" w:lineRule="auto" w:before="0" w:after="0"/>
+            </w:pPr>
+            <w:r/>
+            <w:r>
+              <w:rPr>
+                <w:rFonts w:ascii="Times New Roman" w:hAnsi="Times New Roman" w:eastAsia="Times New Roman"/>
+                <w:b w:val="0"/>
+                <w:i w:val="0"/>
+                <w:color w:val="191919"/>
+                <w:sz w:val="15"/>
+              </w:rPr>
+              <w:t>Orchestrator</w:t>
+            </w:r>
+          </w:p>
+        </w:tc>
+        <w:tc>
+          <w:tcPr>
+            <w:tcW w:type="dxa" w:w="6472"/>
+            <w:shd w:fill="F8FAFC"/>
+            <w:vAlign w:val="center"/>
+            <w:tcMar>
+              <w:top w:w="90" w:type="dxa"/>
+              <w:start w:w="100" w:type="dxa"/>
+              <w:bottom w:w="90" w:type="dxa"/>
+              <w:end w:w="100" w:type="dxa"/>
+            </w:tcMar>
+          </w:tcPr>
+          <w:p>
+            <w:pPr>
+              <w:keepNext w:val="0"/>
+              <w:spacing w:line="259" w:lineRule="auto" w:before="0" w:after="0"/>
+            </w:pPr>
+            <w:r/>
+            <w:r>
+              <w:rPr>
+                <w:rFonts w:ascii="Times New Roman" w:hAnsi="Times New Roman" w:eastAsia="Times New Roman"/>
+                <w:b w:val="0"/>
+                <w:i w:val="0"/>
+                <w:color w:val="191919"/>
+                <w:sz w:val="15"/>
+              </w:rPr>
+              <w:t>Componente que coordina elegibilidad, planificación, ejecución, concurrencia y estado de las corridas.</w:t>
+            </w:r>
+          </w:p>
+        </w:tc>
+      </w:tr>
+      <w:tr>
+        <w:tc>
+          <w:tcPr>
+            <w:tcW w:type="dxa" w:w="2600"/>
+            <w:vAlign w:val="center"/>
+            <w:tcMar>
+              <w:top w:w="90" w:type="dxa"/>
+              <w:start w:w="100" w:type="dxa"/>
+              <w:bottom w:w="90" w:type="dxa"/>
+              <w:end w:w="100" w:type="dxa"/>
+            </w:tcMar>
+          </w:tcPr>
+          <w:p>
+            <w:pPr>
+              <w:keepNext w:val="0"/>
+              <w:spacing w:line="259" w:lineRule="auto" w:before="0" w:after="0"/>
+            </w:pPr>
+            <w:r/>
+            <w:r>
+              <w:rPr>
+                <w:rFonts w:ascii="Times New Roman" w:hAnsi="Times New Roman" w:eastAsia="Times New Roman"/>
+                <w:b w:val="0"/>
+                <w:i w:val="0"/>
+                <w:color w:val="191919"/>
+                <w:sz w:val="15"/>
+              </w:rPr>
+              <w:t>Scheduler</w:t>
+            </w:r>
+          </w:p>
+        </w:tc>
+        <w:tc>
+          <w:tcPr>
+            <w:tcW w:type="dxa" w:w="6472"/>
+            <w:vAlign w:val="center"/>
+            <w:tcMar>
+              <w:top w:w="90" w:type="dxa"/>
+              <w:start w:w="100" w:type="dxa"/>
+              <w:bottom w:w="90" w:type="dxa"/>
+              <w:end w:w="100" w:type="dxa"/>
+            </w:tcMar>
+          </w:tcPr>
+          <w:p>
+            <w:pPr>
+              <w:keepNext w:val="0"/>
+              <w:spacing w:line="259" w:lineRule="auto" w:before="0" w:after="0"/>
+            </w:pPr>
+            <w:r/>
+            <w:r>
+              <w:rPr>
+                <w:rFonts w:ascii="Times New Roman" w:hAnsi="Times New Roman" w:eastAsia="Times New Roman"/>
+                <w:b w:val="0"/>
+                <w:i w:val="0"/>
+                <w:color w:val="191919"/>
+                <w:sz w:val="15"/>
+              </w:rPr>
+              <w:t>Componente o función responsable de planificar cuándo y cómo se ejecutan tareas.</w:t>
             </w:r>
           </w:p>
         </w:tc>

</xml_diff>

<commit_message>
docs: glossary final thesis terms
</commit_message>
<xml_diff>
--- a/tesis/entrega/plan-tesis-proyecto-final-integrador.docx
+++ b/tesis/entrega/plan-tesis-proyecto-final-integrador.docx
@@ -23487,6 +23487,494 @@
                 <w:sz w:val="15"/>
               </w:rPr>
               <w:t>Componente o función responsable de planificar cuándo y cómo se ejecutan tareas.</w:t>
+            </w:r>
+          </w:p>
+        </w:tc>
+      </w:tr>
+      <w:tr>
+        <w:tc>
+          <w:tcPr>
+            <w:tcW w:type="dxa" w:w="2600"/>
+            <w:shd w:fill="F8FAFC"/>
+            <w:vAlign w:val="center"/>
+            <w:tcMar>
+              <w:top w:w="90" w:type="dxa"/>
+              <w:start w:w="100" w:type="dxa"/>
+              <w:bottom w:w="90" w:type="dxa"/>
+              <w:end w:w="100" w:type="dxa"/>
+            </w:tcMar>
+          </w:tcPr>
+          <w:p>
+            <w:pPr>
+              <w:keepNext w:val="0"/>
+              <w:spacing w:line="259" w:lineRule="auto" w:before="0" w:after="0"/>
+            </w:pPr>
+            <w:r/>
+            <w:r>
+              <w:rPr>
+                <w:rFonts w:ascii="Times New Roman" w:hAnsi="Times New Roman" w:eastAsia="Times New Roman"/>
+                <w:b w:val="0"/>
+                <w:i w:val="0"/>
+                <w:color w:val="191919"/>
+                <w:sz w:val="15"/>
+              </w:rPr>
+              <w:t>Agentic</w:t>
+            </w:r>
+          </w:p>
+        </w:tc>
+        <w:tc>
+          <w:tcPr>
+            <w:tcW w:type="dxa" w:w="6472"/>
+            <w:shd w:fill="F8FAFC"/>
+            <w:vAlign w:val="center"/>
+            <w:tcMar>
+              <w:top w:w="90" w:type="dxa"/>
+              <w:start w:w="100" w:type="dxa"/>
+              <w:bottom w:w="90" w:type="dxa"/>
+              <w:end w:w="100" w:type="dxa"/>
+            </w:tcMar>
+          </w:tcPr>
+          <w:p>
+            <w:pPr>
+              <w:keepNext w:val="0"/>
+              <w:spacing w:line="259" w:lineRule="auto" w:before="0" w:after="0"/>
+            </w:pPr>
+            <w:r/>
+            <w:r>
+              <w:rPr>
+                <w:rFonts w:ascii="Times New Roman" w:hAnsi="Times New Roman" w:eastAsia="Times New Roman"/>
+                <w:b w:val="0"/>
+                <w:i w:val="0"/>
+                <w:color w:val="191919"/>
+                <w:sz w:val="15"/>
+              </w:rPr>
+              <w:t>Característica de una corrida en la que un agente de software toma decisiones operativas acotadas dentro de reglas y objetivos definidos.</w:t>
+            </w:r>
+          </w:p>
+        </w:tc>
+      </w:tr>
+      <w:tr>
+        <w:tc>
+          <w:tcPr>
+            <w:tcW w:type="dxa" w:w="2600"/>
+            <w:vAlign w:val="center"/>
+            <w:tcMar>
+              <w:top w:w="90" w:type="dxa"/>
+              <w:start w:w="100" w:type="dxa"/>
+              <w:bottom w:w="90" w:type="dxa"/>
+              <w:end w:w="100" w:type="dxa"/>
+            </w:tcMar>
+          </w:tcPr>
+          <w:p>
+            <w:pPr>
+              <w:keepNext w:val="0"/>
+              <w:spacing w:line="259" w:lineRule="auto" w:before="0" w:after="0"/>
+            </w:pPr>
+            <w:r/>
+            <w:r>
+              <w:rPr>
+                <w:rFonts w:ascii="Times New Roman" w:hAnsi="Times New Roman" w:eastAsia="Times New Roman"/>
+                <w:b w:val="0"/>
+                <w:i w:val="0"/>
+                <w:color w:val="191919"/>
+                <w:sz w:val="15"/>
+              </w:rPr>
+              <w:t>Control plane</w:t>
+            </w:r>
+          </w:p>
+        </w:tc>
+        <w:tc>
+          <w:tcPr>
+            <w:tcW w:type="dxa" w:w="6472"/>
+            <w:vAlign w:val="center"/>
+            <w:tcMar>
+              <w:top w:w="90" w:type="dxa"/>
+              <w:start w:w="100" w:type="dxa"/>
+              <w:bottom w:w="90" w:type="dxa"/>
+              <w:end w:w="100" w:type="dxa"/>
+            </w:tcMar>
+          </w:tcPr>
+          <w:p>
+            <w:pPr>
+              <w:keepNext w:val="0"/>
+              <w:spacing w:line="259" w:lineRule="auto" w:before="0" w:after="0"/>
+            </w:pPr>
+            <w:r/>
+            <w:r>
+              <w:rPr>
+                <w:rFonts w:ascii="Times New Roman" w:hAnsi="Times New Roman" w:eastAsia="Times New Roman"/>
+                <w:b w:val="0"/>
+                <w:i w:val="0"/>
+                <w:color w:val="191919"/>
+                <w:sz w:val="15"/>
+              </w:rPr>
+              <w:t>Superficie de control que permite observar, coordinar o gobernar la operación del sistema.</w:t>
+            </w:r>
+          </w:p>
+        </w:tc>
+      </w:tr>
+      <w:tr>
+        <w:tc>
+          <w:tcPr>
+            <w:tcW w:type="dxa" w:w="2600"/>
+            <w:shd w:fill="F8FAFC"/>
+            <w:vAlign w:val="center"/>
+            <w:tcMar>
+              <w:top w:w="90" w:type="dxa"/>
+              <w:start w:w="100" w:type="dxa"/>
+              <w:bottom w:w="90" w:type="dxa"/>
+              <w:end w:w="100" w:type="dxa"/>
+            </w:tcMar>
+          </w:tcPr>
+          <w:p>
+            <w:pPr>
+              <w:keepNext w:val="0"/>
+              <w:spacing w:line="259" w:lineRule="auto" w:before="0" w:after="0"/>
+            </w:pPr>
+            <w:r/>
+            <w:r>
+              <w:rPr>
+                <w:rFonts w:ascii="Times New Roman" w:hAnsi="Times New Roman" w:eastAsia="Times New Roman"/>
+                <w:b w:val="0"/>
+                <w:i w:val="0"/>
+                <w:color w:val="191919"/>
+                <w:sz w:val="15"/>
+              </w:rPr>
+              <w:t>Backoff</w:t>
+            </w:r>
+          </w:p>
+        </w:tc>
+        <w:tc>
+          <w:tcPr>
+            <w:tcW w:type="dxa" w:w="6472"/>
+            <w:shd w:fill="F8FAFC"/>
+            <w:vAlign w:val="center"/>
+            <w:tcMar>
+              <w:top w:w="90" w:type="dxa"/>
+              <w:start w:w="100" w:type="dxa"/>
+              <w:bottom w:w="90" w:type="dxa"/>
+              <w:end w:w="100" w:type="dxa"/>
+            </w:tcMar>
+          </w:tcPr>
+          <w:p>
+            <w:pPr>
+              <w:keepNext w:val="0"/>
+              <w:spacing w:line="259" w:lineRule="auto" w:before="0" w:after="0"/>
+            </w:pPr>
+            <w:r/>
+            <w:r>
+              <w:rPr>
+                <w:rFonts w:ascii="Times New Roman" w:hAnsi="Times New Roman" w:eastAsia="Times New Roman"/>
+                <w:b w:val="0"/>
+                <w:i w:val="0"/>
+                <w:color w:val="191919"/>
+                <w:sz w:val="15"/>
+              </w:rPr>
+              <w:t>Estrategia de espera progresiva entre reintentos para evitar repetición inmediata de fallas transitorias.</w:t>
+            </w:r>
+          </w:p>
+        </w:tc>
+      </w:tr>
+      <w:tr>
+        <w:tc>
+          <w:tcPr>
+            <w:tcW w:type="dxa" w:w="2600"/>
+            <w:vAlign w:val="center"/>
+            <w:tcMar>
+              <w:top w:w="90" w:type="dxa"/>
+              <w:start w:w="100" w:type="dxa"/>
+              <w:bottom w:w="90" w:type="dxa"/>
+              <w:end w:w="100" w:type="dxa"/>
+            </w:tcMar>
+          </w:tcPr>
+          <w:p>
+            <w:pPr>
+              <w:keepNext w:val="0"/>
+              <w:spacing w:line="259" w:lineRule="auto" w:before="0" w:after="0"/>
+            </w:pPr>
+            <w:r/>
+            <w:r>
+              <w:rPr>
+                <w:rFonts w:ascii="Times New Roman" w:hAnsi="Times New Roman" w:eastAsia="Times New Roman"/>
+                <w:b w:val="0"/>
+                <w:i w:val="0"/>
+                <w:color w:val="191919"/>
+                <w:sz w:val="15"/>
+              </w:rPr>
+              <w:t>Preflight</w:t>
+            </w:r>
+          </w:p>
+        </w:tc>
+        <w:tc>
+          <w:tcPr>
+            <w:tcW w:type="dxa" w:w="6472"/>
+            <w:vAlign w:val="center"/>
+            <w:tcMar>
+              <w:top w:w="90" w:type="dxa"/>
+              <w:start w:w="100" w:type="dxa"/>
+              <w:bottom w:w="90" w:type="dxa"/>
+              <w:end w:w="100" w:type="dxa"/>
+            </w:tcMar>
+          </w:tcPr>
+          <w:p>
+            <w:pPr>
+              <w:keepNext w:val="0"/>
+              <w:spacing w:line="259" w:lineRule="auto" w:before="0" w:after="0"/>
+            </w:pPr>
+            <w:r/>
+            <w:r>
+              <w:rPr>
+                <w:rFonts w:ascii="Times New Roman" w:hAnsi="Times New Roman" w:eastAsia="Times New Roman"/>
+                <w:b w:val="0"/>
+                <w:i w:val="0"/>
+                <w:color w:val="191919"/>
+                <w:sz w:val="15"/>
+              </w:rPr>
+              <w:t>Validación previa que confirma condiciones mínimas antes de iniciar una corrida o avanzar a una etapa posterior.</w:t>
+            </w:r>
+          </w:p>
+        </w:tc>
+      </w:tr>
+      <w:tr>
+        <w:tc>
+          <w:tcPr>
+            <w:tcW w:type="dxa" w:w="2600"/>
+            <w:shd w:fill="F8FAFC"/>
+            <w:vAlign w:val="center"/>
+            <w:tcMar>
+              <w:top w:w="90" w:type="dxa"/>
+              <w:start w:w="100" w:type="dxa"/>
+              <w:bottom w:w="90" w:type="dxa"/>
+              <w:end w:w="100" w:type="dxa"/>
+            </w:tcMar>
+          </w:tcPr>
+          <w:p>
+            <w:pPr>
+              <w:keepNext w:val="0"/>
+              <w:spacing w:line="259" w:lineRule="auto" w:before="0" w:after="0"/>
+            </w:pPr>
+            <w:r/>
+            <w:r>
+              <w:rPr>
+                <w:rFonts w:ascii="Times New Roman" w:hAnsi="Times New Roman" w:eastAsia="Times New Roman"/>
+                <w:b w:val="0"/>
+                <w:i w:val="0"/>
+                <w:color w:val="191919"/>
+                <w:sz w:val="15"/>
+              </w:rPr>
+              <w:t>Smoke test</w:t>
+            </w:r>
+          </w:p>
+        </w:tc>
+        <w:tc>
+          <w:tcPr>
+            <w:tcW w:type="dxa" w:w="6472"/>
+            <w:shd w:fill="F8FAFC"/>
+            <w:vAlign w:val="center"/>
+            <w:tcMar>
+              <w:top w:w="90" w:type="dxa"/>
+              <w:start w:w="100" w:type="dxa"/>
+              <w:bottom w:w="90" w:type="dxa"/>
+              <w:end w:w="100" w:type="dxa"/>
+            </w:tcMar>
+          </w:tcPr>
+          <w:p>
+            <w:pPr>
+              <w:keepNext w:val="0"/>
+              <w:spacing w:line="259" w:lineRule="auto" w:before="0" w:after="0"/>
+            </w:pPr>
+            <w:r/>
+            <w:r>
+              <w:rPr>
+                <w:rFonts w:ascii="Times New Roman" w:hAnsi="Times New Roman" w:eastAsia="Times New Roman"/>
+                <w:b w:val="0"/>
+                <w:i w:val="0"/>
+                <w:color w:val="191919"/>
+                <w:sz w:val="15"/>
+              </w:rPr>
+              <w:t>Prueba rápida de funcionamiento básico que busca detectar fallas evidentes antes de una validación más extensa.</w:t>
+            </w:r>
+          </w:p>
+        </w:tc>
+      </w:tr>
+      <w:tr>
+        <w:tc>
+          <w:tcPr>
+            <w:tcW w:type="dxa" w:w="2600"/>
+            <w:vAlign w:val="center"/>
+            <w:tcMar>
+              <w:top w:w="90" w:type="dxa"/>
+              <w:start w:w="100" w:type="dxa"/>
+              <w:bottom w:w="90" w:type="dxa"/>
+              <w:end w:w="100" w:type="dxa"/>
+            </w:tcMar>
+          </w:tcPr>
+          <w:p>
+            <w:pPr>
+              <w:keepNext w:val="0"/>
+              <w:spacing w:line="259" w:lineRule="auto" w:before="0" w:after="0"/>
+            </w:pPr>
+            <w:r/>
+            <w:r>
+              <w:rPr>
+                <w:rFonts w:ascii="Times New Roman" w:hAnsi="Times New Roman" w:eastAsia="Times New Roman"/>
+                <w:b w:val="0"/>
+                <w:i w:val="0"/>
+                <w:color w:val="191919"/>
+                <w:sz w:val="15"/>
+              </w:rPr>
+              <w:t>Post-merge</w:t>
+            </w:r>
+          </w:p>
+        </w:tc>
+        <w:tc>
+          <w:tcPr>
+            <w:tcW w:type="dxa" w:w="6472"/>
+            <w:vAlign w:val="center"/>
+            <w:tcMar>
+              <w:top w:w="90" w:type="dxa"/>
+              <w:start w:w="100" w:type="dxa"/>
+              <w:bottom w:w="90" w:type="dxa"/>
+              <w:end w:w="100" w:type="dxa"/>
+            </w:tcMar>
+          </w:tcPr>
+          <w:p>
+            <w:pPr>
+              <w:keepNext w:val="0"/>
+              <w:spacing w:line="259" w:lineRule="auto" w:before="0" w:after="0"/>
+            </w:pPr>
+            <w:r/>
+            <w:r>
+              <w:rPr>
+                <w:rFonts w:ascii="Times New Roman" w:hAnsi="Times New Roman" w:eastAsia="Times New Roman"/>
+                <w:b w:val="0"/>
+                <w:i w:val="0"/>
+                <w:color w:val="191919"/>
+                <w:sz w:val="15"/>
+              </w:rPr>
+              <w:t>Etapa posterior a la integración de cambios en la rama principal o rama objetivo.</w:t>
+            </w:r>
+          </w:p>
+        </w:tc>
+      </w:tr>
+      <w:tr>
+        <w:tc>
+          <w:tcPr>
+            <w:tcW w:type="dxa" w:w="2600"/>
+            <w:shd w:fill="F8FAFC"/>
+            <w:vAlign w:val="center"/>
+            <w:tcMar>
+              <w:top w:w="90" w:type="dxa"/>
+              <w:start w:w="100" w:type="dxa"/>
+              <w:bottom w:w="90" w:type="dxa"/>
+              <w:end w:w="100" w:type="dxa"/>
+            </w:tcMar>
+          </w:tcPr>
+          <w:p>
+            <w:pPr>
+              <w:keepNext w:val="0"/>
+              <w:spacing w:line="259" w:lineRule="auto" w:before="0" w:after="0"/>
+            </w:pPr>
+            <w:r/>
+            <w:r>
+              <w:rPr>
+                <w:rFonts w:ascii="Times New Roman" w:hAnsi="Times New Roman" w:eastAsia="Times New Roman"/>
+                <w:b w:val="0"/>
+                <w:i w:val="0"/>
+                <w:color w:val="191919"/>
+                <w:sz w:val="15"/>
+              </w:rPr>
+              <w:t>Dispatch</w:t>
+            </w:r>
+          </w:p>
+        </w:tc>
+        <w:tc>
+          <w:tcPr>
+            <w:tcW w:type="dxa" w:w="6472"/>
+            <w:shd w:fill="F8FAFC"/>
+            <w:vAlign w:val="center"/>
+            <w:tcMar>
+              <w:top w:w="90" w:type="dxa"/>
+              <w:start w:w="100" w:type="dxa"/>
+              <w:bottom w:w="90" w:type="dxa"/>
+              <w:end w:w="100" w:type="dxa"/>
+            </w:tcMar>
+          </w:tcPr>
+          <w:p>
+            <w:pPr>
+              <w:keepNext w:val="0"/>
+              <w:spacing w:line="259" w:lineRule="auto" w:before="0" w:after="0"/>
+            </w:pPr>
+            <w:r/>
+            <w:r>
+              <w:rPr>
+                <w:rFonts w:ascii="Times New Roman" w:hAnsi="Times New Roman" w:eastAsia="Times New Roman"/>
+                <w:b w:val="0"/>
+                <w:i w:val="0"/>
+                <w:color w:val="191919"/>
+                <w:sz w:val="15"/>
+              </w:rPr>
+              <w:t>Acción de despachar o iniciar una corrida, tarea o unidad de trabajo dentro del runtime.</w:t>
+            </w:r>
+          </w:p>
+        </w:tc>
+      </w:tr>
+      <w:tr>
+        <w:tc>
+          <w:tcPr>
+            <w:tcW w:type="dxa" w:w="2600"/>
+            <w:vAlign w:val="center"/>
+            <w:tcMar>
+              <w:top w:w="90" w:type="dxa"/>
+              <w:start w:w="100" w:type="dxa"/>
+              <w:bottom w:w="90" w:type="dxa"/>
+              <w:end w:w="100" w:type="dxa"/>
+            </w:tcMar>
+          </w:tcPr>
+          <w:p>
+            <w:pPr>
+              <w:keepNext w:val="0"/>
+              <w:spacing w:line="259" w:lineRule="auto" w:before="0" w:after="0"/>
+            </w:pPr>
+            <w:r/>
+            <w:r>
+              <w:rPr>
+                <w:rFonts w:ascii="Times New Roman" w:hAnsi="Times New Roman" w:eastAsia="Times New Roman"/>
+                <w:b w:val="0"/>
+                <w:i w:val="0"/>
+                <w:color w:val="191919"/>
+                <w:sz w:val="15"/>
+              </w:rPr>
+              <w:t>Polling</w:t>
+            </w:r>
+          </w:p>
+        </w:tc>
+        <w:tc>
+          <w:tcPr>
+            <w:tcW w:type="dxa" w:w="6472"/>
+            <w:vAlign w:val="center"/>
+            <w:tcMar>
+              <w:top w:w="90" w:type="dxa"/>
+              <w:start w:w="100" w:type="dxa"/>
+              <w:bottom w:w="90" w:type="dxa"/>
+              <w:end w:w="100" w:type="dxa"/>
+            </w:tcMar>
+          </w:tcPr>
+          <w:p>
+            <w:pPr>
+              <w:keepNext w:val="0"/>
+              <w:spacing w:line="259" w:lineRule="auto" w:before="0" w:after="0"/>
+            </w:pPr>
+            <w:r/>
+            <w:r>
+              <w:rPr>
+                <w:rFonts w:ascii="Times New Roman" w:hAnsi="Times New Roman" w:eastAsia="Times New Roman"/>
+                <w:b w:val="0"/>
+                <w:i w:val="0"/>
+                <w:color w:val="191919"/>
+                <w:sz w:val="15"/>
+              </w:rPr>
+              <w:t>Consulta periódica de una fuente externa para detectar cambios, nuevas tareas o cambios de elegibilidad.</w:t>
             </w:r>
           </w:p>
         </w:tc>

</xml_diff>